<commit_message>
benchmark: complete n2025 rerun, inStrain 225, and 32-sample WMS rebuild
</commit_message>
<xml_diff>
--- a/manuscript/Strain2bScan_manuscript_figures_tables_2026-10-18-restructured.docx
+++ b/manuscript/Strain2bScan_manuscript_figures_tables_2026-10-18-restructured.docx
@@ -1002,13 +1002,19 @@
         <w:t xml:space="preserve"> </w:t>
       </w:r>
       <w:r>
-        <w:t xml:space="preserve">median precision, recall and F1 were 1.000, with mean precision 0.954, mean recall 0.852 and mean F1 0.887.</w:t>
-      </w:r>
-      <w:r>
-        <w:t xml:space="preserve"> </w:t>
-      </w:r>
-      <w:r>
-        <w:t xml:space="preserve">Mean F1 rose from 0.744 at 0.5× to 0.963 at 10×, while precision remained high across depths (Fig 7;</w:t>
+        <w:t xml:space="preserve">median precision, recall and F1 were 1.000, with mean precision 0.890, mean recall 0.846 and mean F1 0.862.</w:t>
+      </w:r>
+      <w:r>
+        <w:t xml:space="preserve"> </w:t>
+      </w:r>
+      <w:r>
+        <w:t xml:space="preserve">Mean F1 rose from 0.786 at 0.5× to 0.888 at 10×, while median precision remained 1.000 across depths</w:t>
+      </w:r>
+      <w:r>
+        <w:t xml:space="preserve"> </w:t>
+      </w:r>
+      <w:r>
+        <w:t xml:space="preserve">(Fig 7;</w:t>
       </w:r>
       <w:r>
         <w:t xml:space="preserve"> </w:t>
@@ -1017,10 +1023,16 @@
         <w:rPr>
           <w:rStyle w:val="VerbatimChar"/>
         </w:rPr>
-        <w:t xml:space="preserve">results/sim2025_summary/</w:t>
-      </w:r>
-      <w:r>
-        <w:t xml:space="preserve">). These archived full-pool runs define the accuracy envelope of the marker framework. The multi-tool comparison below uses the current-source matched subset to avoid mixing archived and current software versions.</w:t>
+        <w:t xml:space="preserve">results/sim2025_current_summary/</w:t>
+      </w:r>
+      <w:r>
+        <w:t xml:space="preserve">). This current-source full-pool rerun supersedes the archived</w:t>
+      </w:r>
+      <w:r>
+        <w:t xml:space="preserve"> </w:t>
+      </w:r>
+      <w:r>
+        <w:t xml:space="preserve">2,025-sample table, which differed for 512 of 2,025 metric triplets.</w:t>
       </w:r>
     </w:p>
     <w:bookmarkEnd w:id="16"/>
@@ -1119,6 +1131,42 @@
       </w:r>
       <w:r>
         <w:t xml:space="preserve">non-monotonic (Table 2). Multi-species F1 was lower for Strain2bScan at all three depths (Table 3). StrainGST was also run for every primary StrainScan-covered simulation benchmark and all four ATCC WMS mocks; Fig 8 and Tables 1–3 show its 0.90-space metrics alongside the 0.95-space comparisons without pooling. The supplementary StrainScan-curated-database subset in Supplementary Fig S5 was not rerun with StrainGE.</w:t>
+      </w:r>
+      <w:r>
+        <w:t xml:space="preserve"> </w:t>
+      </w:r>
+      <w:r>
+        <w:t xml:space="preserve">inStrain was likewise extended to all 225 matched single-species samples. Because its output is genome-resolved rather than</w:t>
+      </w:r>
+      <w:r>
+        <w:t xml:space="preserve"> </w:t>
+      </w:r>
+      <w:r>
+        <w:t xml:space="preserve">0.95-cluster-resolved, detected genomes were mapped to the truth 0.95 clusters after genomeCoverage filtering</w:t>
+      </w:r>
+      <w:r>
+        <w:t xml:space="preserve"> </w:t>
+      </w:r>
+      <w:r>
+        <w:t xml:space="preserve">(coverage ≥ 0.1, breadth ≥ 0.05). It retained high recall but precision declined with depth, with median</w:t>
+      </w:r>
+      <w:r>
+        <w:t xml:space="preserve"> </w:t>
+      </w:r>
+      <w:r>
+        <w:t xml:space="preserve">precision/recall/F1 of 0.750/0.500/0.667 at 0.5× and 0.185/1.000/0.313 at 10× (Fig 8;</w:t>
+      </w:r>
+      <w:r>
+        <w:t xml:space="preserve"> </w:t>
+      </w:r>
+      <w:r>
+        <w:rPr>
+          <w:rStyle w:val="VerbatimChar"/>
+        </w:rPr>
+        <w:t xml:space="preserve">results/instrain_sim225/</w:t>
+      </w:r>
+      <w:r>
+        <w:t xml:space="preserve">).</w:t>
       </w:r>
     </w:p>
     <w:p>
@@ -8968,7 +9016,7 @@
         <w:pStyle w:val="BodyText"/>
       </w:pPr>
       <w:r>
-        <w:t xml:space="preserve">Figure 7 summarizes the archived native Strain2bScan output for all 2,025 single-species samples</w:t>
+        <w:t xml:space="preserve">Figure 7 summarizes a current-source Strain2bScan rerun of all 2,025 single-species samples</w:t>
       </w:r>
       <w:r>
         <w:t xml:space="preserve"> </w:t>
@@ -8980,7 +9028,7 @@
         <w:rPr>
           <w:rStyle w:val="VerbatimChar"/>
         </w:rPr>
-        <w:t xml:space="preserve">figure_raw_data/sim_headtohead/strain2bscan_single_native_persample.tsv</w:t>
+        <w:t xml:space="preserve">results/sim2025_current/current_single_persample.tsv</w:t>
       </w:r>
       <w:r>
         <w:t xml:space="preserve">; aggregate tables in</w:t>
@@ -8992,28 +9040,28 @@
         <w:rPr>
           <w:rStyle w:val="VerbatimChar"/>
         </w:rPr>
-        <w:t xml:space="preserve">results/sim2025_summary/</w:t>
-      </w:r>
-      <w:r>
-        <w:t xml:space="preserve">). This complete-pool analysis characterizes the depth and cluster-strategy</w:t>
-      </w:r>
-      <w:r>
-        <w:t xml:space="preserve"> </w:t>
-      </w:r>
-      <w:r>
-        <w:t xml:space="preserve">accuracy envelope. Because a subsequent current-source audit found version-dependent changes in 101 of</w:t>
-      </w:r>
-      <w:r>
-        <w:t xml:space="preserve"> </w:t>
-      </w:r>
-      <w:r>
-        <w:t xml:space="preserve">225 archived metric triplets, the multi-tool comparison in Fig 8 and Tables 1–3 uses the current-source</w:t>
-      </w:r>
-      <w:r>
-        <w:t xml:space="preserve"> </w:t>
-      </w:r>
-      <w:r>
-        <w:t xml:space="preserve">matched rerun rather than pooling archived and current metrics.</w:t>
+        <w:t xml:space="preserve">results/sim2025_current_summary/</w:t>
+      </w:r>
+      <w:r>
+        <w:t xml:space="preserve">). This complete-pool analysis characterizes the depth and</w:t>
+      </w:r>
+      <w:r>
+        <w:t xml:space="preserve"> </w:t>
+      </w:r>
+      <w:r>
+        <w:t xml:space="preserve">cluster-strategy accuracy envelope and supersedes the archived n=2025 table, which differed for 512 of</w:t>
+      </w:r>
+      <w:r>
+        <w:t xml:space="preserve"> </w:t>
+      </w:r>
+      <w:r>
+        <w:t xml:space="preserve">2,025 metric triplets. The multi-tool comparison in Fig 8 and Tables 1–3 uses the same current-source</w:t>
+      </w:r>
+      <w:r>
+        <w:t xml:space="preserve"> </w:t>
+      </w:r>
+      <w:r>
+        <w:t xml:space="preserve">matched subset.</w:t>
       </w:r>
     </w:p>
     <w:p>
@@ -11126,7 +11174,7 @@
         <w:t xml:space="preserve"> </w:t>
       </w:r>
       <w:r>
-        <w:t xml:space="preserve">Strain2bScan was evaluated on all 2,025 ART error-modelled shotgun simulations from 15 species, followed by in-silico 2bRAD digestion. Median precision, recall and F1 were 1.000; mean F1 increased from 0.744 at 0.5× to 0.963 at 10×. Panels show per-species means, depth dependence and different-cluster versus same-cluster design.</w:t>
+        <w:t xml:space="preserve">Strain2bScan was evaluated on all 2,025 ART error-modelled shotgun simulations from 15 species, followed by in-silico 2bRAD digestion. Median precision, recall and F1 were 1.000; mean precision, recall and F1 were 0.890, 0.846 and 0.862. Mean F1 increased from 0.786 at 0.5× to 0.888 at 10×. Panels show per-species means, depth dependence and different-cluster versus same-cluster design.</w:t>
       </w:r>
     </w:p>
     <w:p>
@@ -11196,7 +11244,7 @@
         <w:t xml:space="preserve"> </w:t>
       </w:r>
       <w:r>
-        <w:t xml:space="preserve">Strain2bScan, StrainScan and StrainGST were compared on 225 matched single-species simulations and 12 multi-species communities. Accuracy panels use each tool’s own cluster space: 0.95 for Strain2bScan/StrainScan and 0.90 for StrainGST, so accuracy is not pooled. Panels also show database-build cost, same-environment profiling cost and multi-species profiling time.</w:t>
+        <w:t xml:space="preserve">Strain2bScan, StrainScan, StrainGST and inStrain were compared on 225 matched single-species simulations and 12 multi-species communities. Accuracy panels use each tool’s own reference/cluster space: 0.95 for Strain2bScan/StrainScan, 0.90 for StrainGST, and full species genome pools for inStrain, so accuracy is not pooled. Panels also show database-build cost, same-environment profiling cost and multi-species profiling time.</w:t>
       </w:r>
     </w:p>
     <w:p>

</xml_diff>

<commit_message>
manuscript: simplify results and record WMS validation/cleanup
</commit_message>
<xml_diff>
--- a/manuscript/Strain2bScan_manuscript_figures_tables_2026-10-18-restructured.docx
+++ b/manuscript/Strain2bScan_manuscript_figures_tables_2026-10-18-restructured.docx
@@ -2,7 +2,7 @@
 <file path=word/document.xml><?xml version="1.0" encoding="utf-8"?>
 <w:document xmlns:w="http://schemas.openxmlformats.org/wordprocessingml/2006/main" xmlns:m="http://schemas.openxmlformats.org/officeDocument/2006/math" xmlns:r="http://schemas.openxmlformats.org/officeDocument/2006/relationships" xmlns:o="urn:schemas-microsoft-com:office:office" xmlns:v="urn:schemas-microsoft-com:vml" xmlns:w10="urn:schemas-microsoft-com:office:word" xmlns:a="http://schemas.openxmlformats.org/drawingml/2006/main" xmlns:pic="http://schemas.openxmlformats.org/drawingml/2006/picture" xmlns:wp="http://schemas.openxmlformats.org/drawingml/2006/wordprocessingDrawing">
   <w:body>
-    <w:bookmarkStart w:id="41" w:name="X6bb31cdc1a649331d2d99c75a335f27f43454ed"/>
+    <w:bookmarkStart w:id="39" w:name="X6bb31cdc1a649331d2d99c75a335f27f43454ed"/>
     <w:p>
       <w:pPr>
         <w:pStyle w:val="Heading1"/>
@@ -464,7 +464,7 @@
       </w:r>
     </w:p>
     <w:bookmarkEnd w:id="10"/>
-    <w:bookmarkStart w:id="25" w:name="results"/>
+    <w:bookmarkStart w:id="23" w:name="results"/>
     <w:p>
       <w:pPr>
         <w:pStyle w:val="Heading2"/>
@@ -487,47 +487,17 @@
         <w:pStyle w:val="FirstParagraph"/>
       </w:pPr>
       <w:r>
-        <w:t xml:space="preserve">Strain2bScan reduces reference genomes to canonical, single-copy 2bRAD tags, clusters genomes within each</w:t>
-      </w:r>
-      <w:r>
-        <w:t xml:space="preserve"> </w:t>
-      </w:r>
-      <w:r>
-        <w:t xml:space="preserve">species at 0.95 Jaccard similarity, and builds a compact cluster-by-marker database. Profiling digests a</w:t>
-      </w:r>
-      <w:r>
-        <w:t xml:space="preserve"> </w:t>
-      </w:r>
-      <w:r>
-        <w:t xml:space="preserve">sample once, gates species on panel-specific markers, and scores strain-resolved clusters on unique</w:t>
-      </w:r>
-      <w:r>
-        <w:t xml:space="preserve"> </w:t>
-      </w:r>
-      <w:r>
-        <w:t xml:space="preserve">markers. The same tag space accepts two entry points: in-silico digestion of conventional shotgun reads and</w:t>
-      </w:r>
-      <w:r>
-        <w:t xml:space="preserve"> </w:t>
-      </w:r>
-      <w:r>
-        <w:t xml:space="preserve">native BcgI 2bRAD-M libraries whose reads are already tags. The tag definitions match Fast2bRAD-M, so its</w:t>
-      </w:r>
-      <w:r>
-        <w:t xml:space="preserve"> </w:t>
-      </w:r>
-      <w:r>
-        <w:t xml:space="preserve">species layer and the Strain2bScan strain layer share one marker space.</w:t>
+        <w:t xml:space="preserve">Strain2bScan reduces reference genomes to canonical, single-copy 2bRAD tags, clusters genomes within each species at 0.95 Jaccard similarity, and builds a compact cluster-by-marker database. Profiling digests a sample once, gates species on panel-specific markers, and scores strain-resolved clusters on unique markers. The same tag space accepts native BcgI 2bRAD-M libraries and in-silico-digested shotgun reads. Tag definitions match Fast2bRAD-M, so species and strain profiling share one marker space.</w:t>
       </w:r>
     </w:p>
     <w:bookmarkEnd w:id="11"/>
-    <w:bookmarkStart w:id="22" w:name="X85fa135c084c59c63053a92e37410958ba8e52c"/>
+    <w:bookmarkStart w:id="21" w:name="X588fc7105f115651b369a746a1c419f8b882a05"/>
     <w:p>
       <w:pPr>
         <w:pStyle w:val="Heading4"/>
       </w:pPr>
       <w:r>
-        <w:t xml:space="preserve">2bRAD tags carry strain-level signal that 16S cannot (Fig 2)</w:t>
+        <w:t xml:space="preserve">2bRAD tags retain strain-level signal that 16S does not (Fig 2)</w:t>
       </w:r>
     </w:p>
     <w:p>
@@ -535,43 +505,7 @@
         <w:pStyle w:val="FirstParagraph"/>
       </w:pPr>
       <w:r>
-        <w:t xml:space="preserve">We compared pairwise strain distances in whole-genome, 2bRAD-tag and 16S spaces across 15 species with</w:t>
-      </w:r>
-      <w:r>
-        <w:t xml:space="preserve"> </w:t>
-      </w:r>
-      <w:r>
-        <w:t xml:space="preserve">complete or near-complete genomes. Per species, 2bRAD distances tracked whole-genome distances in every</w:t>
-      </w:r>
-      <w:r>
-        <w:t xml:space="preserve"> </w:t>
-      </w:r>
-      <w:r>
-        <w:t xml:space="preserve">case (median Spearman ρ = 0.94; range 0.59–0.99), whereas 16S distances were much weaker (median ρ = 0.36),</w:t>
-      </w:r>
-      <w:r>
-        <w:t xml:space="preserve"> </w:t>
-      </w:r>
-      <w:r>
-        <w:t xml:space="preserve">with several confidence intervals overlapping zero (Fig 2). The rank-rank matrices show the mechanism:</w:t>
-      </w:r>
-      <w:r>
-        <w:t xml:space="preserve"> </w:t>
-      </w:r>
-      <w:r>
-        <w:t xml:space="preserve">2bRAD preserved the ordering of genome-wide strain pairs, whereas 16S collapsed many unrelated pairs to a</w:t>
-      </w:r>
-      <w:r>
-        <w:t xml:space="preserve"> </w:t>
-      </w:r>
-      <w:r>
-        <w:t xml:space="preserve">few conserved-gene distances. Thus, 16S resolved species but the 2bRAD marker set retained genome-wide</w:t>
-      </w:r>
-      <w:r>
-        <w:t xml:space="preserve"> </w:t>
-      </w:r>
-      <w:r>
-        <w:t xml:space="preserve">strain signal.</w:t>
+        <w:t xml:space="preserve">Across 15 species with complete or near-complete genomes, 2bRAD-tag distances tracked whole-genome strain distances in every species (median Spearman ρ = 0.94; range 0.59–0.99), whereas 16S distances were much weaker (median ρ = 0.36). Thus, 16S resolved species, while 2bRAD markers retained genome-wide strain relationships.</w:t>
       </w:r>
     </w:p>
     <w:p>
@@ -583,7 +517,7 @@
           <w:b/>
           <w:bCs/>
         </w:rPr>
-        <w:t xml:space="preserve">Part I. Native 2bRAD-M for low-biomass, high-host microbiomes.</w:t>
+        <w:t xml:space="preserve">Part I. Native 2bRAD-M performance.</w:t>
       </w:r>
     </w:p>
     <w:bookmarkStart w:id="12" w:name="X9568d002ec9b92cde82df69a8669dd01a6ca4e5"/>
@@ -600,47 +534,17 @@
         <w:pStyle w:val="FirstParagraph"/>
       </w:pPr>
       <w:r>
-        <w:t xml:space="preserve">Across 14 resolvable simulation-pool species, increasing the enzyme set from 1 to 14 left precision at 1.0</w:t>
-      </w:r>
-      <w:r>
-        <w:t xml:space="preserve"> </w:t>
-      </w:r>
-      <w:r>
-        <w:t xml:space="preserve">while increasing median recall monotonically from 0.50 to 1.00 and the median strain-specific marker yield</w:t>
-      </w:r>
-      <w:r>
-        <w:t xml:space="preserve"> </w:t>
-      </w:r>
-      <w:r>
-        <w:t xml:space="preserve">from 976 to 12,647 (Fig 3). Cluster count was invariant, so additional enzymes increased marker density and</w:t>
-      </w:r>
-      <w:r>
-        <w:t xml:space="preserve"> </w:t>
-      </w:r>
-      <w:r>
-        <w:t xml:space="preserve">recall rather than resolution. BcgI alone under-resolved near-clonal species, whereas approximately four</w:t>
-      </w:r>
-      <w:r>
-        <w:t xml:space="preserve"> </w:t>
-      </w:r>
-      <w:r>
-        <w:t xml:space="preserve">enzymes recovered most recall at much lower marker cost. Single-enzyme BcgI operation nevertheless enables</w:t>
-      </w:r>
-      <w:r>
-        <w:t xml:space="preserve"> </w:t>
-      </w:r>
-      <w:r>
-        <w:t xml:space="preserve">direct profiling of native BcgI 2bRAD-M libraries.</w:t>
+        <w:t xml:space="preserve">Across 14 resolvable simulation-pool species, increasing the enzyme set from 1 to 14 maintained precision at 1.0 and increased median recall from 0.50 to 1.00. Marker yield increased from 976 to 12,647, but cluster count was unchanged, showing that additional enzymes increased marker density and recall rather than cluster resolution. BcgI alone enabled direct native 2bRAD-M profiling; approximately four enzymes recovered most recall.</w:t>
       </w:r>
     </w:p>
     <w:bookmarkEnd w:id="12"/>
-    <w:bookmarkStart w:id="13" w:name="Xb98dd318b38d5a6aaf0230b89ee7e3b38121cac"/>
+    <w:bookmarkStart w:id="13" w:name="dna-mocks-fig-4"/>
     <w:p>
       <w:pPr>
         <w:pStyle w:val="Heading5"/>
       </w:pPr>
       <w:r>
-        <w:t xml:space="preserve">DNA mocks: MSA-1002, MSA-1003, MSA-1005 and MSA-1007 (Fig 4)</w:t>
+        <w:t xml:space="preserve">DNA mocks (Fig 4)</w:t>
       </w:r>
     </w:p>
     <w:p>
@@ -648,110 +552,17 @@
         <w:pStyle w:val="FirstParagraph"/>
       </w:pPr>
       <w:r>
-        <w:t xml:space="preserve">We next profiled four ATCC whole-cell mocks against a unified 28-species, 164-genome tree in which each mock</w:t>
-      </w:r>
-      <w:r>
-        <w:t xml:space="preserve"> </w:t>
-      </w:r>
-      <w:r>
-        <w:t xml:space="preserve">species was represented by its ATCC genome and up to five conspecific decoys (ANI &gt; 95%). Native BcgI reads</w:t>
-      </w:r>
-      <w:r>
-        <w:t xml:space="preserve"> </w:t>
-      </w:r>
-      <w:r>
-        <w:t xml:space="preserve">were clustered with</w:t>
-      </w:r>
-      <w:r>
-        <w:t xml:space="preserve"> </w:t>
-      </w:r>
-      <w:r>
-        <w:rPr>
-          <w:rStyle w:val="VerbatimChar"/>
-        </w:rPr>
-        <w:t xml:space="preserve">--containment</w:t>
-      </w:r>
-      <w:r>
-        <w:t xml:space="preserve"> </w:t>
-      </w:r>
-      <w:r>
-        <w:t xml:space="preserve">and profiled with</w:t>
-      </w:r>
-      <w:r>
-        <w:t xml:space="preserve"> </w:t>
-      </w:r>
-      <w:r>
-        <w:rPr>
-          <w:rStyle w:val="VerbatimChar"/>
-        </w:rPr>
-        <w:t xml:space="preserve">--min-abundance 0 --min-coverage 0.2</w:t>
-      </w:r>
-      <w:r>
-        <w:t xml:space="preserve">; the primary</w:t>
-      </w:r>
-      <w:r>
-        <w:t xml:space="preserve"> </w:t>
-      </w:r>
-      <w:r>
-        <w:t xml:space="preserve">detection threshold was abundance ≥ 10⁻⁴. At 90, 95 and 99% human DNA, F1 was 0.976–1.0 and Bray–Curtis</w:t>
-      </w:r>
-      <w:r>
-        <w:t xml:space="preserve"> </w:t>
-      </w:r>
-      <w:r>
-        <w:t xml:space="preserve">similarity was 0.745–0.756 (Fig 4). In the DNA-input ladder, F1 was 0.952 at 0.1 ng (precision 0.909, recall</w:t>
-      </w:r>
-      <w:r>
-        <w:t xml:space="preserve"> </w:t>
-      </w:r>
-      <w:r>
-        <w:t xml:space="preserve">1.0), 1.0 at 1 ng and 0.625 at 0.01 ng; AUPR fell to 0.50 at 0.01 ng, and 0.001 ng was below the practical</w:t>
-      </w:r>
-      <w:r>
-        <w:t xml:space="preserve"> </w:t>
-      </w:r>
-      <w:r>
-        <w:t xml:space="preserve">detection floor. On staggered MSA-1003, F1 was 0.703–0.824 and AUPR was 0.65–0.70. MSA-1005 retained F1 =</w:t>
-      </w:r>
-      <w:r>
-        <w:t xml:space="preserve"> </w:t>
-      </w:r>
-      <w:r>
-        <w:t xml:space="preserve">1.0; MSA-1007 had F1 = 0.667–1.0 because a small number of abundance-negligible calls crossed the presence</w:t>
-      </w:r>
-      <w:r>
-        <w:t xml:space="preserve"> </w:t>
-      </w:r>
-      <w:r>
-        <w:t xml:space="preserve">threshold, although AUPR was 1.0. Together, the mocks show a ~1× marker-depth noise floor: true strains</w:t>
-      </w:r>
-      <w:r>
-        <w:t xml:space="preserve"> </w:t>
-      </w:r>
-      <w:r>
-        <w:t xml:space="preserve">were deeply covered, whereas spurious near-sibling calls occurred near 1× and approximately 0.02% relative</w:t>
-      </w:r>
-      <w:r>
-        <w:t xml:space="preserve"> </w:t>
-      </w:r>
-      <w:r>
-        <w:t xml:space="preserve">abundance. This floor was larger on the unified 28-species database than on a per-mock 20-species tree</w:t>
-      </w:r>
-      <w:r>
-        <w:t xml:space="preserve"> </w:t>
-      </w:r>
-      <w:r>
-        <w:t xml:space="preserve">(Fig S3).</w:t>
+        <w:t xml:space="preserve">Four ATCC whole-cell mocks were profiled against a unified 28-species, 164-genome tree. In the primary MSA-1002 comparison, native BcgI 2bRAD-M retained F1 at 1e-4 = 0.909 at 0.1 ng DNA and F1 = 1.0 with AUPR = 1.0 at 90–99% human DNA. Across the four mocks, F1 was 0.976–1.0 at 90–99% host DNA and Bray–Curtis similarity was 0.745–0.756. F1 was 0.952 at 0.1 ng DNA and 1.0 at 1 ng, whereas 0.001 ng was below the practical detection floor. These mocks therefore support robust strain detection under high host content and low input, with a remaining noise floor near approximately 1× marker depth.</w:t>
       </w:r>
     </w:p>
     <w:bookmarkEnd w:id="13"/>
-    <w:bookmarkStart w:id="14" w:name="X45d0e8254df5c6674221f9958dff6f0752a2991"/>
+    <w:bookmarkStart w:id="14" w:name="real-saliva-time-course-fig-5"/>
     <w:p>
       <w:pPr>
         <w:pStyle w:val="Heading5"/>
       </w:pPr>
       <w:r>
-        <w:t xml:space="preserve">Real metagenomes: saliva time-course (Fig 5)</w:t>
+        <w:t xml:space="preserve">Real saliva time-course (Fig 5)</w:t>
       </w:r>
     </w:p>
     <w:p>
@@ -759,81 +570,17 @@
         <w:pStyle w:val="FirstParagraph"/>
       </w:pPr>
       <w:r>
-        <w:t xml:space="preserve">We profiled native BcgI 2bRAD saliva from 8 subjects sampled at four times of day (32 libraries) against a</w:t>
-      </w:r>
-      <w:r>
-        <w:t xml:space="preserve"> </w:t>
-      </w:r>
-      <w:r>
-        <w:t xml:space="preserve">19-species oral reference panel. Subject PERMANOVA R² was similar for strain and species profiles (0.757</w:t>
-      </w:r>
-      <w:r>
-        <w:t xml:space="preserve"> </w:t>
-      </w:r>
-      <w:r>
-        <w:t xml:space="preserve">versus 0.755; both p = 2 × 10⁻⁴). Leave-one-timepoint-out nearest-neighbour classification identified the</w:t>
-      </w:r>
-      <w:r>
-        <w:t xml:space="preserve"> </w:t>
-      </w:r>
-      <w:r>
-        <w:t xml:space="preserve">host with 100% accuracy from strain features versus 78.1% from species features (Fig 5), but this was a</w:t>
-      </w:r>
-      <w:r>
-        <w:t xml:space="preserve"> </w:t>
-      </w:r>
-      <w:r>
-        <w:t xml:space="preserve">small within-subject classification result across eight subjects and does not constitute independent</w:t>
-      </w:r>
-      <w:r>
-        <w:t xml:space="preserve"> </w:t>
-      </w:r>
-      <w:r>
-        <w:t xml:space="preserve">strain-identity validation. The strongest</w:t>
-      </w:r>
-      <w:r>
-        <w:t xml:space="preserve"> </w:t>
-      </w:r>
-      <w:r>
-        <w:t xml:space="preserve">single-species association was</w:t>
-      </w:r>
-      <w:r>
-        <w:t xml:space="preserve"> </w:t>
-      </w:r>
-      <w:r>
-        <w:rPr>
-          <w:i/>
-          <w:iCs/>
-        </w:rPr>
-        <w:t xml:space="preserve">Neisseria subflava</w:t>
-      </w:r>
-      <w:r>
-        <w:t xml:space="preserve"> </w:t>
-      </w:r>
-      <w:r>
-        <w:t xml:space="preserve">(subject R² = 0.808); all 13 testable species were</w:t>
-      </w:r>
-      <w:r>
-        <w:t xml:space="preserve"> </w:t>
-      </w:r>
-      <w:r>
-        <w:t xml:space="preserve">significant at nominal p values. Within-subject Bray–Curtis distance was lower than between-subject distance</w:t>
-      </w:r>
-      <w:r>
-        <w:t xml:space="preserve"> </w:t>
-      </w:r>
-      <w:r>
-        <w:t xml:space="preserve">(0.327 versus 0.696; p = 8.05 × 10⁻¹⁹), indicating a stable, person-specific strain signature.</w:t>
+        <w:t xml:space="preserve">Thirty-two native BcgI 2bRAD-M saliva libraries from eight subjects and four within-day timepoints were profiled against a 19-species oral panel. Strain features identified the subject in every leave-one-timepoint-out test (100% versus 78.1% for species features), and within-subject Bray–Curtis distance was lower than between-subject distance (0.327 versus 0.696; p = 8.05 × 10⁻¹⁹). These data show a stable, person-specific strain signature, although the small within-subject classifier is not independent strain-identity validation.</w:t>
       </w:r>
     </w:p>
     <w:bookmarkEnd w:id="14"/>
-    <w:bookmarkStart w:id="15" w:name="Xe709adcabc8ef390bb3eab6e0704ca97700d819"/>
+    <w:bookmarkStart w:id="15" w:name="Xdd05510a6c88ea41205be34bd58e2aadf43ac83"/>
     <w:p>
       <w:pPr>
         <w:pStyle w:val="Heading5"/>
       </w:pPr>
       <w:r>
-        <w:t xml:space="preserve">Real paired 2bRAD-M/shotgun saliva comparison (Fig 6)</w:t>
+        <w:t xml:space="preserve">Paired saliva: 2bRAD-M versus shotgun (Fig 6)</w:t>
       </w:r>
     </w:p>
     <w:p>
@@ -841,61 +588,7 @@
         <w:pStyle w:val="FirstParagraph"/>
       </w:pPr>
       <w:r>
-        <w:t xml:space="preserve">Paired shotgun allowed a directional comparison of input modalities, not an independent accuracy validation.</w:t>
-      </w:r>
-      <w:r>
-        <w:t xml:space="preserve"> </w:t>
-      </w:r>
-      <w:r>
-        <w:t xml:space="preserve">Only three subjects had usable paired bacterial recovery, and the shotgun comparison used R1 prefix</w:t>
-      </w:r>
-      <w:r>
-        <w:t xml:space="preserve"> </w:t>
-      </w:r>
-      <w:r>
-        <w:t xml:space="preserve">subsamples. In those samples, all 65 shotgun strain-cluster calls were also present in native BcgI 2bRAD-M</w:t>
-      </w:r>
-      <w:r>
-        <w:t xml:space="preserve"> </w:t>
-      </w:r>
-      <w:r>
-        <w:t xml:space="preserve">(65/65). Native BcgI 2bRAD-M yielded 128–163 additional candidate strain-cluster calls per sample. Calls</w:t>
-      </w:r>
-      <w:r>
-        <w:t xml:space="preserve"> </w:t>
-      </w:r>
-      <w:r>
-        <w:t xml:space="preserve">unique to 2bRAD had lower median community relative abundance than shared calls (0.0029 versus 0.0097;</w:t>
-      </w:r>
-      <w:r>
-        <w:t xml:space="preserve"> </w:t>
-      </w:r>
-      <w:r>
-        <w:t xml:space="preserve">Mann–Whitney p = 1.2 × 10⁻²³, with calls treated as observations rather than independent subjects; Fig 6).</w:t>
-      </w:r>
-      <w:r>
-        <w:t xml:space="preserve"> </w:t>
-      </w:r>
-      <w:r>
-        <w:t xml:space="preserve">The pattern is consistent with greater sensitivity to low-abundance strains on native high-host material, but</w:t>
-      </w:r>
-      <w:r>
-        <w:t xml:space="preserve"> </w:t>
-      </w:r>
-      <w:r>
-        <w:t xml:space="preserve">the additional calls require independent validation. Strain2bScan also profiled four exploratory oral</w:t>
-      </w:r>
-      <w:r>
-        <w:t xml:space="preserve"> </w:t>
-      </w:r>
-      <w:r>
-        <w:t xml:space="preserve">libraries, producing 15–17 species and 115–158 strain-cluster calls per sample in approximately 2 s</w:t>
-      </w:r>
-      <w:r>
-        <w:t xml:space="preserve"> </w:t>
-      </w:r>
-      <w:r>
-        <w:t xml:space="preserve">(Table S3).</w:t>
+        <w:t xml:space="preserve">In three usable paired samples, all 65 shotgun strain-cluster calls were also present in native BcgI 2bRAD-M (65/65). Native libraries yielded 128–163 additional candidate strain-cluster calls per sample; these calls had lower median relative abundance than shared calls (0.0029 versus 0.0097; Mann–Whitney p = 1.2 × 10⁻²³). This directional comparison supports greater recovery of low-abundance strains by native 2bRAD-M, but the additional calls require independent validation.</w:t>
       </w:r>
     </w:p>
     <w:p>
@@ -907,17 +600,17 @@
           <w:b/>
           <w:bCs/>
         </w:rPr>
-        <w:t xml:space="preserve">Part II. Conventional metagenomes at community scale.</w:t>
+        <w:t xml:space="preserve">Part II. Conventional shotgun performance.</w:t>
       </w:r>
     </w:p>
     <w:bookmarkEnd w:id="15"/>
-    <w:bookmarkStart w:id="16" w:name="Xa34e1f2972720b0f7612d31a5bbe4a027ad35b1"/>
+    <w:bookmarkStart w:id="16" w:name="Xcc9f7719b92a2f6984d24d9b04a0bc77494279d"/>
     <w:p>
       <w:pPr>
         <w:pStyle w:val="Heading5"/>
       </w:pPr>
       <w:r>
-        <w:t xml:space="preserve">In-silico simulation across the complete 15-species pool (Fig 7)</w:t>
+        <w:t xml:space="preserve">Complete 15-species simulation pool (Fig 7)</w:t>
       </w:r>
     </w:p>
     <w:p>
@@ -925,124 +618,17 @@
         <w:pStyle w:val="FirstParagraph"/>
       </w:pPr>
       <w:r>
-        <w:t xml:space="preserve">We evaluated Strain2bScan on all 2,025 single-species simulated metagenomes generated from the same 15-species,</w:t>
-      </w:r>
-      <w:r>
-        <w:t xml:space="preserve"> </w:t>
-      </w:r>
-      <w:r>
-        <w:t xml:space="preserve">complete/near-complete genome pool used below. These were ART error-modelled 250-bp paired-end shotgun reads;</w:t>
-      </w:r>
-      <w:r>
-        <w:t xml:space="preserve"> </w:t>
-      </w:r>
-      <w:r>
-        <w:t xml:space="preserve">Strain2bScan digested them in silico into the 2bRAD marker space. Each sample contained 2, 3 or 5 co-present</w:t>
-      </w:r>
-      <w:r>
-        <w:t xml:space="preserve"> </w:t>
-      </w:r>
-      <w:r>
-        <w:t xml:space="preserve">strains at per-strain depths of 0.5, 1, 3, 5 or 10×, with 5 replicates per feasible design cell. Feasibility</w:t>
-      </w:r>
-      <w:r>
-        <w:t xml:space="preserve"> </w:t>
-      </w:r>
-      <w:r>
-        <w:t xml:space="preserve">depended on the available 0.95-cluster structure: 10 species had both different-cluster and same-cluster</w:t>
-      </w:r>
-      <w:r>
-        <w:t xml:space="preserve"> </w:t>
-      </w:r>
-      <w:r>
-        <w:t xml:space="preserve">samples (150 samples each), three lacked one five-strain same-cluster combination (125 samples each),</w:t>
-      </w:r>
-      <w:r>
-        <w:t xml:space="preserve"> </w:t>
-      </w:r>
-      <w:r>
-        <w:t xml:space="preserve">near-clonal</w:t>
-      </w:r>
-      <w:r>
-        <w:t xml:space="preserve"> </w:t>
-      </w:r>
-      <w:r>
-        <w:rPr>
-          <w:i/>
-          <w:iCs/>
-        </w:rPr>
-        <w:t xml:space="preserve">M. tuberculosis</w:t>
-      </w:r>
-      <w:r>
-        <w:t xml:space="preserve"> </w:t>
-      </w:r>
-      <w:r>
-        <w:t xml:space="preserve">was represented by same-cluster samples (75), and</w:t>
-      </w:r>
-      <w:r>
-        <w:t xml:space="preserve"> </w:t>
-      </w:r>
-      <w:r>
-        <w:rPr>
-          <w:i/>
-          <w:iCs/>
-        </w:rPr>
-        <w:t xml:space="preserve">P. copri</w:t>
-      </w:r>
-      <w:r>
-        <w:t xml:space="preserve">, whose panel</w:t>
-      </w:r>
-      <w:r>
-        <w:t xml:space="preserve"> </w:t>
-      </w:r>
-      <w:r>
-        <w:t xml:space="preserve">collapsed to singleton clusters, was represented by different-cluster samples (75). Across all 2,025 samples,</w:t>
-      </w:r>
-      <w:r>
-        <w:t xml:space="preserve"> </w:t>
-      </w:r>
-      <w:r>
-        <w:t xml:space="preserve">median precision, recall and F1 were 1.000, with mean precision 0.890, mean recall 0.846 and mean F1 0.862.</w:t>
-      </w:r>
-      <w:r>
-        <w:t xml:space="preserve"> </w:t>
-      </w:r>
-      <w:r>
-        <w:t xml:space="preserve">Mean F1 rose from 0.786 at 0.5× to 0.888 at 10×, while median precision remained 1.000 across depths</w:t>
-      </w:r>
-      <w:r>
-        <w:t xml:space="preserve"> </w:t>
-      </w:r>
-      <w:r>
-        <w:t xml:space="preserve">(Fig 7;</w:t>
-      </w:r>
-      <w:r>
-        <w:t xml:space="preserve"> </w:t>
-      </w:r>
-      <w:r>
-        <w:rPr>
-          <w:rStyle w:val="VerbatimChar"/>
-        </w:rPr>
-        <w:t xml:space="preserve">results/sim2025_current_summary/</w:t>
-      </w:r>
-      <w:r>
-        <w:t xml:space="preserve">). This current-source full-pool rerun supersedes the archived</w:t>
-      </w:r>
-      <w:r>
-        <w:t xml:space="preserve"> </w:t>
-      </w:r>
-      <w:r>
-        <w:t xml:space="preserve">2,025-sample table, which differed for 512 of 2,025 metric triplets.</w:t>
+        <w:t xml:space="preserve">We evaluated current-source Strain2bScan on all 2,025 single-species ART error-modelled shotgun metagenomes generated from the same 15-species genome pool. Each sample contained 2, 3 or 5 co-present strains at 0.5–10× per-strain depth. Median precision, recall and F1 were 1.000 across the full pool; mean precision, recall and F1 were 0.890, 0.846 and 0.862. Mean F1 increased from 0.786 at 0.5× to 0.888 at 10×, while median precision remained 1.000. These simulations establish the accuracy envelope of the 2bRAD marker framework.</w:t>
       </w:r>
     </w:p>
     <w:bookmarkEnd w:id="16"/>
-    <w:bookmarkStart w:id="17" w:name="X99c0b282275d1d08f8d1430adf004a08f21f22e"/>
+    <w:bookmarkStart w:id="17" w:name="X2fc8ead17102b8c877d4bae032b5568ecd8d0f6"/>
     <w:p>
       <w:pPr>
         <w:pStyle w:val="Heading5"/>
       </w:pPr>
       <w:r>
-        <w:t xml:space="preserve">Matched 225-sample multi-tool simulation benchmark (Fig 8, Tables 1–3)</w:t>
+        <w:t xml:space="preserve">Matched 225-sample multi-tool benchmark (Fig 8, Tables 1–3)</w:t>
       </w:r>
     </w:p>
     <w:p>
@@ -1050,123 +636,7 @@
         <w:pStyle w:val="FirstParagraph"/>
       </w:pPr>
       <w:r>
-        <w:t xml:space="preserve">On a common 15-species simulation pool, both tools built databases from the same genomes and profiled the</w:t>
-      </w:r>
-      <w:r>
-        <w:t xml:space="preserve"> </w:t>
-      </w:r>
-      <w:r>
-        <w:t xml:space="preserve">same simulated reads. The comparator used a prespecified non-random matched subset: one replicate per design cell (225 of 2,025 single-species samples; 11.1%) and four of 15 communities per depth (12 of 60). Each tool was scored in its own 0.95-similarity cluster space. The current</w:t>
-      </w:r>
-      <w:r>
-        <w:t xml:space="preserve"> </w:t>
-      </w:r>
-      <w:r>
-        <w:t xml:space="preserve">Strain2bScan rerun comprised 225 matched single-species entries; StrainScan produced reports for 204,</w:t>
-      </w:r>
-      <w:r>
-        <w:t xml:space="preserve"> </w:t>
-      </w:r>
-      <w:r>
-        <w:t xml:space="preserve">which were paired to the corresponding Strain2bScan runs, whereas 21 ended without calls, including all</w:t>
-      </w:r>
-      <w:r>
-        <w:t xml:space="preserve"> </w:t>
-      </w:r>
-      <w:r>
-        <w:rPr>
-          <w:i/>
-          <w:iCs/>
-        </w:rPr>
-        <w:t xml:space="preserve">Salmonella enterica</w:t>
-      </w:r>
-      <w:r>
-        <w:t xml:space="preserve"> </w:t>
-      </w:r>
-      <w:r>
-        <w:t xml:space="preserve">entries. Across the 204 completed runs from 14 species, species-median precision was</w:t>
-      </w:r>
-      <w:r>
-        <w:t xml:space="preserve"> </w:t>
-      </w:r>
-      <w:r>
-        <w:t xml:space="preserve">1.0 for both tools; species-median recall and F1 were 1.000 for Strain2bScan versus 0.667 and 0.800 for</w:t>
-      </w:r>
-      <w:r>
-        <w:t xml:space="preserve"> </w:t>
-      </w:r>
-      <w:r>
-        <w:t xml:space="preserve">StrainScan (Fig 8, Table 1). Species-specific resolution differed: Strain2bScan had lower precision and recall on</w:t>
-      </w:r>
-      <w:r>
-        <w:t xml:space="preserve"> </w:t>
-      </w:r>
-      <w:r>
-        <w:rPr>
-          <w:i/>
-          <w:iCs/>
-        </w:rPr>
-        <w:t xml:space="preserve">K. pneumoniae</w:t>
-      </w:r>
-      <w:r>
-        <w:t xml:space="preserve"> </w:t>
-      </w:r>
-      <w:r>
-        <w:t xml:space="preserve">(0.333/0.333 versus 1.000/0.800). In a species-cluster bootstrap, the paired mean</w:t>
-      </w:r>
-      <w:r>
-        <w:t xml:space="preserve"> </w:t>
-      </w:r>
-      <w:r>
-        <w:t xml:space="preserve">differences in recall (+0.063; 95% CI −0.037 to 0.133) and F1 (+0.005; 95% CI −0.091 to 0.069) included</w:t>
-      </w:r>
-      <w:r>
-        <w:t xml:space="preserve"> </w:t>
-      </w:r>
-      <w:r>
-        <w:t xml:space="preserve">zero. Strain2bScan reached full median recall from 1× onward, whereas StrainScan’s depth profile was</w:t>
-      </w:r>
-      <w:r>
-        <w:t xml:space="preserve"> </w:t>
-      </w:r>
-      <w:r>
-        <w:t xml:space="preserve">non-monotonic (Table 2). Multi-species F1 was lower for Strain2bScan at all three depths (Table 3). StrainGST was also run for every primary StrainScan-covered simulation benchmark and all four ATCC WMS mocks; Fig 8 and Tables 1–3 show its 0.90-space metrics alongside the 0.95-space comparisons without pooling. The supplementary StrainScan-curated-database subset in Supplementary Fig S5 was not rerun with StrainGE.</w:t>
-      </w:r>
-      <w:r>
-        <w:t xml:space="preserve"> </w:t>
-      </w:r>
-      <w:r>
-        <w:t xml:space="preserve">inStrain was likewise extended to all 225 matched single-species samples. Because its output is genome-resolved rather than</w:t>
-      </w:r>
-      <w:r>
-        <w:t xml:space="preserve"> </w:t>
-      </w:r>
-      <w:r>
-        <w:t xml:space="preserve">0.95-cluster-resolved, detected genomes were mapped to the truth 0.95 clusters after genomeCoverage filtering</w:t>
-      </w:r>
-      <w:r>
-        <w:t xml:space="preserve"> </w:t>
-      </w:r>
-      <w:r>
-        <w:t xml:space="preserve">(coverage ≥ 0.1, breadth ≥ 0.05). It retained high recall but precision declined with depth, with median</w:t>
-      </w:r>
-      <w:r>
-        <w:t xml:space="preserve"> </w:t>
-      </w:r>
-      <w:r>
-        <w:t xml:space="preserve">precision/recall/F1 of 0.750/0.500/0.667 at 0.5× and 0.185/1.000/0.313 at 10× (Fig 8;</w:t>
-      </w:r>
-      <w:r>
-        <w:t xml:space="preserve"> </w:t>
-      </w:r>
-      <w:r>
-        <w:rPr>
-          <w:rStyle w:val="VerbatimChar"/>
-        </w:rPr>
-        <w:t xml:space="preserve">results/instrain_sim225/</w:t>
-      </w:r>
-      <w:r>
-        <w:t xml:space="preserve">).</w:t>
+        <w:t xml:space="preserve">On 225 matched single-species simulations, Strain2bScan and StrainScan both achieved species-median precision 1.0 across the 204 completed StrainScan pairs. Species-median recall and F1 were 1.000 and 1.000 for Strain2bScan versus 0.667 and 0.800 for StrainScan; paired recall and F1 differences included zero (+0.063 recall; 95% CI −0.037 to 0.133; +0.005 F1; 95% CI −0.091 to 0.069). StrainScan’s depth profile was non-monotonic, whereas Strain2bScan reached full median recall from 1× onward. In a failure-as-absence sensitivity that retained all 225 intended entries, Strain2bScan had +0.127 higher recall (95% CI 0.007 to 0.248), because StrainScan lacked calls for 21 runs. Strain2bScan was also faster and lighter: database construction used 249–614× less wall time and 43–138× less memory, and per-sample profiling was 4–33× faster and 5–39× lighter. Multi-species F1 was lower for Strain2bScan at all three depths, so the scale advantage should not be interpreted as uniform accuracy superiority.</w:t>
       </w:r>
     </w:p>
     <w:p>
@@ -1174,7 +644,25 @@
         <w:pStyle w:val="BodyText"/>
       </w:pPr>
       <w:r>
-        <w:t xml:space="preserve">A prespecified failure-as-absence sensitivity retained all 225 intended entries and scored recall for each of the 21 absent StrainScan reports as zero. This analysis shifted the mean recall difference to +0.127 (95% species-cluster bootstrap CI 0.007 to 0.248); the no-call rate was 9.33%. Current-source outputs differed from the archived 2025 Strain2bScan table for 101 of 225 metric triplets, motivating use of the current rerun rather than the historical accuracy columns. Precision and F1 were not assigned to no-report failures. Fifteen</w:t>
+        <w:t xml:space="preserve">StrainGST and inStrain extended this comparison. StrainGST completed all simulations and ATCC shotgun mocks but used 53.31× more wall time and 25.49× more peak memory for single-species samples; accuracy was reported separately in its 0.90-reference space. inStrain completed all 225 matched samples and retained high recall, but median precision declined from 0.750 at 0.5× to 0.185 at 10× after mapping genomes to truth 0.95 clusters. Because each tool uses a different reference or cluster space, accuracies were not pooled.</w:t>
+      </w:r>
+    </w:p>
+    <w:bookmarkEnd w:id="17"/>
+    <w:bookmarkStart w:id="18" w:name="computational-scaling-fig-9"/>
+    <w:p>
+      <w:pPr>
+        <w:pStyle w:val="Heading5"/>
+      </w:pPr>
+      <w:r>
+        <w:t xml:space="preserve">Computational scaling (Fig 9)</w:t>
+      </w:r>
+    </w:p>
+    <w:p>
+      <w:pPr>
+        <w:pStyle w:val="FirstParagraph"/>
+      </w:pPr>
+      <w:r>
+        <w:t xml:space="preserve">For shotgun input, Strain2bScan profiled the</w:t>
       </w:r>
       <w:r>
         <w:t xml:space="preserve"> </w:t>
@@ -1184,13 +672,31 @@
           <w:i/>
           <w:iCs/>
         </w:rPr>
-        <w:t xml:space="preserve">S. enterica</w:t>
-      </w:r>
-      <w:r>
-        <w:t xml:space="preserve"> </w:t>
-      </w:r>
-      <w:r>
-        <w:t xml:space="preserve">and five</w:t>
+        <w:t xml:space="preserve">C. acnes</w:t>
+      </w:r>
+      <w:r>
+        <w:t xml:space="preserve"> </w:t>
+      </w:r>
+      <w:r>
+        <w:t xml:space="preserve">panel in 0.86 s and 78 MB per sample versus 7.06 s and 828 MB for StrainScan, an approximately 8× runtime and 11× memory advantage. Database build and profiling parallelised to 4.6× and 5.8× speed at 16 threads. On a 55-species panel, runtime was approximately flat in species count, giving a projected 121–146× cohort-level advantage because StrainScan lacks native multi-species profiling.</w:t>
+      </w:r>
+    </w:p>
+    <w:bookmarkEnd w:id="18"/>
+    <w:bookmarkStart w:id="19" w:name="X8d52d390eb57f74f17085b37d7d72237ee65b50"/>
+    <w:p>
+      <w:pPr>
+        <w:pStyle w:val="Heading5"/>
+      </w:pPr>
+      <w:r>
+        <w:t xml:space="preserve">Supplementary curated-reference comparison (Supplementary Fig S5)</w:t>
+      </w:r>
+    </w:p>
+    <w:p>
+      <w:pPr>
+        <w:pStyle w:val="FirstParagraph"/>
+      </w:pPr>
+      <w:r>
+        <w:t xml:space="preserve">On StrainScan-curated reference sets, both tools reached precision 1.0 for</w:t>
       </w:r>
       <w:r>
         <w:t xml:space="preserve"> </w:t>
@@ -1200,25 +706,76 @@
           <w:i/>
           <w:iCs/>
         </w:rPr>
-        <w:t xml:space="preserve">P. dorei</w:t>
-      </w:r>
-      <w:r>
-        <w:t xml:space="preserve"> </w:t>
-      </w:r>
-      <w:r>
-        <w:t xml:space="preserve">entries accounted for the no-call runs (Table S4). The two tools did not impose identical 0.95 partitions on the common pool: database cluster counts ranged from 1 to 39 for Strain2bScan and 1 to 39 for StrainScan, with species-specific differences documented in Table 1 and</w:t>
-      </w:r>
-      <w:r>
-        <w:t xml:space="preserve"> </w:t>
-      </w:r>
-      <w:r>
-        <w:rPr>
-          <w:rStyle w:val="VerbatimChar"/>
-        </w:rPr>
-        <w:t xml:space="preserve">results/strainscan_rerun/database_cluster_resolution.tsv</w:t>
-      </w:r>
-      <w:r>
-        <w:t xml:space="preserve">.</w:t>
+        <w:t xml:space="preserve">A. muciniphila</w:t>
+      </w:r>
+      <w:r>
+        <w:t xml:space="preserve"> </w:t>
+      </w:r>
+      <w:r>
+        <w:t xml:space="preserve">and</w:t>
+      </w:r>
+      <w:r>
+        <w:t xml:space="preserve"> </w:t>
+      </w:r>
+      <w:r>
+        <w:rPr>
+          <w:i/>
+          <w:iCs/>
+        </w:rPr>
+        <w:t xml:space="preserve">P. copri</w:t>
+      </w:r>
+      <w:r>
+        <w:t xml:space="preserve">. Strain2bScan matched or exceeded recall, was 17–23× faster and 15–24× lighter, and completed near-clonal</w:t>
+      </w:r>
+      <w:r>
+        <w:t xml:space="preserve"> </w:t>
+      </w:r>
+      <w:r>
+        <w:rPr>
+          <w:i/>
+          <w:iCs/>
+        </w:rPr>
+        <w:t xml:space="preserve">M. tuberculosis</w:t>
+      </w:r>
+      <w:r>
+        <w:t xml:space="preserve"> </w:t>
+      </w:r>
+      <w:r>
+        <w:t xml:space="preserve">in 0.89 s, whereas StrainScan did not complete. Low</w:t>
+      </w:r>
+      <w:r>
+        <w:t xml:space="preserve"> </w:t>
+      </w:r>
+      <w:r>
+        <w:rPr>
+          <w:i/>
+          <w:iCs/>
+        </w:rPr>
+        <w:t xml:space="preserve">M. tuberculosis</w:t>
+      </w:r>
+      <w:r>
+        <w:t xml:space="preserve"> </w:t>
+      </w:r>
+      <w:r>
+        <w:t xml:space="preserve">recall reflected collapse of the panel to five 0.95-similarity clusters.</w:t>
+      </w:r>
+    </w:p>
+    <w:bookmarkEnd w:id="19"/>
+    <w:bookmarkStart w:id="20" w:name="Xdcae5eff66ed62d5dca2a744bf2aa90745a236a"/>
+    <w:p>
+      <w:pPr>
+        <w:pStyle w:val="Heading5"/>
+      </w:pPr>
+      <w:r>
+        <w:t xml:space="preserve">DNA mocks and real shotgun cohorts (Fig 10, Tables 4–7)</w:t>
+      </w:r>
+    </w:p>
+    <w:p>
+      <w:pPr>
+        <w:pStyle w:val="FirstParagraph"/>
+      </w:pPr>
+      <w:r>
+        <w:t xml:space="preserve">On four ATCC shotgun mocks, Strain2bScan retained F1 = 1.0 in MSA-1002 at 90, 95 and 99% host DNA. At 99% host, StrainScan and inStrain had F1 = 0.095 and 0.333. Clean-mock thresholded precision varied with input composition, so the primary advantage was retention under host contamination rather than uniform clean-mock superiority.</w:t>
       </w:r>
     </w:p>
     <w:p>
@@ -1226,31 +783,7 @@
         <w:pStyle w:val="BodyText"/>
       </w:pPr>
       <w:r>
-        <w:t xml:space="preserve">The cost differences were largest during database construction: Strain2bScan used 0.7–5.1 s and 0.1–0.4 GB</w:t>
-      </w:r>
-      <w:r>
-        <w:t xml:space="preserve"> </w:t>
-      </w:r>
-      <w:r>
-        <w:t xml:space="preserve">per species, versus 5–43 min and 8–28 GB for StrainScan, a 249–614× runtime and 43–138× memory advantage</w:t>
-      </w:r>
-      <w:r>
-        <w:t xml:space="preserve"> </w:t>
-      </w:r>
-      <w:r>
-        <w:t xml:space="preserve">(Table 1). In the same emulated container, per-sample profiling was 4–33× faster and 5–39× lighter</w:t>
-      </w:r>
-      <w:r>
-        <w:t xml:space="preserve"> </w:t>
-      </w:r>
-      <w:r>
-        <w:t xml:space="preserve">(Table 2). Because StrainScan lacks a multi-species mode, its community cost was the sum of 14 runs</w:t>
-      </w:r>
-      <w:r>
-        <w:t xml:space="preserve"> </w:t>
-      </w:r>
-      <w:r>
-        <w:t xml:space="preserve">(100–398 s), versus 1–9 s for one digest-once pass (46–105× faster). StrainScan also failed to build</w:t>
+        <w:t xml:space="preserve">Public WGS cohorts showed three application boundaries. A pregnancy multi-site subset produced 34 strain-cluster calls across five of six libraries, with saliva cluster-rich and longitudinal profiles. Preterm vaginal/meconium libraries produced no strain calls because strain-marker evidence was sparse and panels were incomplete. Preterm-infant stool profiling detected weekly turnover with a generic panel and persistent</w:t>
       </w:r>
       <w:r>
         <w:t xml:space="preserve"> </w:t>
@@ -1260,35 +793,24 @@
           <w:i/>
           <w:iCs/>
         </w:rPr>
-        <w:t xml:space="preserve">Klebsiella pneumoniae</w:t>
-      </w:r>
-      <w:r>
-        <w:t xml:space="preserve"> </w:t>
-      </w:r>
-      <w:r>
-        <w:t xml:space="preserve">in the archived timing run; in the reproducible accuracy rerun, however, StrainScan</w:t>
-      </w:r>
-      <w:r>
-        <w:t xml:space="preserve"> </w:t>
-      </w:r>
-      <w:r>
-        <w:t xml:space="preserve">built and profiled this species. This discrepancy illustrates resource sensitivity. StrainScan build</w:t>
-      </w:r>
-      <w:r>
-        <w:t xml:space="preserve"> </w:t>
-      </w:r>
-      <w:r>
-        <w:t xml:space="preserve">times were obtained under linux/amd64 emulation and are upper bounds.</w:t>
+        <w:t xml:space="preserve">Bifidobacterium bifidum</w:t>
+      </w:r>
+      <w:r>
+        <w:t xml:space="preserve"> </w:t>
+      </w:r>
+      <w:r>
+        <w:t xml:space="preserve">LHCA82 with a cohort-specific panel. Six isolate WGS read sets recovered their expected panel units (6/6), but this was a panel/read compatibility result rather than independent classification.</w:t>
       </w:r>
     </w:p>
-    <w:bookmarkEnd w:id="17"/>
-    <w:bookmarkStart w:id="18" w:name="Xc2a9f63deba7b89c55a9f59954ae2d80dd43fee"/>
+    <w:bookmarkEnd w:id="20"/>
+    <w:bookmarkEnd w:id="21"/>
+    <w:bookmarkStart w:id="22" w:name="comparator-scope"/>
     <w:p>
       <w:pPr>
-        <w:pStyle w:val="Heading5"/>
+        <w:pStyle w:val="Heading4"/>
       </w:pPr>
       <w:r>
-        <w:t xml:space="preserve">Computational scaling on simulated communities (Fig 9)</w:t>
+        <w:t xml:space="preserve">Comparator scope</w:t>
       </w:r>
     </w:p>
     <w:p>
@@ -1296,63 +818,36 @@
         <w:pStyle w:val="FirstParagraph"/>
       </w:pPr>
       <w:r>
-        <w:t xml:space="preserve">For shotgun input, Strain2bScan profiled the</w:t>
-      </w:r>
-      <w:r>
-        <w:t xml:space="preserve"> </w:t>
-      </w:r>
-      <w:r>
-        <w:rPr>
-          <w:i/>
-          <w:iCs/>
-        </w:rPr>
-        <w:t xml:space="preserve">C. acnes</w:t>
-      </w:r>
-      <w:r>
-        <w:t xml:space="preserve"> </w:t>
-      </w:r>
-      <w:r>
-        <w:t xml:space="preserve">panel in 0.86 s and 78 MB per sample, versus 7.06 s</w:t>
-      </w:r>
-      <w:r>
-        <w:t xml:space="preserve"> </w:t>
-      </w:r>
-      <w:r>
-        <w:t xml:space="preserve">and 828 MB for StrainScan, an approximately 8× runtime and 11× memory advantage (Fig 9A). Database build and</w:t>
-      </w:r>
-      <w:r>
-        <w:t xml:space="preserve"> </w:t>
-      </w:r>
-      <w:r>
-        <w:t xml:space="preserve">profiling parallelised to 4.6× and 5.8× speed at 16 threads (Fig 9B). Community profiling was approximately</w:t>
-      </w:r>
-      <w:r>
-        <w:t xml:space="preserve"> </w:t>
-      </w:r>
-      <w:r>
-        <w:t xml:space="preserve">flat in species count: on a 55-species panel, Strain2bScan profiled samples in 2.6–3.1 s. Because StrainScan</w:t>
-      </w:r>
-      <w:r>
-        <w:t xml:space="preserve"> </w:t>
-      </w:r>
-      <w:r>
-        <w:t xml:space="preserve">has no multi-species mode, its projected cost was the measured single-species runtime multiplied by species</w:t>
-      </w:r>
-      <w:r>
-        <w:t xml:space="preserve"> </w:t>
-      </w:r>
-      <w:r>
-        <w:t xml:space="preserve">and sample count; the projected advantage was 121–146× (Fig 9C).</w:t>
+        <w:t xml:space="preserve">The primary executed strain-resolved comparators were StrainScan and inStrain; StrainGST was run separately because it uses StrainGE 0.90-reference databases. StrainPhlAn was not forced into the P/R/F1 framework because it infers strain phylogeny/types rather than cluster abundance calls. Accuracies were therefore compared only within prespecified, tool-specific resolution spaces.</w:t>
       </w:r>
     </w:p>
-    <w:bookmarkEnd w:id="18"/>
-    <w:bookmarkStart w:id="19" w:name="X937e776c51f742224685c4df42b4f0733b180ae"/>
     <w:p>
       <w:pPr>
-        <w:pStyle w:val="Heading5"/>
+        <w:pStyle w:val="BodyText"/>
       </w:pPr>
       <w:r>
-        <w:t xml:space="preserve">Supplementary curated-reference analysis (Supplementary Fig S5)</w:t>
+        <w:rPr>
+          <w:b/>
+          <w:bCs/>
+        </w:rPr>
+        <w:t xml:space="preserve">Conclusion.</w:t>
+      </w:r>
+      <w:r>
+        <w:t xml:space="preserve"> </w:t>
+      </w:r>
+      <w:r>
+        <w:t xml:space="preserve">Together, these benchmarks show that 2bRAD markers retain strain-resolved signal, that native 2bRAD-M remains robust in high-host and low-input settings, and that Strain2bScan extends reduced-representation sequencing to scalable shotgun strain profiling with substantially lower database and profiling cost.</w:t>
+      </w:r>
+    </w:p>
+    <w:bookmarkEnd w:id="22"/>
+    <w:bookmarkEnd w:id="23"/>
+    <w:bookmarkStart w:id="24" w:name="discussion"/>
+    <w:p>
+      <w:pPr>
+        <w:pStyle w:val="Heading2"/>
+      </w:pPr>
+      <w:r>
+        <w:t xml:space="preserve">Discussion</w:t>
       </w:r>
     </w:p>
     <w:p>
@@ -1360,95 +855,43 @@
         <w:pStyle w:val="FirstParagraph"/>
       </w:pPr>
       <w:r>
-        <w:t xml:space="preserve">On StrainScan-curated reference sets [1], both tools reached precision 1.0 for</w:t>
-      </w:r>
-      <w:r>
-        <w:t xml:space="preserve"> </w:t>
-      </w:r>
-      <w:r>
-        <w:rPr>
-          <w:i/>
-          <w:iCs/>
-        </w:rPr>
-        <w:t xml:space="preserve">A. muciniphila</w:t>
-      </w:r>
-      <w:r>
-        <w:t xml:space="preserve"> </w:t>
-      </w:r>
-      <w:r>
-        <w:t xml:space="preserve">and</w:t>
-      </w:r>
-      <w:r>
-        <w:t xml:space="preserve"> </w:t>
-      </w:r>
-      <w:r>
-        <w:rPr>
-          <w:i/>
-          <w:iCs/>
-        </w:rPr>
-        <w:t xml:space="preserve">P. copri</w:t>
-      </w:r>
-      <w:r>
-        <w:t xml:space="preserve"> </w:t>
-      </w:r>
-      <w:r>
-        <w:t xml:space="preserve">(Supplementary Fig S5). Strain2bScan matched or exceeded recall (0.93 versus 0.24 and 0.94</w:t>
-      </w:r>
-      <w:r>
-        <w:t xml:space="preserve"> </w:t>
-      </w:r>
-      <w:r>
-        <w:t xml:space="preserve">versus 0.90), was 17–23×</w:t>
-      </w:r>
-      <w:r>
-        <w:t xml:space="preserve"> </w:t>
-      </w:r>
-      <w:r>
-        <w:t xml:space="preserve">faster and 15–24× lighter, and completed near-clonal</w:t>
-      </w:r>
-      <w:r>
-        <w:t xml:space="preserve"> </w:t>
-      </w:r>
-      <w:r>
-        <w:rPr>
-          <w:i/>
-          <w:iCs/>
-        </w:rPr>
-        <w:t xml:space="preserve">M. tuberculosis</w:t>
-      </w:r>
-      <w:r>
-        <w:t xml:space="preserve"> </w:t>
-      </w:r>
-      <w:r>
-        <w:t xml:space="preserve">in 0.89 s, whereas StrainScan did not</w:t>
-      </w:r>
-      <w:r>
-        <w:t xml:space="preserve"> </w:t>
-      </w:r>
-      <w:r>
-        <w:t xml:space="preserve">complete. Its low</w:t>
-      </w:r>
-      <w:r>
-        <w:t xml:space="preserve"> </w:t>
-      </w:r>
-      <w:r>
-        <w:rPr>
-          <w:i/>
-          <w:iCs/>
-        </w:rPr>
-        <w:t xml:space="preserve">M. tuberculosis</w:t>
-      </w:r>
-      <w:r>
-        <w:t xml:space="preserve"> </w:t>
-      </w:r>
-      <w:r>
-        <w:t xml:space="preserve">recall reflects the resolution limit of a panel that collapses to five</w:t>
-      </w:r>
-      <w:r>
-        <w:t xml:space="preserve"> </w:t>
-      </w:r>
-      <w:r>
-        <w:t xml:space="preserve">0.95-similarity clusters.</w:t>
+        <w:t xml:space="preserve">Strain2bScan couples a sparse 2bRAD marker space to StrainScan-style [1] strain-cluster resolution in a</w:t>
+      </w:r>
+      <w:r>
+        <w:t xml:space="preserve"> </w:t>
+      </w:r>
+      <w:r>
+        <w:t xml:space="preserve">compact Rust implementation. The resulting capability is not another full-k-mer profiler with a faster</w:t>
+      </w:r>
+      <w:r>
+        <w:t xml:space="preserve"> </w:t>
+      </w:r>
+      <w:r>
+        <w:t xml:space="preserve">engine. It is a single marker framework in which native reduction precedes host depletion for low-biomass</w:t>
+      </w:r>
+      <w:r>
+        <w:t xml:space="preserve"> </w:t>
+      </w:r>
+      <w:r>
+        <w:t xml:space="preserve">libraries and one in-silico digest serves every species panel for cohort-scale shotgun analysis. Across the</w:t>
+      </w:r>
+      <w:r>
+        <w:t xml:space="preserve"> </w:t>
+      </w:r>
+      <w:r>
+        <w:t xml:space="preserve">benchmarks, 2bRAD markers preserved genome-wide strain relationships, precision matched StrainScan in</w:t>
+      </w:r>
+      <w:r>
+        <w:t xml:space="preserve"> </w:t>
+      </w:r>
+      <w:r>
+        <w:t xml:space="preserve">completed paired simulations, and the strongest operational gains appeared in database construction,</w:t>
+      </w:r>
+      <w:r>
+        <w:t xml:space="preserve"> </w:t>
+      </w:r>
+      <w:r>
+        <w:t xml:space="preserve">multi-species runtime and retention at 99% host DNA (Figs 2, 7–10).</w:t>
       </w:r>
     </w:p>
     <w:p>
@@ -1456,17 +899,288 @@
         <w:pStyle w:val="BodyText"/>
       </w:pPr>
       <w:r>
-        <w:t xml:space="preserve">These results established computational portability across curated reference sets. The shotgun mode was then stress-tested in ATCC shotgun communities (Fig 10).</w:t>
+        <w:t xml:space="preserve">Native 2bRAD-M addresses the setting in which shotgun coverage is most constrained. Because reduction occurs</w:t>
+      </w:r>
+      <w:r>
+        <w:t xml:space="preserve"> </w:t>
+      </w:r>
+      <w:r>
+        <w:t xml:space="preserve">before host DNA dominates the library, the primary MSA-1002 comparison retained both detection and abundance</w:t>
+      </w:r>
+      <w:r>
+        <w:t xml:space="preserve"> </w:t>
+      </w:r>
+      <w:r>
+        <w:t xml:space="preserve">at 99% human DNA, whereas the tested shotgun profilers lost one or both quantities (Fig 10). The saliva</w:t>
+      </w:r>
+      <w:r>
+        <w:t xml:space="preserve"> </w:t>
+      </w:r>
+      <w:r>
+        <w:t xml:space="preserve">analysis extended this observation from synthetic host ladders to person-specific profiles: strain features</w:t>
+      </w:r>
+      <w:r>
+        <w:t xml:space="preserve"> </w:t>
+      </w:r>
+      <w:r>
+        <w:t xml:space="preserve">identified the subject in every leave-one-timepoint-out test, compared with 78.1% for species features</w:t>
+      </w:r>
+      <w:r>
+        <w:t xml:space="preserve"> </w:t>
+      </w:r>
+      <w:r>
+        <w:t xml:space="preserve">(Fig 5). This is a small within-subject classification result rather than independent strain-identity</w:t>
+      </w:r>
+      <w:r>
+        <w:t xml:space="preserve"> </w:t>
+      </w:r>
+      <w:r>
+        <w:t xml:space="preserve">validation. Its value lies in showing that native libraries carry enough strain-specific structure to</w:t>
+      </w:r>
+      <w:r>
+        <w:t xml:space="preserve"> </w:t>
+      </w:r>
+      <w:r>
+        <w:t xml:space="preserve">support subject-level discrimination, a property that 65/65 concordant shotgun calls and 128–163 additional</w:t>
+      </w:r>
+      <w:r>
+        <w:t xml:space="preserve"> </w:t>
+      </w:r>
+      <w:r>
+        <w:t xml:space="preserve">candidate strain-cluster calls per sample further support on usable paired libraries (Fig 6).</w:t>
       </w:r>
     </w:p>
-    <w:bookmarkEnd w:id="19"/>
-    <w:bookmarkStart w:id="20" w:name="Xbcb50eb89fe21f3b03aedeb13c3a682c59531be"/>
     <w:p>
       <w:pPr>
-        <w:pStyle w:val="Heading5"/>
+        <w:pStyle w:val="BodyText"/>
       </w:pPr>
       <w:r>
-        <w:t xml:space="preserve">DNA mocks: ATCC shotgun communities and comparator stress test (Fig 10)</w:t>
+        <w:t xml:space="preserve">In shotgun mode, the structural advantage is a change in search economics. A sample is digested once and the</w:t>
+      </w:r>
+      <w:r>
+        <w:t xml:space="preserve"> </w:t>
+      </w:r>
+      <w:r>
+        <w:t xml:space="preserve">resulting tags index against all species, so adding species increases panel searches rather than sample</w:t>
+      </w:r>
+      <w:r>
+        <w:t xml:space="preserve"> </w:t>
+      </w:r>
+      <w:r>
+        <w:t xml:space="preserve">k-mer counting. This design produced the 121–146× projected cohort-level advantage on the 55-species</w:t>
+      </w:r>
+      <w:r>
+        <w:t xml:space="preserve"> </w:t>
+      </w:r>
+      <w:r>
+        <w:t xml:space="preserve">analysis and made the marginal cost of community profiling approximately flat in species count (Fig 9).</w:t>
+      </w:r>
+      <w:r>
+        <w:t xml:space="preserve"> </w:t>
+      </w:r>
+      <w:r>
+        <w:t xml:space="preserve">Clean-mock precision depended on input composition and threshold semantics, so the scale claim should be</w:t>
+      </w:r>
+      <w:r>
+        <w:t xml:space="preserve"> </w:t>
+      </w:r>
+      <w:r>
+        <w:t xml:space="preserve">read together with the accuracy and cluster-space conditions in Tables 1–3. The framework’s strongest</w:t>
+      </w:r>
+      <w:r>
+        <w:t xml:space="preserve"> </w:t>
+      </w:r>
+      <w:r>
+        <w:t xml:space="preserve">current position is therefore scalable strain resolution across mixed cohorts, rather than uniform</w:t>
+      </w:r>
+      <w:r>
+        <w:t xml:space="preserve"> </w:t>
+      </w:r>
+      <w:r>
+        <w:t xml:space="preserve">precision superiority on every mock.</w:t>
+      </w:r>
+    </w:p>
+    <w:p>
+      <w:pPr>
+        <w:pStyle w:val="BodyText"/>
+      </w:pPr>
+      <w:r>
+        <w:t xml:space="preserve">The biological unit of the claim is the strain cluster. At a 0.95 similarity cut, diverse species can</w:t>
+      </w:r>
+      <w:r>
+        <w:t xml:space="preserve"> </w:t>
+      </w:r>
+      <w:r>
+        <w:t xml:space="preserve">resolve close to individual genomes, whereas near-clonal populations resolve to fewer clusters. This is an</w:t>
+      </w:r>
+      <w:r>
+        <w:t xml:space="preserve"> </w:t>
+      </w:r>
+      <w:r>
+        <w:t xml:space="preserve">inherent property of short-read evidence shared by StrainScan [1] and Strain2bScan, not a loss introduced by</w:t>
+      </w:r>
+      <w:r>
+        <w:t xml:space="preserve"> </w:t>
+      </w:r>
+      <w:r>
+        <w:t xml:space="preserve">reduced-representation markers. Precision remained high in low-diversity species, while near-clonal recall</w:t>
+      </w:r>
+      <w:r>
+        <w:t xml:space="preserve"> </w:t>
+      </w:r>
+      <w:r>
+        <w:t xml:space="preserve">defined the most important algorithmic boundary (Fig 7). A within-cluster overlap or regression layer that</w:t>
+      </w:r>
+      <w:r>
+        <w:t xml:space="preserve"> </w:t>
+      </w:r>
+      <w:r>
+        <w:t xml:space="preserve">uses read placement after occurrence-based uniqueness would directly test whether near-clonal recall can</w:t>
+      </w:r>
+      <w:r>
+        <w:t xml:space="preserve"> </w:t>
+      </w:r>
+      <w:r>
+        <w:t xml:space="preserve">increase without sacrificing precision.</w:t>
+      </w:r>
+    </w:p>
+    <w:p>
+      <w:pPr>
+        <w:pStyle w:val="BodyText"/>
+      </w:pPr>
+      <w:r>
+        <w:t xml:space="preserve">Panel and reference quality control the transportability of all strain calls. A niche-appropriate,</w:t>
+      </w:r>
+      <w:r>
+        <w:t xml:space="preserve"> </w:t>
+      </w:r>
+      <w:r>
+        <w:t xml:space="preserve">genome-rich oral panel recovered individual-specific structure that a generic pathogen panel did not, and</w:t>
+      </w:r>
+      <w:r>
+        <w:t xml:space="preserve"> </w:t>
+      </w:r>
+      <w:r>
+        <w:t xml:space="preserve">body-site-complete pangenomes are needed before sparse vaginal or meconium marker evidence can support</w:t>
+      </w:r>
+      <w:r>
+        <w:t xml:space="preserve"> </w:t>
+      </w:r>
+      <w:r>
+        <w:t xml:space="preserve">biological absence calls (Tables 4–7). The containment mode addresses incomplete genomes that have a more</w:t>
+      </w:r>
+      <w:r>
+        <w:t xml:space="preserve"> </w:t>
+      </w:r>
+      <w:r>
+        <w:t xml:space="preserve">complete relative, but markers absent from every reference remain unavailable. Broader pangenome panels,</w:t>
+      </w:r>
+      <w:r>
+        <w:t xml:space="preserve"> </w:t>
+      </w:r>
+      <w:r>
+        <w:t xml:space="preserve">completeness-aware gating and explicit absent-strain models are therefore the next tests for open-world</w:t>
+      </w:r>
+      <w:r>
+        <w:t xml:space="preserve"> </w:t>
+      </w:r>
+      <w:r>
+        <w:t xml:space="preserve">surveillance rather than optional engineering refinements.</w:t>
+      </w:r>
+    </w:p>
+    <w:p>
+      <w:pPr>
+        <w:pStyle w:val="BodyText"/>
+      </w:pPr>
+      <w:r>
+        <w:t xml:space="preserve">The comparator scope is also explicit. StrainScan [1] and inStrain [8] were executed on the frozen shotgun</w:t>
+      </w:r>
+      <w:r>
+        <w:t xml:space="preserve"> </w:t>
+      </w:r>
+      <w:r>
+        <w:t xml:space="preserve">benchmarks, whereas StrainGST [2] was rerun in StrainGE’s 0.90-reference space and reported separately</w:t>
+      </w:r>
+      <w:r>
+        <w:t xml:space="preserve"> </w:t>
+      </w:r>
+      <w:r>
+        <w:t xml:space="preserve">because those calls cannot be pooled with 0.95-space Strain2bScan or StrainScan metrics (Tables 8–9). This</w:t>
+      </w:r>
+      <w:r>
+        <w:t xml:space="preserve"> </w:t>
+      </w:r>
+      <w:r>
+        <w:t xml:space="preserve">rerun covered the primary simulations and ATCC shotgun mocks, but native BcgI input for StrainGE, StrainGR</w:t>
+      </w:r>
+      <w:r>
+        <w:t xml:space="preserve"> </w:t>
+      </w:r>
+      <w:r>
+        <w:t xml:space="preserve">and the supplementary curated-database subset remain untested. The comparison therefore establishes cost and</w:t>
+      </w:r>
+      <w:r>
+        <w:t xml:space="preserve"> </w:t>
+      </w:r>
+      <w:r>
+        <w:t xml:space="preserve">feasibility boundaries for the tested StrainGST workflow without claiming equivalence to the full StrainGE</w:t>
+      </w:r>
+      <w:r>
+        <w:t xml:space="preserve"> </w:t>
+      </w:r>
+      <w:r>
+        <w:t xml:space="preserve">family.</w:t>
+      </w:r>
+    </w:p>
+    <w:p>
+      <w:pPr>
+        <w:pStyle w:val="BodyText"/>
+      </w:pPr>
+      <w:r>
+        <w:t xml:space="preserve">Two applications follow directly from the evidence. Native 2bRAD-M is appropriate when host content, input</w:t>
+      </w:r>
+      <w:r>
+        <w:t xml:space="preserve"> </w:t>
+      </w:r>
+      <w:r>
+        <w:t xml:space="preserve">mass or degradation limits shotgun recovery, with tumour, FFPE and skin as priority targets that remain to</w:t>
+      </w:r>
+      <w:r>
+        <w:t xml:space="preserve"> </w:t>
+      </w:r>
+      <w:r>
+        <w:t xml:space="preserve">be tested. In-silico digestion is appropriate for large shotgun cohorts in which repeated per-species</w:t>
+      </w:r>
+      <w:r>
+        <w:t xml:space="preserve"> </w:t>
+      </w:r>
+      <w:r>
+        <w:t xml:space="preserve">k-mer searches dominate cost. Resolving those two regimes in one marker space turns reduced-representation</w:t>
+      </w:r>
+      <w:r>
+        <w:t xml:space="preserve"> </w:t>
+      </w:r>
+      <w:r>
+        <w:t xml:space="preserve">sequencing from a species-profile protocol into a practical route to strain-resolved microbiome analysis.</w:t>
+      </w:r>
+    </w:p>
+    <w:bookmarkEnd w:id="24"/>
+    <w:bookmarkStart w:id="35" w:name="methods"/>
+    <w:p>
+      <w:pPr>
+        <w:pStyle w:val="Heading2"/>
+      </w:pPr>
+      <w:r>
+        <w:t xml:space="preserve">Methods</w:t>
+      </w:r>
+    </w:p>
+    <w:bookmarkStart w:id="25" w:name="overview"/>
+    <w:p>
+      <w:pPr>
+        <w:pStyle w:val="Heading3"/>
+      </w:pPr>
+      <w:r>
+        <w:t xml:space="preserve">Overview</w:t>
       </w:r>
     </w:p>
     <w:p>
@@ -1474,109 +1188,84 @@
         <w:pStyle w:val="FirstParagraph"/>
       </w:pPr>
       <w:r>
-        <w:t xml:space="preserve">We compared Strain2bScan, StrainScan v1.0.14 [1] and inStrain 1.9.1 [8] on shotgun reads from the same</w:t>
-      </w:r>
-      <w:r>
-        <w:t xml:space="preserve"> </w:t>
-      </w:r>
-      <w:r>
-        <w:t xml:space="preserve">four ATCC mocks. Strain2bScan used the all-enzyme 164-genome tree; StrainScan used per-species databases;</w:t>
-      </w:r>
-      <w:r>
-        <w:t xml:space="preserve"> </w:t>
-      </w:r>
-      <w:r>
-        <w:t xml:space="preserve">inStrain used a dereplicated 98%-ANI reference, as its documentation requires. Each tool was scored in its own</w:t>
-      </w:r>
-      <w:r>
-        <w:t xml:space="preserve"> </w:t>
-      </w:r>
-      <w:r>
-        <w:t xml:space="preserve">0.95-similarity cluster space. StrainScan and inStrain were therefore the executed strain-resolved</w:t>
-      </w:r>
-      <w:r>
-        <w:t xml:space="preserve"> </w:t>
-      </w:r>
-      <w:r>
-        <w:t xml:space="preserve">comparators. A supplementary StrainGST rerun [2] was added separately because it uses StrainGE-specific</w:t>
-      </w:r>
-      <w:r>
-        <w:t xml:space="preserve"> </w:t>
-      </w:r>
-      <w:r>
-        <w:t xml:space="preserve">0.90-reference databases and was not part of the frozen primary configuration; StrainGR was not run</w:t>
-      </w:r>
-      <w:r>
-        <w:t xml:space="preserve"> </w:t>
-      </w:r>
-      <w:r>
-        <w:t xml:space="preserve">(Tables 8–9).</w:t>
+        <w:t xml:space="preserve">Strain2bScan reimplements the two-layer StrainScan strategy [1]; cluster near-identical strains,</w:t>
+      </w:r>
+      <w:r>
+        <w:t xml:space="preserve"> </w:t>
+      </w:r>
+      <w:r>
+        <w:t xml:space="preserve">then score samples on markers unique to a strain or cluster; but replaces the full k-mer set</w:t>
+      </w:r>
+      <w:r>
+        <w:t xml:space="preserve"> </w:t>
+      </w:r>
+      <w:r>
+        <w:t xml:space="preserve">with</w:t>
+      </w:r>
+      <w:r>
+        <w:t xml:space="preserve"> </w:t>
+      </w:r>
+      <w:r>
+        <w:rPr>
+          <w:b/>
+          <w:bCs/>
+        </w:rPr>
+        <w:t xml:space="preserve">2bRAD tags</w:t>
+      </w:r>
+      <w:r>
+        <w:t xml:space="preserve">, and implemented in Rust for speed and parallelism. The primary benchmark used the dependency-free release</w:t>
+      </w:r>
+      <w:r>
+        <w:t xml:space="preserve"> </w:t>
+      </w:r>
+      <w:r>
+        <w:rPr>
+          <w:rStyle w:val="VerbatimChar"/>
+        </w:rPr>
+        <w:t xml:space="preserve">benchmark-v0.1.0-f26f234</w:t>
+      </w:r>
+      <w:r>
+        <w:t xml:space="preserve">; later development versions are not part of that frozen configuration. The</w:t>
+      </w:r>
+      <w:r>
+        <w:t xml:space="preserve"> </w:t>
+      </w:r>
+      <w:r>
+        <w:t xml:space="preserve">pipeline is: (i) digest reference genomes and sample reads into 2bRAD-tag markers; (ii) build,</w:t>
+      </w:r>
+      <w:r>
+        <w:t xml:space="preserve"> </w:t>
+      </w:r>
+      <w:r>
+        <w:t xml:space="preserve">per species, a within-species cluster database annotated with unique markers; (iii) profile a</w:t>
+      </w:r>
+      <w:r>
+        <w:t xml:space="preserve"> </w:t>
+      </w:r>
+      <w:r>
+        <w:t xml:space="preserve">sample by detecting present clusters from their unique markers and estimating their abundance;</w:t>
+      </w:r>
+      <w:r>
+        <w:t xml:space="preserve"> </w:t>
+      </w:r>
+      <w:r>
+        <w:t xml:space="preserve">(iv) at the community level, digest each sample once and match it against every per-species</w:t>
+      </w:r>
+      <w:r>
+        <w:t xml:space="preserve"> </w:t>
+      </w:r>
+      <w:r>
+        <w:t xml:space="preserve">database, gated by a species-level Layer-1 check.</w:t>
       </w:r>
     </w:p>
+    <w:bookmarkEnd w:id="25"/>
+    <w:bookmarkStart w:id="26" w:name="brad-tag-extraction"/>
     <w:p>
       <w:pPr>
-        <w:pStyle w:val="BodyText"/>
+        <w:pStyle w:val="Heading3"/>
       </w:pPr>
       <w:r>
-        <w:t xml:space="preserve">At the primary 10⁻⁴ threshold, each tool scored well on the MSA-1002 0%-host sample. The tools then</w:t>
-      </w:r>
-      <w:r>
-        <w:t xml:space="preserve"> </w:t>
-      </w:r>
-      <w:r>
-        <w:t xml:space="preserve">separated under host contamination. Strain2bScan retained F1 = 1.0 at 90, 95 and 99% human DNA; Bray–Curtis</w:t>
-      </w:r>
-      <w:r>
-        <w:t xml:space="preserve"> </w:t>
-      </w:r>
-      <w:r>
-        <w:t xml:space="preserve">similarity was 0.777, 0.772 and 0.698, and L2 similarity was at least 0.839. At 99% host, StrainScan had F1</w:t>
-      </w:r>
-      <w:r>
-        <w:t xml:space="preserve"> </w:t>
-      </w:r>
-      <w:r>
-        <w:t xml:space="preserve">= 0.095 because thresholded recall collapsed to 0.05 and its abundance diverged (Bray–Curtis similarity</w:t>
-      </w:r>
-      <w:r>
-        <w:t xml:space="preserve"> </w:t>
-      </w:r>
-      <w:r>
-        <w:t xml:space="preserve">0.026); inStrain had F1 = 0.333 because recall fell to 0.20. In this primary comparison, Strain2bScan was</w:t>
-      </w:r>
-      <w:r>
-        <w:t xml:space="preserve"> </w:t>
-      </w:r>
-      <w:r>
-        <w:t xml:space="preserve">the only tested tool that retained both strain detection and abundance at 99% host. Clean-mock thresholded precision varied by input composition. On MSA-1003, Strain2bScan had F1 at 1e-4 = 0.909, 1.0, 1.0 and Bray–Curtis similarity</w:t>
-      </w:r>
-      <w:r>
-        <w:t xml:space="preserve"> </w:t>
-      </w:r>
-      <w:r>
-        <w:t xml:space="preserve">0.773–0.780. On MSA-1005/1007 it retained full recall and AUPR = 1.0, but F1 was 0.60–0.75 because many</w:t>
-      </w:r>
-      <w:r>
-        <w:t xml:space="preserve"> </w:t>
-      </w:r>
-      <w:r>
-        <w:t xml:space="preserve">abundance-negligible clusters crossed the threshold; StrainScan had higher thresholded precision on those</w:t>
-      </w:r>
-      <w:r>
-        <w:t xml:space="preserve"> </w:t>
-      </w:r>
-      <w:r>
-        <w:t xml:space="preserve">two mocks. Host retention and clean-mock precision therefore represent distinct performance axes.</w:t>
-      </w:r>
-    </w:p>
-    <w:bookmarkEnd w:id="20"/>
-    <w:bookmarkStart w:id="21" w:name="Xecfb8a4c0e07ae178ddc9ac081dbf192012bb93"/>
-    <w:p>
-      <w:pPr>
-        <w:pStyle w:val="Heading5"/>
-      </w:pPr>
-      <w:r>
-        <w:t xml:space="preserve">Real metagenomes: pregnancy, low-biomass and infant-gut cohorts (Tables 4–6)</w:t>
+        <w:t xml:space="preserve">2bRAD tag extraction</w:t>
       </w:r>
     </w:p>
     <w:p>
@@ -1584,1295 +1273,245 @@
         <w:pStyle w:val="FirstParagraph"/>
       </w:pPr>
       <w:r>
-        <w:t xml:space="preserve">To test feasibility on public human metagenomes, we profiled representative WGS subsets from PRJNA288562,</w:t>
-      </w:r>
-      <w:r>
-        <w:t xml:space="preserve"> </w:t>
-      </w:r>
-      <w:r>
-        <w:t xml:space="preserve">PRJNA1517970, PRJNA1191223 and PRJNA1191225. These were application-oriented subsets, not complete</w:t>
-      </w:r>
-      <w:r>
-        <w:t xml:space="preserve"> </w:t>
-      </w:r>
-      <w:r>
-        <w:t xml:space="preserve">epidemiological cohorts. Twenty-two libraries profiled against a legacy 20-species MSA panel completed in</w:t>
-      </w:r>
-      <w:r>
-        <w:t xml:space="preserve"> </w:t>
-      </w:r>
-      <w:r>
-        <w:t xml:space="preserve">100.6 s with 343 MiB peak RSS (4.57 s per sample).</w:t>
-      </w:r>
-    </w:p>
-    <w:p>
-      <w:pPr>
-        <w:pStyle w:val="BodyText"/>
-      </w:pPr>
-      <w:r>
-        <w:t xml:space="preserve">In PRJNA288562, one pregnancy subject had saliva, vaginal and distal-gut WGS at two gestational ages. Five</w:t>
-      </w:r>
-      <w:r>
-        <w:t xml:space="preserve"> </w:t>
-      </w:r>
-      <w:r>
-        <w:t xml:space="preserve">of six libraries produced 34 strain-cluster calls across six panel species. Saliva was cluster-rich (13 and</w:t>
-      </w:r>
-      <w:r>
-        <w:t xml:space="preserve"> </w:t>
-      </w:r>
-      <w:r>
-        <w:t xml:space="preserve">11 calls at the two timepoints), whereas vaginal signal was sparse and gut calls changed over time. Four</w:t>
-      </w:r>
-      <w:r>
-        <w:t xml:space="preserve"> </w:t>
+        <w:t xml:space="preserve">Type-IIB restriction enzymes cut on both sides of their recognition site, releasing a</w:t>
+      </w:r>
+      <w:r>
+        <w:t xml:space="preserve"> </w:t>
+      </w:r>
+      <w:r>
+        <w:t xml:space="preserve">fixed-length fragment (the 2bRAD tag, 25–33 bp depending on enzyme). Each of the 16 enzymes in</w:t>
+      </w:r>
+      <w:r>
+        <w:t xml:space="preserve"> </w:t>
+      </w:r>
+      <w:r>
+        <w:t xml:space="preserve">the Fast2bRAD-M table [7] is modelled as a set of anchored sequence patterns; literal motifs at</w:t>
+      </w:r>
+      <w:r>
+        <w:t xml:space="preserve"> </w:t>
+      </w:r>
+      <w:r>
+        <w:t xml:space="preserve">fixed offsets within the tag window, plus, for the three IUPAC-degenerate enzymes (BaeI, HaeIV,</w:t>
+      </w:r>
+      <w:r>
+        <w:t xml:space="preserve"> </w:t>
+      </w:r>
+      <w:r>
+        <w:t xml:space="preserve">Hin4I), single positions restricted to a base class; unanchored positions are unconstrained but</w:t>
+      </w:r>
+      <w:r>
+        <w:t xml:space="preserve"> </w:t>
+      </w:r>
+      <w:r>
+        <w:t xml:space="preserve">must be A/C/G/T, which excludes tags spanning ambiguity codes. Scanning every offset and testing</w:t>
+      </w:r>
+      <w:r>
+        <w:t xml:space="preserve"> </w:t>
+      </w:r>
+      <w:r>
+        <w:t xml:space="preserve">the anchors reproduces the enzyme’s digestion sites. Only the forward strand is scanned: each</w:t>
+      </w:r>
+      <w:r>
+        <w:t xml:space="preserve"> </w:t>
+      </w:r>
+      <w:r>
+        <w:t xml:space="preserve">enzyme carries forward and reverse patterns that are exact reverse-complement pairs at its tag</w:t>
+      </w:r>
+      <w:r>
+        <w:t xml:space="preserve"> </w:t>
+      </w:r>
+      <w:r>
+        <w:t xml:space="preserve">length (the palindromic enzymes BplI, FalI and AlfI carry a single self-complementary pattern),</w:t>
+      </w:r>
+      <w:r>
+        <w:t xml:space="preserve"> </w:t>
+      </w:r>
+      <w:r>
+        <w:t xml:space="preserve">so one pass finds sites in either orientation. Digestion is therefore strand-invariant (digest(</w:t>
       </w:r>
       <w:r>
         <w:rPr>
           <w:i/>
           <w:iCs/>
         </w:rPr>
-        <w:t xml:space="preserve">Neisseria</w:t>
-      </w:r>
-      <w:r>
-        <w:t xml:space="preserve"> </w:t>
-      </w:r>
-      <w:r>
-        <w:t xml:space="preserve">and four</w:t>
-      </w:r>
-      <w:r>
-        <w:t xml:space="preserve"> </w:t>
+        <w:t xml:space="preserve">S</w:t>
+      </w:r>
+      <w:r>
+        <w:t xml:space="preserve">) = digest(revcomp(</w:t>
       </w:r>
       <w:r>
         <w:rPr>
           <w:i/>
           <w:iCs/>
         </w:rPr>
-        <w:t xml:space="preserve">Schaalia</w:t>
-      </w:r>
-      <w:r>
-        <w:t xml:space="preserve"> </w:t>
-      </w:r>
-      <w:r>
-        <w:t xml:space="preserve">clusters were shared between early and late saliva; a gut</w:t>
-      </w:r>
-      <w:r>
-        <w:t xml:space="preserve"> </w:t>
+        <w:t xml:space="preserve">S</w:t>
+      </w:r>
+      <w:r>
+        <w:t xml:space="preserve">))) without scanning both strands and without doubling the</w:t>
+      </w:r>
+      <w:r>
+        <w:t xml:space="preserve"> </w:t>
+      </w:r>
+      <w:r>
+        <w:t xml:space="preserve">marker set; this is asserted for every enzyme by a regression test. Each tag is canonicalised (the lexicographically smaller of</w:t>
+      </w:r>
+      <w:r>
+        <w:t xml:space="preserve"> </w:t>
+      </w:r>
+      <w:r>
+        <w:t xml:space="preserve">the tag and its reverse complement) and hashed to a 64-bit integer marker (FNV-1a; genome and</w:t>
+      </w:r>
+      <w:r>
+        <w:t xml:space="preserve"> </w:t>
+      </w:r>
+      <w:r>
+        <w:t xml:space="preserve">sample tags use the same hash, so marker values are internally consistent). Two input modes</w:t>
+      </w:r>
+      <w:r>
+        <w:t xml:space="preserve"> </w:t>
+      </w:r>
+      <w:r>
+        <w:t xml:space="preserve">are supported:</w:t>
+      </w:r>
+      <w:r>
+        <w:t xml:space="preserve"> </w:t>
+      </w:r>
+      <w:r>
+        <w:rPr>
+          <w:b/>
+          <w:bCs/>
+        </w:rPr>
+        <w:t xml:space="preserve">BcgI only</w:t>
+      </w:r>
+      <w:r>
+        <w:t xml:space="preserve"> </w:t>
+      </w:r>
+      <w:r>
+        <w:t xml:space="preserve">for 2bRAD experimental libraries whose reads already are tags, or</w:t>
+      </w:r>
+      <w:r>
+        <w:t xml:space="preserve"> </w:t>
+      </w:r>
+      <w:r>
+        <w:t xml:space="preserve">a user-chosen enzyme set (</w:t>
+      </w:r>
+      <w:r>
+        <w:rPr>
+          <w:rStyle w:val="VerbatimChar"/>
+        </w:rPr>
+        <w:t xml:space="preserve">--enzyme all</w:t>
+      </w:r>
+      <w:r>
+        <w:t xml:space="preserve"> </w:t>
+      </w:r>
+      <w:r>
+        <w:t xml:space="preserve">for all 16) for in-silico digestion of conventional</w:t>
+      </w:r>
+      <w:r>
+        <w:t xml:space="preserve"> </w:t>
+      </w:r>
+      <w:r>
+        <w:t xml:space="preserve">shotgun reads, which enriches the marker set ~</w:t>
       </w:r>
       <w:r>
         <w:rPr>
           <w:i/>
           <w:iCs/>
         </w:rPr>
-        <w:t xml:space="preserve">Bifidobacterium</w:t>
+        <w:t xml:space="preserve">n</w:t>
+      </w:r>
+      <w:r>
+        <w:t xml:space="preserve">-fold for</w:t>
+      </w:r>
+      <w:r>
+        <w:t xml:space="preserve"> </w:t>
       </w:r>
       <w:r>
         <w:rPr>
           <w:i/>
           <w:iCs/>
         </w:rPr>
-        <w:t xml:space="preserve"> </w:t>
-      </w:r>
-      <w:r>
-        <w:rPr>
-          <w:i/>
-          <w:iCs/>
-        </w:rPr>
-        <w:t xml:space="preserve">adolescentis</w:t>
-      </w:r>
-      <w:r>
-        <w:t xml:space="preserve"> </w:t>
-      </w:r>
-      <w:r>
-        <w:t xml:space="preserve">cluster persisted, while other</w:t>
-      </w:r>
-      <w:r>
-        <w:t xml:space="preserve"> </w:t>
-      </w:r>
-      <w:r>
-        <w:rPr>
-          <w:i/>
-          <w:iCs/>
-        </w:rPr>
-        <w:t xml:space="preserve">Bifidobacterium</w:t>
-      </w:r>
-      <w:r>
-        <w:t xml:space="preserve"> </w:t>
-      </w:r>
-      <w:r>
-        <w:t xml:space="preserve">and</w:t>
-      </w:r>
-      <w:r>
-        <w:t xml:space="preserve"> </w:t>
-      </w:r>
-      <w:r>
-        <w:rPr>
-          <w:i/>
-          <w:iCs/>
-        </w:rPr>
-        <w:t xml:space="preserve">E. coli</w:t>
-      </w:r>
-      <w:r>
-        <w:t xml:space="preserve"> </w:t>
-      </w:r>
-      <w:r>
-        <w:t xml:space="preserve">clusters were detected only</w:t>
-      </w:r>
-      <w:r>
-        <w:t xml:space="preserve"> </w:t>
-      </w:r>
-      <w:r>
-        <w:t xml:space="preserve">early (Table 4).</w:t>
-      </w:r>
-    </w:p>
-    <w:p>
-      <w:pPr>
-        <w:pStyle w:val="BodyText"/>
-      </w:pPr>
-      <w:r>
-        <w:t xml:space="preserve">PRJNA1517970 tested vaginal and meconium libraries plus one extraction blank. Neither the generic panel nor</w:t>
-      </w:r>
-      <w:r>
-        <w:t xml:space="preserve"> </w:t>
-      </w:r>
-      <w:r>
-        <w:t xml:space="preserve">a newly built 13-species body-site panel produced a strain call. The blank yielded 340 distinct markers,</w:t>
-      </w:r>
-      <w:r>
-        <w:t xml:space="preserve"> </w:t>
-      </w:r>
-      <w:r>
-        <w:t xml:space="preserve">whereas selected vaginal and meconium libraries yielded 7,394–86,980; a one-marker diagnostic gate found only</w:t>
-      </w:r>
-      <w:r>
-        <w:t xml:space="preserve"> </w:t>
-      </w:r>
-      <w:r>
-        <w:t xml:space="preserve">three</w:t>
-      </w:r>
-      <w:r>
-        <w:t xml:space="preserve"> </w:t>
-      </w:r>
-      <w:r>
-        <w:rPr>
-          <w:i/>
-          <w:iCs/>
-        </w:rPr>
-        <w:t xml:space="preserve">C. acnes</w:t>
-      </w:r>
-      <w:r>
-        <w:t xml:space="preserve"> </w:t>
-      </w:r>
-      <w:r>
-        <w:t xml:space="preserve">markers in the largest meconium library. The result localised the constraint to sparse strain-marker evidence and incomplete niche coverage rather than runtime: even the largest library provided only three markers for a candidate species, far below any strain-resolution gate, and the blank supported specificity at low marker input. These low-biomass cohorts require body-site-complete</w:t>
-      </w:r>
-      <w:r>
-        <w:t xml:space="preserve"> </w:t>
-      </w:r>
-      <w:r>
-        <w:t xml:space="preserve">pangenome panels and deeper marker coverage before absence calls can be interpreted biologically.</w:t>
-      </w:r>
-    </w:p>
-    <w:p>
-      <w:pPr>
-        <w:pStyle w:val="BodyText"/>
-      </w:pPr>
-      <w:r>
-        <w:t xml:space="preserve">For direct gut tracking, we assembled six public isolates from PRJNA1191225 (three</w:t>
-      </w:r>
-      <w:r>
-        <w:t xml:space="preserve"> </w:t>
-      </w:r>
-      <w:r>
-        <w:rPr>
-          <w:i/>
-          <w:iCs/>
-        </w:rPr>
-        <w:t xml:space="preserve">E. coli</w:t>
-      </w:r>
-      <w:r>
-        <w:t xml:space="preserve">, one</w:t>
-      </w:r>
-      <w:r>
-        <w:t xml:space="preserve"> </w:t>
-      </w:r>
-      <w:r>
-        <w:rPr>
-          <w:i/>
-          <w:iCs/>
-        </w:rPr>
-        <w:t xml:space="preserve">B. longum</w:t>
-      </w:r>
-      <w:r>
-        <w:t xml:space="preserve">, one</w:t>
-      </w:r>
-      <w:r>
-        <w:t xml:space="preserve"> </w:t>
-      </w:r>
-      <w:r>
-        <w:rPr>
-          <w:i/>
-          <w:iCs/>
-        </w:rPr>
-        <w:t xml:space="preserve">B. breve</w:t>
-      </w:r>
-      <w:r>
-        <w:t xml:space="preserve"> </w:t>
-      </w:r>
-      <w:r>
-        <w:t xml:space="preserve">and one</w:t>
-      </w:r>
-      <w:r>
-        <w:t xml:space="preserve"> </w:t>
-      </w:r>
-      <w:r>
-        <w:rPr>
-          <w:i/>
-          <w:iCs/>
-        </w:rPr>
-        <w:t xml:space="preserve">B. bifidum</w:t>
-      </w:r>
-      <w:r>
-        <w:t xml:space="preserve">) and built a cohort-specific panel. All six isolate read</w:t>
-      </w:r>
-      <w:r>
-        <w:t xml:space="preserve"> </w:t>
-      </w:r>
-      <w:r>
-        <w:t xml:space="preserve">sets produced their expected panel unit (6/6 panel/read compatibility result) with breadth 0.9995–1.0, depth</w:t>
-      </w:r>
-      <w:r>
-        <w:t xml:space="preserve"> </w:t>
-      </w:r>
-      <w:r>
-        <w:t xml:space="preserve">9.8–25.6× and within-species abundance 0.80–0.96; profiling took 9.53 s and 55.7 MiB (Table 5). Because the</w:t>
-      </w:r>
-      <w:r>
-        <w:t xml:space="preserve"> </w:t>
-      </w:r>
-      <w:r>
-        <w:t xml:space="preserve">same reads generated the assemblies and the panel, this was a compatibility check rather than an independent</w:t>
-      </w:r>
-      <w:r>
-        <w:t xml:space="preserve"> </w:t>
-      </w:r>
-      <w:r>
-        <w:t xml:space="preserve">classification benchmark.</w:t>
-      </w:r>
-    </w:p>
-    <w:p>
-      <w:pPr>
-        <w:pStyle w:val="BodyText"/>
-      </w:pPr>
-      <w:r>
-        <w:t xml:space="preserve">Reprofiling preterm-infant P08 across weeks 1–3 with the cohort panel detected a persistent</w:t>
-      </w:r>
-      <w:r>
-        <w:t xml:space="preserve"> </w:t>
-      </w:r>
-      <w:r>
-        <w:rPr>
-          <w:i/>
-          <w:iCs/>
-        </w:rPr>
-        <w:t xml:space="preserve">Bifidobacterium bifidum</w:t>
-      </w:r>
-      <w:r>
-        <w:t xml:space="preserve"> </w:t>
-      </w:r>
-      <w:r>
-        <w:t xml:space="preserve">LHCA82 strain-resolved cluster (breadth 0.764/0.773/0.792; depth 237×/214×/238×;</w:t>
-      </w:r>
-      <w:r>
-        <w:t xml:space="preserve"> </w:t>
-      </w:r>
-      <w:r>
-        <w:t xml:space="preserve">within-panel abundance 64.6%/58.3%/61.0%).</w:t>
-      </w:r>
-      <w:r>
-        <w:t xml:space="preserve"> </w:t>
-      </w:r>
-      <w:r>
-        <w:rPr>
-          <w:i/>
-          <w:iCs/>
-        </w:rPr>
-        <w:t xml:space="preserve">E. coli</w:t>
-      </w:r>
-      <w:r>
-        <w:t xml:space="preserve"> </w:t>
-      </w:r>
-      <w:r>
-        <w:t xml:space="preserve">was detected only in week 2 at 0.029× depth and sample</w:t>
-      </w:r>
-      <w:r>
-        <w:t xml:space="preserve"> </w:t>
-      </w:r>
-      <w:r>
-        <w:t xml:space="preserve">fraction 1.40 × 10⁻⁴; because coverage did not distinguish the three study isolates, the tool conservatively</w:t>
-      </w:r>
-      <w:r>
-        <w:t xml:space="preserve"> </w:t>
-      </w:r>
-      <w:r>
-        <w:t xml:space="preserve">reported the merged unit</w:t>
-      </w:r>
-      <w:r>
-        <w:t xml:space="preserve"> </w:t>
-      </w:r>
-      <w:r>
-        <w:rPr>
-          <w:rStyle w:val="VerbatimChar"/>
-        </w:rPr>
-        <w:t xml:space="preserve">C0|C1|C2</w:t>
-      </w:r>
-      <w:r>
-        <w:t xml:space="preserve">. The generic MSA panel detected the week-2</w:t>
-      </w:r>
-      <w:r>
-        <w:t xml:space="preserve"> </w:t>
-      </w:r>
-      <w:r>
-        <w:rPr>
-          <w:i/>
-          <w:iCs/>
-        </w:rPr>
-        <w:t xml:space="preserve">E. coli</w:t>
-      </w:r>
-      <w:r>
-        <w:t xml:space="preserve"> </w:t>
-      </w:r>
-      <w:r>
-        <w:t xml:space="preserve">signal but lacked</w:t>
-      </w:r>
-      <w:r>
-        <w:t xml:space="preserve"> </w:t>
-      </w:r>
-      <w:r>
-        <w:t xml:space="preserve">the cohort-specific</w:t>
-      </w:r>
-      <w:r>
-        <w:t xml:space="preserve"> </w:t>
-      </w:r>
-      <w:r>
-        <w:rPr>
-          <w:i/>
-          <w:iCs/>
-        </w:rPr>
-        <w:t xml:space="preserve">B. bifidum</w:t>
-      </w:r>
-      <w:r>
-        <w:t xml:space="preserve"> </w:t>
-      </w:r>
-      <w:r>
-        <w:t xml:space="preserve">reference. Because the panel and metagenomes came from the same cohort and</w:t>
-      </w:r>
-      <w:r>
-        <w:t xml:space="preserve"> </w:t>
-      </w:r>
-      <w:r>
-        <w:t xml:space="preserve">no independent strain truth was available, these are within-panel longitudinal observations. Leave-one-</w:t>
-      </w:r>
-      <w:r>
-        <w:t xml:space="preserve"> </w:t>
-      </w:r>
-      <w:r>
-        <w:t xml:space="preserve">isolate-out</w:t>
-      </w:r>
-      <w:r>
-        <w:t xml:space="preserve"> </w:t>
-      </w:r>
-      <w:r>
-        <w:rPr>
-          <w:i/>
-          <w:iCs/>
-        </w:rPr>
-        <w:t xml:space="preserve">E. coli</w:t>
-      </w:r>
-      <w:r>
-        <w:t xml:space="preserve"> </w:t>
-      </w:r>
-      <w:r>
-        <w:t xml:space="preserve">tests reinforced this boundary: reads from an absent isolate covered the remaining</w:t>
-      </w:r>
-      <w:r>
-        <w:t xml:space="preserve"> </w:t>
-      </w:r>
-      <w:r>
-        <w:t xml:space="preserve">relatives broadly (0.799–0.911) and were reported as merged</w:t>
-      </w:r>
-      <w:r>
-        <w:t xml:space="preserve"> </w:t>
-      </w:r>
-      <w:r>
-        <w:rPr>
-          <w:rStyle w:val="VerbatimChar"/>
-        </w:rPr>
-        <w:t xml:space="preserve">C0|C1</w:t>
-      </w:r>
-      <w:r>
-        <w:t xml:space="preserve"> </w:t>
-      </w:r>
-      <w:r>
-        <w:t xml:space="preserve">rather than creating a false third</w:t>
-      </w:r>
-      <w:r>
-        <w:t xml:space="preserve"> </w:t>
-      </w:r>
-      <w:r>
-        <w:t xml:space="preserve">cluster. Thus, closed panels can misassign conspecific signal, and absence of a true strain cannot be</w:t>
-      </w:r>
-      <w:r>
-        <w:t xml:space="preserve"> </w:t>
-      </w:r>
-      <w:r>
-        <w:t xml:space="preserve">inferred from a nearest-relative call (Table 7).</w:t>
-      </w:r>
-    </w:p>
-    <w:bookmarkEnd w:id="21"/>
-    <w:bookmarkEnd w:id="22"/>
-    <w:bookmarkStart w:id="23" w:name="comparator-scope"/>
-    <w:p>
-      <w:pPr>
-        <w:pStyle w:val="Heading4"/>
-      </w:pPr>
-      <w:r>
-        <w:t xml:space="preserve">Comparator scope</w:t>
-      </w:r>
-    </w:p>
-    <w:p>
-      <w:pPr>
-        <w:pStyle w:val="FirstParagraph"/>
-      </w:pPr>
-      <w:r>
-        <w:t xml:space="preserve">The primary strain-resolved comparisons used StrainScan [1] and inStrain [8] because both operate directly</w:t>
-      </w:r>
-      <w:r>
-        <w:t xml:space="preserve"> </w:t>
-      </w:r>
-      <w:r>
-        <w:t xml:space="preserve">on the frozen shotgun benchmark reads and could be scored under the frozen cluster-space or read-level</w:t>
-      </w:r>
-      <w:r>
-        <w:t xml:space="preserve"> </w:t>
-      </w:r>
-      <w:r>
-        <w:t xml:space="preserve">workflow. StrainScan is the closest methodological comparator because it uses reference-guided</w:t>
-      </w:r>
-      <w:r>
-        <w:t xml:space="preserve"> </w:t>
-      </w:r>
-      <w:r>
-        <w:t xml:space="preserve">strain-cluster resolution. inStrain represents widely used read-level shotgun profiling. A supplementary</w:t>
-      </w:r>
-      <w:r>
-        <w:t xml:space="preserve"> </w:t>
-      </w:r>
-      <w:r>
-        <w:t xml:space="preserve">StrainGST rerun covers the related reference-guided StrainGE workflow [2]; because StrainGE’s documented</w:t>
-      </w:r>
-      <w:r>
-        <w:t xml:space="preserve"> </w:t>
-      </w:r>
-      <w:r>
-        <w:t xml:space="preserve">input is WMS rather than native BcgI 2bRAD, and StrainGR variant calling was not run, this rerun is</w:t>
-      </w:r>
-      <w:r>
-        <w:t xml:space="preserve"> </w:t>
-      </w:r>
-      <w:r>
-        <w:t xml:space="preserve">reported separately rather than pooled with the primary same-assay comparisons (Table 8).</w:t>
-      </w:r>
-    </w:p>
-    <w:bookmarkEnd w:id="23"/>
-    <w:bookmarkStart w:id="24" w:name="X5e0c8d055bacba66c0b64e91a29a68ccf265fae"/>
-    <w:p>
-      <w:pPr>
-        <w:pStyle w:val="Heading4"/>
-      </w:pPr>
-      <w:r>
-        <w:t xml:space="preserve">StrainGST rerun on simulations and ATCC WMS mocks (Table 9)</w:t>
-      </w:r>
-    </w:p>
-    <w:p>
-      <w:pPr>
-        <w:pStyle w:val="FirstParagraph"/>
-      </w:pPr>
-      <w:r>
-        <w:t xml:space="preserve">StrainGST completed all 237 simulation runs and all four ATCC WMS mocks. On the 225 matched</w:t>
-      </w:r>
-      <w:r>
-        <w:t xml:space="preserve"> </w:t>
-      </w:r>
-      <w:r>
-        <w:t xml:space="preserve">single-species simulations, median precision, recall and F1 were 1.000 in StrainGE’s 0.90-reference</w:t>
-      </w:r>
-      <w:r>
-        <w:t xml:space="preserve"> </w:t>
-      </w:r>
-      <w:r>
-        <w:t xml:space="preserve">space; median cost was 18.66 s and 1.30 GB per sample. On the 12 multi-species communities, median</w:t>
-      </w:r>
-      <w:r>
-        <w:t xml:space="preserve"> </w:t>
-      </w:r>
-      <w:r>
-        <w:t xml:space="preserve">precision was 0.901, recall was 1.000 and F1 was 0.941; median cost was 236.98 s and 7.90 GB. This</w:t>
-      </w:r>
-      <w:r>
-        <w:t xml:space="preserve"> </w:t>
-      </w:r>
-      <w:r>
-        <w:t xml:space="preserve">runtime comparison is specific to the recommended species-database StrainGST workflow and includes one</w:t>
-      </w:r>
-      <w:r>
-        <w:t xml:space="preserve"> </w:t>
-      </w:r>
-      <w:r>
-        <w:t xml:space="preserve">sample k-merization plus searches against all relevant species databases. On the same matched simulations,</w:t>
-      </w:r>
-      <w:r>
-        <w:t xml:space="preserve"> </w:t>
-      </w:r>
-      <w:r>
-        <w:t xml:space="preserve">Strain2bScan medians were 0.35 s and 0.051 GB for single-species samples and 4.33 s and 0.662 GB for</w:t>
-      </w:r>
-      <w:r>
-        <w:t xml:space="preserve"> </w:t>
-      </w:r>
-      <w:r>
-        <w:t xml:space="preserve">communities. StrainGST therefore used 53.31× more wall time and 25.49× more peak RSS for single-species</w:t>
-      </w:r>
-      <w:r>
-        <w:t xml:space="preserve"> </w:t>
-      </w:r>
-      <w:r>
-        <w:t xml:space="preserve">samples, and 54.73× more wall time and 12.07× more peak RSS for multi-species communities. Accuracy was</w:t>
-      </w:r>
-      <w:r>
-        <w:t xml:space="preserve"> </w:t>
-      </w:r>
-      <w:r>
-        <w:t xml:space="preserve">not pooled because the two tools use different cluster spaces.</w:t>
-      </w:r>
-    </w:p>
-    <w:p>
-      <w:pPr>
-        <w:pStyle w:val="BodyText"/>
-      </w:pPr>
-      <w:r>
-        <w:t xml:space="preserve">ATCC behaviour was mock dependent. At the 1e-4 abundance threshold, StrainGST F1 was 0.700 on MSA-1002</w:t>
-      </w:r>
-      <w:r>
-        <w:t xml:space="preserve"> </w:t>
-      </w:r>
-      <w:r>
-        <w:t xml:space="preserve">at 99% host, 0.542 on MSA-1003, 0.476 on MSA-1005 and 0.600 on MSA-1007. Cost was 1007.22-2158.75 s and</w:t>
-      </w:r>
-      <w:r>
-        <w:t xml:space="preserve"> </w:t>
-      </w:r>
-      <w:r>
-        <w:t xml:space="preserve">14.36-21.52 GB peak RSS per sample, including one sample k-merization and 28 species searches. These</w:t>
-      </w:r>
-      <w:r>
-        <w:t xml:space="preserve"> </w:t>
-      </w:r>
-      <w:r>
-        <w:t xml:space="preserve">results are not directly pooled with the primary comparator curves because each tool is scored in its own</w:t>
-      </w:r>
-      <w:r>
-        <w:t xml:space="preserve"> </w:t>
-      </w:r>
-      <w:r>
-        <w:t xml:space="preserve">reference space and StrainGR was not run; they show that the reference-guided StrainGST workflow is</w:t>
-      </w:r>
-      <w:r>
-        <w:t xml:space="preserve"> </w:t>
-      </w:r>
-      <w:r>
-        <w:t xml:space="preserve">feasible on these shotgun mocks but does not remove the input-scope distinction from native 2bRAD</w:t>
-      </w:r>
-      <w:r>
-        <w:t xml:space="preserve"> </w:t>
-      </w:r>
-      <w:r>
-        <w:t xml:space="preserve">analysis.</w:t>
-      </w:r>
-    </w:p>
-    <w:bookmarkEnd w:id="24"/>
-    <w:bookmarkEnd w:id="25"/>
-    <w:bookmarkStart w:id="26" w:name="discussion"/>
-    <w:p>
-      <w:pPr>
-        <w:pStyle w:val="Heading2"/>
-      </w:pPr>
-      <w:r>
-        <w:t xml:space="preserve">Discussion</w:t>
-      </w:r>
-    </w:p>
-    <w:p>
-      <w:pPr>
-        <w:pStyle w:val="FirstParagraph"/>
-      </w:pPr>
-      <w:r>
-        <w:t xml:space="preserve">Strain2bScan couples a sparse 2bRAD marker space to StrainScan-style [1] strain-cluster resolution in a</w:t>
-      </w:r>
-      <w:r>
-        <w:t xml:space="preserve"> </w:t>
-      </w:r>
-      <w:r>
-        <w:t xml:space="preserve">compact Rust implementation. The resulting capability is not another full-k-mer profiler with a faster</w:t>
-      </w:r>
-      <w:r>
-        <w:t xml:space="preserve"> </w:t>
-      </w:r>
-      <w:r>
-        <w:t xml:space="preserve">engine. It is a single marker framework in which native reduction precedes host depletion for low-biomass</w:t>
-      </w:r>
-      <w:r>
-        <w:t xml:space="preserve"> </w:t>
-      </w:r>
-      <w:r>
-        <w:t xml:space="preserve">libraries and one in-silico digest serves every species panel for cohort-scale shotgun analysis. Across the</w:t>
-      </w:r>
-      <w:r>
-        <w:t xml:space="preserve"> </w:t>
-      </w:r>
-      <w:r>
-        <w:t xml:space="preserve">benchmarks, 2bRAD markers preserved genome-wide strain relationships, precision matched StrainScan in</w:t>
-      </w:r>
-      <w:r>
-        <w:t xml:space="preserve"> </w:t>
-      </w:r>
-      <w:r>
-        <w:t xml:space="preserve">completed paired simulations, and the strongest operational gains appeared in database construction,</w:t>
-      </w:r>
-      <w:r>
-        <w:t xml:space="preserve"> </w:t>
-      </w:r>
-      <w:r>
-        <w:t xml:space="preserve">multi-species runtime and retention at 99% host DNA (Figs 2, 7–10).</w:t>
-      </w:r>
-    </w:p>
-    <w:p>
-      <w:pPr>
-        <w:pStyle w:val="BodyText"/>
-      </w:pPr>
-      <w:r>
-        <w:t xml:space="preserve">Native 2bRAD-M addresses the setting in which shotgun coverage is most constrained. Because reduction occurs</w:t>
-      </w:r>
-      <w:r>
-        <w:t xml:space="preserve"> </w:t>
-      </w:r>
-      <w:r>
-        <w:t xml:space="preserve">before host DNA dominates the library, the primary MSA-1002 comparison retained both detection and abundance</w:t>
-      </w:r>
-      <w:r>
-        <w:t xml:space="preserve"> </w:t>
-      </w:r>
-      <w:r>
-        <w:t xml:space="preserve">at 99% human DNA, whereas the tested shotgun profilers lost one or both quantities (Fig 10). The saliva</w:t>
-      </w:r>
-      <w:r>
-        <w:t xml:space="preserve"> </w:t>
-      </w:r>
-      <w:r>
-        <w:t xml:space="preserve">analysis extended this observation from synthetic host ladders to person-specific profiles: strain features</w:t>
-      </w:r>
-      <w:r>
-        <w:t xml:space="preserve"> </w:t>
-      </w:r>
-      <w:r>
-        <w:t xml:space="preserve">identified the subject in every leave-one-timepoint-out test, compared with 78.1% for species features</w:t>
-      </w:r>
-      <w:r>
-        <w:t xml:space="preserve"> </w:t>
-      </w:r>
-      <w:r>
-        <w:t xml:space="preserve">(Fig 5). This is a small within-subject classification result rather than independent strain-identity</w:t>
-      </w:r>
-      <w:r>
-        <w:t xml:space="preserve"> </w:t>
-      </w:r>
-      <w:r>
-        <w:t xml:space="preserve">validation. Its value lies in showing that native libraries carry enough strain-specific structure to</w:t>
-      </w:r>
-      <w:r>
-        <w:t xml:space="preserve"> </w:t>
-      </w:r>
-      <w:r>
-        <w:t xml:space="preserve">support subject-level discrimination, a property that 65/65 concordant shotgun calls and 128–163 additional</w:t>
-      </w:r>
-      <w:r>
-        <w:t xml:space="preserve"> </w:t>
-      </w:r>
-      <w:r>
-        <w:t xml:space="preserve">candidate strain-cluster calls per sample further support on usable paired libraries (Fig 6).</w:t>
-      </w:r>
-    </w:p>
-    <w:p>
-      <w:pPr>
-        <w:pStyle w:val="BodyText"/>
-      </w:pPr>
-      <w:r>
-        <w:t xml:space="preserve">In shotgun mode, the structural advantage is a change in search economics. A sample is digested once and the</w:t>
-      </w:r>
-      <w:r>
-        <w:t xml:space="preserve"> </w:t>
-      </w:r>
-      <w:r>
-        <w:t xml:space="preserve">resulting tags index against all species, so adding species increases panel searches rather than sample</w:t>
-      </w:r>
-      <w:r>
-        <w:t xml:space="preserve"> </w:t>
-      </w:r>
-      <w:r>
-        <w:t xml:space="preserve">k-mer counting. This design produced the 121–146× projected cohort-level advantage on the 55-species</w:t>
-      </w:r>
-      <w:r>
-        <w:t xml:space="preserve"> </w:t>
-      </w:r>
-      <w:r>
-        <w:t xml:space="preserve">analysis and made the marginal cost of community profiling approximately flat in species count (Fig 9).</w:t>
-      </w:r>
-      <w:r>
-        <w:t xml:space="preserve"> </w:t>
-      </w:r>
-      <w:r>
-        <w:t xml:space="preserve">Clean-mock precision depended on input composition and threshold semantics, so the scale claim should be</w:t>
-      </w:r>
-      <w:r>
-        <w:t xml:space="preserve"> </w:t>
-      </w:r>
-      <w:r>
-        <w:t xml:space="preserve">read together with the accuracy and cluster-space conditions in Tables 1–3. The framework’s strongest</w:t>
-      </w:r>
-      <w:r>
-        <w:t xml:space="preserve"> </w:t>
-      </w:r>
-      <w:r>
-        <w:t xml:space="preserve">current position is therefore scalable strain resolution across mixed cohorts, rather than uniform</w:t>
-      </w:r>
-      <w:r>
-        <w:t xml:space="preserve"> </w:t>
-      </w:r>
-      <w:r>
-        <w:t xml:space="preserve">precision superiority on every mock.</w:t>
-      </w:r>
-    </w:p>
-    <w:p>
-      <w:pPr>
-        <w:pStyle w:val="BodyText"/>
-      </w:pPr>
-      <w:r>
-        <w:t xml:space="preserve">The biological unit of the claim is the strain cluster. At a 0.95 similarity cut, diverse species can</w:t>
-      </w:r>
-      <w:r>
-        <w:t xml:space="preserve"> </w:t>
-      </w:r>
-      <w:r>
-        <w:t xml:space="preserve">resolve close to individual genomes, whereas near-clonal populations resolve to fewer clusters. This is an</w:t>
-      </w:r>
-      <w:r>
-        <w:t xml:space="preserve"> </w:t>
-      </w:r>
-      <w:r>
-        <w:t xml:space="preserve">inherent property of short-read evidence shared by StrainScan [1] and Strain2bScan, not a loss introduced by</w:t>
-      </w:r>
-      <w:r>
-        <w:t xml:space="preserve"> </w:t>
-      </w:r>
-      <w:r>
-        <w:t xml:space="preserve">reduced-representation markers. Precision remained high in low-diversity species, while near-clonal recall</w:t>
-      </w:r>
-      <w:r>
-        <w:t xml:space="preserve"> </w:t>
-      </w:r>
-      <w:r>
-        <w:t xml:space="preserve">defined the most important algorithmic boundary (Fig 7). A within-cluster overlap or regression layer that</w:t>
-      </w:r>
-      <w:r>
-        <w:t xml:space="preserve"> </w:t>
-      </w:r>
-      <w:r>
-        <w:t xml:space="preserve">uses read placement after occurrence-based uniqueness would directly test whether near-clonal recall can</w:t>
-      </w:r>
-      <w:r>
-        <w:t xml:space="preserve"> </w:t>
-      </w:r>
-      <w:r>
-        <w:t xml:space="preserve">increase without sacrificing precision.</w:t>
-      </w:r>
-    </w:p>
-    <w:p>
-      <w:pPr>
-        <w:pStyle w:val="BodyText"/>
-      </w:pPr>
-      <w:r>
-        <w:t xml:space="preserve">Panel and reference quality control the transportability of all strain calls. A niche-appropriate,</w:t>
-      </w:r>
-      <w:r>
-        <w:t xml:space="preserve"> </w:t>
-      </w:r>
-      <w:r>
-        <w:t xml:space="preserve">genome-rich oral panel recovered individual-specific structure that a generic pathogen panel did not, and</w:t>
-      </w:r>
-      <w:r>
-        <w:t xml:space="preserve"> </w:t>
-      </w:r>
-      <w:r>
-        <w:t xml:space="preserve">body-site-complete pangenomes are needed before sparse vaginal or meconium marker evidence can support</w:t>
-      </w:r>
-      <w:r>
-        <w:t xml:space="preserve"> </w:t>
-      </w:r>
-      <w:r>
-        <w:t xml:space="preserve">biological absence calls (Tables 4–7). The containment mode addresses incomplete genomes that have a more</w:t>
-      </w:r>
-      <w:r>
-        <w:t xml:space="preserve"> </w:t>
-      </w:r>
-      <w:r>
-        <w:t xml:space="preserve">complete relative, but markers absent from every reference remain unavailable. Broader pangenome panels,</w:t>
-      </w:r>
-      <w:r>
-        <w:t xml:space="preserve"> </w:t>
-      </w:r>
-      <w:r>
-        <w:t xml:space="preserve">completeness-aware gating and explicit absent-strain models are therefore the next tests for open-world</w:t>
-      </w:r>
-      <w:r>
-        <w:t xml:space="preserve"> </w:t>
-      </w:r>
-      <w:r>
-        <w:t xml:space="preserve">surveillance rather than optional engineering refinements.</w:t>
-      </w:r>
-    </w:p>
-    <w:p>
-      <w:pPr>
-        <w:pStyle w:val="BodyText"/>
-      </w:pPr>
-      <w:r>
-        <w:t xml:space="preserve">The comparator scope is also explicit. StrainScan [1] and inStrain [8] were executed on the frozen shotgun</w:t>
-      </w:r>
-      <w:r>
-        <w:t xml:space="preserve"> </w:t>
-      </w:r>
-      <w:r>
-        <w:t xml:space="preserve">benchmarks, whereas StrainGST [2] was rerun in StrainGE’s 0.90-reference space and reported separately</w:t>
-      </w:r>
-      <w:r>
-        <w:t xml:space="preserve"> </w:t>
-      </w:r>
-      <w:r>
-        <w:t xml:space="preserve">because those calls cannot be pooled with 0.95-space Strain2bScan or StrainScan metrics (Tables 8–9). This</w:t>
-      </w:r>
-      <w:r>
-        <w:t xml:space="preserve"> </w:t>
-      </w:r>
-      <w:r>
-        <w:t xml:space="preserve">rerun covered the primary simulations and ATCC shotgun mocks, but native BcgI input for StrainGE, StrainGR</w:t>
-      </w:r>
-      <w:r>
-        <w:t xml:space="preserve"> </w:t>
-      </w:r>
-      <w:r>
-        <w:t xml:space="preserve">and the supplementary curated-database subset remain untested. The comparison therefore establishes cost and</w:t>
-      </w:r>
-      <w:r>
-        <w:t xml:space="preserve"> </w:t>
-      </w:r>
-      <w:r>
-        <w:t xml:space="preserve">feasibility boundaries for the tested StrainGST workflow without claiming equivalence to the full StrainGE</w:t>
-      </w:r>
-      <w:r>
-        <w:t xml:space="preserve"> </w:t>
-      </w:r>
-      <w:r>
-        <w:t xml:space="preserve">family.</w:t>
-      </w:r>
-    </w:p>
-    <w:p>
-      <w:pPr>
-        <w:pStyle w:val="BodyText"/>
-      </w:pPr>
-      <w:r>
-        <w:t xml:space="preserve">Two applications follow directly from the evidence. Native 2bRAD-M is appropriate when host content, input</w:t>
-      </w:r>
-      <w:r>
-        <w:t xml:space="preserve"> </w:t>
-      </w:r>
-      <w:r>
-        <w:t xml:space="preserve">mass or degradation limits shotgun recovery, with tumour, FFPE and skin as priority targets that remain to</w:t>
-      </w:r>
-      <w:r>
-        <w:t xml:space="preserve"> </w:t>
-      </w:r>
-      <w:r>
-        <w:t xml:space="preserve">be tested. In-silico digestion is appropriate for large shotgun cohorts in which repeated per-species</w:t>
-      </w:r>
-      <w:r>
-        <w:t xml:space="preserve"> </w:t>
-      </w:r>
-      <w:r>
-        <w:t xml:space="preserve">k-mer searches dominate cost. Resolving those two regimes in one marker space turns reduced-representation</w:t>
-      </w:r>
-      <w:r>
-        <w:t xml:space="preserve"> </w:t>
-      </w:r>
-      <w:r>
-        <w:t xml:space="preserve">sequencing from a species-profile protocol into a practical route to strain-resolved microbiome analysis.</w:t>
+        <w:t xml:space="preserve">n</w:t>
+      </w:r>
+      <w:r>
+        <w:t xml:space="preserve"> </w:t>
+      </w:r>
+      <w:r>
+        <w:t xml:space="preserve">enzymes. Pooling several enzymes</w:t>
+      </w:r>
+      <w:r>
+        <w:t xml:space="preserve"> </w:t>
+      </w:r>
+      <w:r>
+        <w:t xml:space="preserve">requires care: ten of the sixteen emit 27 bp tags and their recognition sites genuinely coincide</w:t>
+      </w:r>
+      <w:r>
+        <w:t xml:space="preserve"> </w:t>
+      </w:r>
+      <w:r>
+        <w:t xml:space="preserve">(every AloI site with a C at offset 16 is also a BsaXI site, and a PpiI site as well if offset 19</w:t>
+      </w:r>
+      <w:r>
+        <w:t xml:space="preserve"> </w:t>
+      </w:r>
+      <w:r>
+        <w:t xml:space="preserve">is C; on 2 Mb of sequence 64 of 257 AloI sites are all three). A locus is therefore counted once</w:t>
+      </w:r>
+      <w:r>
+        <w:t xml:space="preserve"> </w:t>
+      </w:r>
+      <w:r>
+        <w:t xml:space="preserve">however many enzymes recognise it, deduplicating on (position, tag length) rather than on the</w:t>
+      </w:r>
+      <w:r>
+        <w:t xml:space="preserve"> </w:t>
+      </w:r>
+      <w:r>
+        <w:t xml:space="preserve">marker, since two enzymes of different tag lengths at the same offset cut genuinely different</w:t>
+      </w:r>
+      <w:r>
+        <w:t xml:space="preserve"> </w:t>
+      </w:r>
+      <w:r>
+        <w:t xml:space="preserve">loci. Counting per enzyme instead gives such a locus an apparent copy number of 2–3, and the</w:t>
+      </w:r>
+      <w:r>
+        <w:t xml:space="preserve"> </w:t>
+      </w:r>
+      <w:r>
+        <w:t xml:space="preserve">single-copy filter then discards it; a systematic 6–7% hole in multi-enzyme panels. For reference genomes</w:t>
+      </w:r>
+      <w:r>
+        <w:t xml:space="preserve"> </w:t>
+      </w:r>
+      <w:r>
+        <w:t xml:space="preserve">we retain only</w:t>
+      </w:r>
+      <w:r>
+        <w:t xml:space="preserve"> </w:t>
+      </w:r>
+      <w:r>
+        <w:rPr>
+          <w:b/>
+          <w:bCs/>
+        </w:rPr>
+        <w:t xml:space="preserve">single-copy</w:t>
+      </w:r>
+      <w:r>
+        <w:t xml:space="preserve"> </w:t>
+      </w:r>
+      <w:r>
+        <w:t xml:space="preserve">tags (occurring exactly once in the genome), following</w:t>
+      </w:r>
+      <w:r>
+        <w:t xml:space="preserve"> </w:t>
+      </w:r>
+      <w:r>
+        <w:t xml:space="preserve">StrainScan’s and Fast2bRAD-M’s use of single-copy markers for unbiased quantification.</w:t>
       </w:r>
     </w:p>
     <w:bookmarkEnd w:id="26"/>
-    <w:bookmarkStart w:id="37" w:name="methods"/>
-    <w:p>
-      <w:pPr>
-        <w:pStyle w:val="Heading2"/>
-      </w:pPr>
-      <w:r>
-        <w:t xml:space="preserve">Methods</w:t>
-      </w:r>
-    </w:p>
-    <w:bookmarkStart w:id="27" w:name="overview"/>
-    <w:p>
-      <w:pPr>
-        <w:pStyle w:val="Heading3"/>
-      </w:pPr>
-      <w:r>
-        <w:t xml:space="preserve">Overview</w:t>
-      </w:r>
-    </w:p>
-    <w:p>
-      <w:pPr>
-        <w:pStyle w:val="FirstParagraph"/>
-      </w:pPr>
-      <w:r>
-        <w:t xml:space="preserve">Strain2bScan reimplements the two-layer StrainScan strategy [1]; cluster near-identical strains,</w:t>
-      </w:r>
-      <w:r>
-        <w:t xml:space="preserve"> </w:t>
-      </w:r>
-      <w:r>
-        <w:t xml:space="preserve">then score samples on markers unique to a strain or cluster; but replaces the full k-mer set</w:t>
-      </w:r>
-      <w:r>
-        <w:t xml:space="preserve"> </w:t>
-      </w:r>
-      <w:r>
-        <w:t xml:space="preserve">with</w:t>
-      </w:r>
-      <w:r>
-        <w:t xml:space="preserve"> </w:t>
-      </w:r>
-      <w:r>
-        <w:rPr>
-          <w:b/>
-          <w:bCs/>
-        </w:rPr>
-        <w:t xml:space="preserve">2bRAD tags</w:t>
-      </w:r>
-      <w:r>
-        <w:t xml:space="preserve">, and implemented in Rust for speed and parallelism. The primary benchmark used the dependency-free release</w:t>
-      </w:r>
-      <w:r>
-        <w:t xml:space="preserve"> </w:t>
-      </w:r>
-      <w:r>
-        <w:rPr>
-          <w:rStyle w:val="VerbatimChar"/>
-        </w:rPr>
-        <w:t xml:space="preserve">benchmark-v0.1.0-f26f234</w:t>
-      </w:r>
-      <w:r>
-        <w:t xml:space="preserve">; later development versions are not part of that frozen configuration. The</w:t>
-      </w:r>
-      <w:r>
-        <w:t xml:space="preserve"> </w:t>
-      </w:r>
-      <w:r>
-        <w:t xml:space="preserve">pipeline is: (i) digest reference genomes and sample reads into 2bRAD-tag markers; (ii) build,</w:t>
-      </w:r>
-      <w:r>
-        <w:t xml:space="preserve"> </w:t>
-      </w:r>
-      <w:r>
-        <w:t xml:space="preserve">per species, a within-species cluster database annotated with unique markers; (iii) profile a</w:t>
-      </w:r>
-      <w:r>
-        <w:t xml:space="preserve"> </w:t>
-      </w:r>
-      <w:r>
-        <w:t xml:space="preserve">sample by detecting present clusters from their unique markers and estimating their abundance;</w:t>
-      </w:r>
-      <w:r>
-        <w:t xml:space="preserve"> </w:t>
-      </w:r>
-      <w:r>
-        <w:t xml:space="preserve">(iv) at the community level, digest each sample once and match it against every per-species</w:t>
-      </w:r>
-      <w:r>
-        <w:t xml:space="preserve"> </w:t>
-      </w:r>
-      <w:r>
-        <w:t xml:space="preserve">database, gated by a species-level Layer-1 check.</w:t>
-      </w:r>
-    </w:p>
-    <w:bookmarkEnd w:id="27"/>
-    <w:bookmarkStart w:id="28" w:name="brad-tag-extraction"/>
-    <w:p>
-      <w:pPr>
-        <w:pStyle w:val="Heading3"/>
-      </w:pPr>
-      <w:r>
-        <w:t xml:space="preserve">2bRAD tag extraction</w:t>
-      </w:r>
-    </w:p>
-    <w:p>
-      <w:pPr>
-        <w:pStyle w:val="FirstParagraph"/>
-      </w:pPr>
-      <w:r>
-        <w:t xml:space="preserve">Type-IIB restriction enzymes cut on both sides of their recognition site, releasing a</w:t>
-      </w:r>
-      <w:r>
-        <w:t xml:space="preserve"> </w:t>
-      </w:r>
-      <w:r>
-        <w:t xml:space="preserve">fixed-length fragment (the 2bRAD tag, 25–33 bp depending on enzyme). Each of the 16 enzymes in</w:t>
-      </w:r>
-      <w:r>
-        <w:t xml:space="preserve"> </w:t>
-      </w:r>
-      <w:r>
-        <w:t xml:space="preserve">the Fast2bRAD-M table [7] is modelled as a set of anchored sequence patterns; literal motifs at</w:t>
-      </w:r>
-      <w:r>
-        <w:t xml:space="preserve"> </w:t>
-      </w:r>
-      <w:r>
-        <w:t xml:space="preserve">fixed offsets within the tag window, plus, for the three IUPAC-degenerate enzymes (BaeI, HaeIV,</w:t>
-      </w:r>
-      <w:r>
-        <w:t xml:space="preserve"> </w:t>
-      </w:r>
-      <w:r>
-        <w:t xml:space="preserve">Hin4I), single positions restricted to a base class; unanchored positions are unconstrained but</w:t>
-      </w:r>
-      <w:r>
-        <w:t xml:space="preserve"> </w:t>
-      </w:r>
-      <w:r>
-        <w:t xml:space="preserve">must be A/C/G/T, which excludes tags spanning ambiguity codes. Scanning every offset and testing</w:t>
-      </w:r>
-      <w:r>
-        <w:t xml:space="preserve"> </w:t>
-      </w:r>
-      <w:r>
-        <w:t xml:space="preserve">the anchors reproduces the enzyme’s digestion sites. Only the forward strand is scanned: each</w:t>
-      </w:r>
-      <w:r>
-        <w:t xml:space="preserve"> </w:t>
-      </w:r>
-      <w:r>
-        <w:t xml:space="preserve">enzyme carries forward and reverse patterns that are exact reverse-complement pairs at its tag</w:t>
-      </w:r>
-      <w:r>
-        <w:t xml:space="preserve"> </w:t>
-      </w:r>
-      <w:r>
-        <w:t xml:space="preserve">length (the palindromic enzymes BplI, FalI and AlfI carry a single self-complementary pattern),</w:t>
-      </w:r>
-      <w:r>
-        <w:t xml:space="preserve"> </w:t>
-      </w:r>
-      <w:r>
-        <w:t xml:space="preserve">so one pass finds sites in either orientation. Digestion is therefore strand-invariant (digest(</w:t>
-      </w:r>
-      <w:r>
-        <w:rPr>
-          <w:i/>
-          <w:iCs/>
-        </w:rPr>
-        <w:t xml:space="preserve">S</w:t>
-      </w:r>
-      <w:r>
-        <w:t xml:space="preserve">) = digest(revcomp(</w:t>
-      </w:r>
-      <w:r>
-        <w:rPr>
-          <w:i/>
-          <w:iCs/>
-        </w:rPr>
-        <w:t xml:space="preserve">S</w:t>
-      </w:r>
-      <w:r>
-        <w:t xml:space="preserve">))) without scanning both strands and without doubling the</w:t>
-      </w:r>
-      <w:r>
-        <w:t xml:space="preserve"> </w:t>
-      </w:r>
-      <w:r>
-        <w:t xml:space="preserve">marker set; this is asserted for every enzyme by a regression test. Each tag is canonicalised (the lexicographically smaller of</w:t>
-      </w:r>
-      <w:r>
-        <w:t xml:space="preserve"> </w:t>
-      </w:r>
-      <w:r>
-        <w:t xml:space="preserve">the tag and its reverse complement) and hashed to a 64-bit integer marker (FNV-1a; genome and</w:t>
-      </w:r>
-      <w:r>
-        <w:t xml:space="preserve"> </w:t>
-      </w:r>
-      <w:r>
-        <w:t xml:space="preserve">sample tags use the same hash, so marker values are internally consistent). Two input modes</w:t>
-      </w:r>
-      <w:r>
-        <w:t xml:space="preserve"> </w:t>
-      </w:r>
-      <w:r>
-        <w:t xml:space="preserve">are supported:</w:t>
-      </w:r>
-      <w:r>
-        <w:t xml:space="preserve"> </w:t>
-      </w:r>
-      <w:r>
-        <w:rPr>
-          <w:b/>
-          <w:bCs/>
-        </w:rPr>
-        <w:t xml:space="preserve">BcgI only</w:t>
-      </w:r>
-      <w:r>
-        <w:t xml:space="preserve"> </w:t>
-      </w:r>
-      <w:r>
-        <w:t xml:space="preserve">for 2bRAD experimental libraries whose reads already are tags, or</w:t>
-      </w:r>
-      <w:r>
-        <w:t xml:space="preserve"> </w:t>
-      </w:r>
-      <w:r>
-        <w:t xml:space="preserve">a user-chosen enzyme set (</w:t>
-      </w:r>
-      <w:r>
-        <w:rPr>
-          <w:rStyle w:val="VerbatimChar"/>
-        </w:rPr>
-        <w:t xml:space="preserve">--enzyme all</w:t>
-      </w:r>
-      <w:r>
-        <w:t xml:space="preserve"> </w:t>
-      </w:r>
-      <w:r>
-        <w:t xml:space="preserve">for all 16) for in-silico digestion of conventional</w:t>
-      </w:r>
-      <w:r>
-        <w:t xml:space="preserve"> </w:t>
-      </w:r>
-      <w:r>
-        <w:t xml:space="preserve">shotgun reads, which enriches the marker set ~</w:t>
-      </w:r>
-      <w:r>
-        <w:rPr>
-          <w:i/>
-          <w:iCs/>
-        </w:rPr>
-        <w:t xml:space="preserve">n</w:t>
-      </w:r>
-      <w:r>
-        <w:t xml:space="preserve">-fold for</w:t>
-      </w:r>
-      <w:r>
-        <w:t xml:space="preserve"> </w:t>
-      </w:r>
-      <w:r>
-        <w:rPr>
-          <w:i/>
-          <w:iCs/>
-        </w:rPr>
-        <w:t xml:space="preserve">n</w:t>
-      </w:r>
-      <w:r>
-        <w:t xml:space="preserve"> </w:t>
-      </w:r>
-      <w:r>
-        <w:t xml:space="preserve">enzymes. Pooling several enzymes</w:t>
-      </w:r>
-      <w:r>
-        <w:t xml:space="preserve"> </w:t>
-      </w:r>
-      <w:r>
-        <w:t xml:space="preserve">requires care: ten of the sixteen emit 27 bp tags and their recognition sites genuinely coincide</w:t>
-      </w:r>
-      <w:r>
-        <w:t xml:space="preserve"> </w:t>
-      </w:r>
-      <w:r>
-        <w:t xml:space="preserve">(every AloI site with a C at offset 16 is also a BsaXI site, and a PpiI site as well if offset 19</w:t>
-      </w:r>
-      <w:r>
-        <w:t xml:space="preserve"> </w:t>
-      </w:r>
-      <w:r>
-        <w:t xml:space="preserve">is C; on 2 Mb of sequence 64 of 257 AloI sites are all three). A locus is therefore counted once</w:t>
-      </w:r>
-      <w:r>
-        <w:t xml:space="preserve"> </w:t>
-      </w:r>
-      <w:r>
-        <w:t xml:space="preserve">however many enzymes recognise it, deduplicating on (position, tag length) rather than on the</w:t>
-      </w:r>
-      <w:r>
-        <w:t xml:space="preserve"> </w:t>
-      </w:r>
-      <w:r>
-        <w:t xml:space="preserve">marker, since two enzymes of different tag lengths at the same offset cut genuinely different</w:t>
-      </w:r>
-      <w:r>
-        <w:t xml:space="preserve"> </w:t>
-      </w:r>
-      <w:r>
-        <w:t xml:space="preserve">loci. Counting per enzyme instead gives such a locus an apparent copy number of 2–3, and the</w:t>
-      </w:r>
-      <w:r>
-        <w:t xml:space="preserve"> </w:t>
-      </w:r>
-      <w:r>
-        <w:t xml:space="preserve">single-copy filter then discards it; a systematic 6–7% hole in multi-enzyme panels. For reference genomes</w:t>
-      </w:r>
-      <w:r>
-        <w:t xml:space="preserve"> </w:t>
-      </w:r>
-      <w:r>
-        <w:t xml:space="preserve">we retain only</w:t>
-      </w:r>
-      <w:r>
-        <w:t xml:space="preserve"> </w:t>
-      </w:r>
-      <w:r>
-        <w:rPr>
-          <w:b/>
-          <w:bCs/>
-        </w:rPr>
-        <w:t xml:space="preserve">single-copy</w:t>
-      </w:r>
-      <w:r>
-        <w:t xml:space="preserve"> </w:t>
-      </w:r>
-      <w:r>
-        <w:t xml:space="preserve">tags (occurring exactly once in the genome), following</w:t>
-      </w:r>
-      <w:r>
-        <w:t xml:space="preserve"> </w:t>
-      </w:r>
-      <w:r>
-        <w:t xml:space="preserve">StrainScan’s and Fast2bRAD-M’s use of single-copy markers for unbiased quantification.</w:t>
-      </w:r>
-    </w:p>
-    <w:bookmarkEnd w:id="28"/>
-    <w:bookmarkStart w:id="29" w:name="Xb151cb8c827f157be1096a0fdfeadabf5ff5740"/>
+    <w:bookmarkStart w:id="27" w:name="Xb151cb8c827f157be1096a0fdfeadabf5ff5740"/>
     <w:p>
       <w:pPr>
         <w:pStyle w:val="Heading3"/>
@@ -3927,8 +2566,8 @@
         <w:t xml:space="preserve">single-copy filter removing the 30,274 multi-copy 31-mers, matching an independent count exactly.</w:t>
       </w:r>
     </w:p>
-    <w:bookmarkEnd w:id="29"/>
-    <w:bookmarkStart w:id="30" w:name="reference-database-construction"/>
+    <w:bookmarkEnd w:id="27"/>
+    <w:bookmarkStart w:id="28" w:name="reference-database-construction"/>
     <w:p>
       <w:pPr>
         <w:pStyle w:val="Heading3"/>
@@ -4446,8 +3085,8 @@
         <w:t xml:space="preserve">they are removed only when a threshold is set.</w:t>
       </w:r>
     </w:p>
-    <w:bookmarkEnd w:id="30"/>
-    <w:bookmarkStart w:id="31" w:name="layer-2-detection-and-abundance"/>
+    <w:bookmarkEnd w:id="28"/>
+    <w:bookmarkStart w:id="29" w:name="layer-2-detection-and-abundance"/>
     <w:p>
       <w:pPr>
         <w:pStyle w:val="Heading3"/>
@@ -6337,8 +4976,8 @@
         <w:t xml:space="preserve">with the given enzyme set.</w:t>
       </w:r>
     </w:p>
-    <w:bookmarkEnd w:id="31"/>
-    <w:bookmarkStart w:id="32" w:name="X7269a3660de3b4f824d6ded8bb990d64ce97057"/>
+    <w:bookmarkEnd w:id="29"/>
+    <w:bookmarkStart w:id="30" w:name="X7269a3660de3b4f824d6ded8bb990d64ce97057"/>
     <w:p>
       <w:pPr>
         <w:pStyle w:val="Heading3"/>
@@ -7223,8 +5862,8 @@
         <w:t xml:space="preserve">).</w:t>
       </w:r>
     </w:p>
-    <w:bookmarkEnd w:id="32"/>
-    <w:bookmarkStart w:id="33" w:name="X5d23d8e3cb38366f760ec938fb86b2e12539a41"/>
+    <w:bookmarkEnd w:id="30"/>
+    <w:bookmarkStart w:id="31" w:name="X5d23d8e3cb38366f760ec938fb86b2e12539a41"/>
     <w:p>
       <w:pPr>
         <w:pStyle w:val="Heading3"/>
@@ -7391,8 +6030,8 @@
         <w:t xml:space="preserve">about the rest of the panel.</w:t>
       </w:r>
     </w:p>
-    <w:bookmarkEnd w:id="33"/>
-    <w:bookmarkStart w:id="34" w:name="X87770d8952411caa1374ae4d4bc203aaa2a93f6"/>
+    <w:bookmarkEnd w:id="31"/>
+    <w:bookmarkStart w:id="32" w:name="X87770d8952411caa1374ae4d4bc203aaa2a93f6"/>
     <w:p>
       <w:pPr>
         <w:pStyle w:val="Heading3"/>
@@ -7772,8 +6411,8 @@
         <w:t xml:space="preserve">, which denser sampling need not change.</w:t>
       </w:r>
     </w:p>
-    <w:bookmarkEnd w:id="34"/>
-    <w:bookmarkStart w:id="35" w:name="implementation"/>
+    <w:bookmarkEnd w:id="32"/>
+    <w:bookmarkStart w:id="33" w:name="implementation"/>
     <w:p>
       <w:pPr>
         <w:pStyle w:val="Heading3"/>
@@ -8156,8 +6795,8 @@
         <w:t xml:space="preserve">dispatched on sequence length rather than applied globally.</w:t>
       </w:r>
     </w:p>
-    <w:bookmarkEnd w:id="35"/>
-    <w:bookmarkStart w:id="36" w:name="benchmarking"/>
+    <w:bookmarkEnd w:id="33"/>
+    <w:bookmarkStart w:id="34" w:name="benchmarking"/>
     <w:p>
       <w:pPr>
         <w:pStyle w:val="Heading3"/>
@@ -10527,9 +9166,9 @@
         <w:t xml:space="preserve">the three Bifidobacterium controls, and profiled the held-out isolate reads.</w:t>
       </w:r>
     </w:p>
-    <w:bookmarkEnd w:id="36"/>
-    <w:bookmarkEnd w:id="37"/>
-    <w:bookmarkStart w:id="38" w:name="author-contributions"/>
+    <w:bookmarkEnd w:id="34"/>
+    <w:bookmarkEnd w:id="35"/>
+    <w:bookmarkStart w:id="36" w:name="author-contributions"/>
     <w:p>
       <w:pPr>
         <w:pStyle w:val="Heading2"/>
@@ -10572,8 +9211,8 @@
         <w:t xml:space="preserve">Conceptualization, Resources, Supervision, Funding acquisition, Writing – review &amp; editing, and Project administration. Both authors read and approved the final manuscript.</w:t>
       </w:r>
     </w:p>
-    <w:bookmarkEnd w:id="38"/>
-    <w:bookmarkStart w:id="39" w:name="funding"/>
+    <w:bookmarkEnd w:id="36"/>
+    <w:bookmarkStart w:id="37" w:name="funding"/>
     <w:p>
       <w:pPr>
         <w:pStyle w:val="Heading2"/>
@@ -10590,8 +9229,8 @@
         <w:t xml:space="preserve">This work was supported by award 32572519.</w:t>
       </w:r>
     </w:p>
-    <w:bookmarkEnd w:id="39"/>
-    <w:bookmarkStart w:id="40" w:name="data-and-code-availability"/>
+    <w:bookmarkEnd w:id="37"/>
+    <w:bookmarkStart w:id="38" w:name="data-and-code-availability"/>
     <w:p>
       <w:pPr>
         <w:pStyle w:val="Heading2"/>
@@ -10608,9 +9247,9 @@
         <w:t xml:space="preserve">The Strain2bScan source code is available at https://github.com/HuangShiLab/Strain2bScan. Derived tables, benchmark configurations, checksums and assembly scripts are available at https://github.com/HuangShiLab/Strain2bScan-paper (paper-2026-10-13-submission tag). Public human metagenome reads used in the exploratory analyses are from PRJNA1131785, PRJNA288562, PRJNA1517970, PRJNA1191223 and PRJNA1191225. Commercial ATCC mock standards are identified by their catalogue names in the manuscript. No new human subject data were generated for this study.</w:t>
       </w:r>
     </w:p>
-    <w:bookmarkEnd w:id="40"/>
-    <w:bookmarkEnd w:id="41"/>
-    <w:bookmarkStart w:id="72" w:name="main-figures"/>
+    <w:bookmarkEnd w:id="38"/>
+    <w:bookmarkEnd w:id="39"/>
+    <w:bookmarkStart w:id="70" w:name="main-figures"/>
     <w:p>
       <w:pPr>
         <w:pStyle w:val="Heading1"/>
@@ -10633,18 +9272,18 @@
           <wp:inline>
             <wp:extent cx="5334000" cy="3025253"/>
             <wp:effectExtent b="0" l="0" r="0" t="0"/>
-            <wp:docPr descr="" title="" id="43" name="Picture"/>
+            <wp:docPr descr="" title="" id="41" name="Picture"/>
             <a:graphic>
               <a:graphicData uri="http://schemas.openxmlformats.org/drawingml/2006/picture">
                 <pic:pic>
                   <pic:nvPicPr>
-                    <pic:cNvPr descr="figures/numbered/Fig01_overview.png" id="44" name="Picture"/>
+                    <pic:cNvPr descr="figures/numbered/Fig01_overview.png" id="42" name="Picture"/>
                     <pic:cNvPicPr>
                       <a:picLocks noChangeArrowheads="1" noChangeAspect="1"/>
                     </pic:cNvPicPr>
                   </pic:nvPicPr>
                   <pic:blipFill>
-                    <a:blip r:embed="rId42"/>
+                    <a:blip r:embed="rId40"/>
                     <a:stretch>
                       <a:fillRect/>
                     </a:stretch>
@@ -10745,18 +9384,18 @@
           <wp:inline>
             <wp:extent cx="5334000" cy="2470484"/>
             <wp:effectExtent b="0" l="0" r="0" t="0"/>
-            <wp:docPr descr="" title="" id="46" name="Picture"/>
+            <wp:docPr descr="" title="" id="44" name="Picture"/>
             <a:graphic>
               <a:graphicData uri="http://schemas.openxmlformats.org/drawingml/2006/picture">
                 <pic:pic>
                   <pic:nvPicPr>
-                    <pic:cNvPr descr="figures/numbered/Fig02_mash_2brad_vs_16s.png" id="47" name="Picture"/>
+                    <pic:cNvPr descr="figures/numbered/Fig02_mash_2brad_vs_16s.png" id="45" name="Picture"/>
                     <pic:cNvPicPr>
                       <a:picLocks noChangeArrowheads="1" noChangeAspect="1"/>
                     </pic:cNvPicPr>
                   </pic:nvPicPr>
                   <pic:blipFill>
-                    <a:blip r:embed="rId45"/>
+                    <a:blip r:embed="rId43"/>
                     <a:stretch>
                       <a:fillRect/>
                     </a:stretch>
@@ -10841,18 +9480,18 @@
           <wp:inline>
             <wp:extent cx="5334000" cy="2130337"/>
             <wp:effectExtent b="0" l="0" r="0" t="0"/>
-            <wp:docPr descr="" title="" id="49" name="Picture"/>
+            <wp:docPr descr="" title="" id="47" name="Picture"/>
             <a:graphic>
               <a:graphicData uri="http://schemas.openxmlformats.org/drawingml/2006/picture">
                 <pic:pic>
                   <pic:nvPicPr>
-                    <pic:cNvPr descr="figures/numbered/Fig03_enzyme_sweep.png" id="50" name="Picture"/>
+                    <pic:cNvPr descr="figures/numbered/Fig03_enzyme_sweep.png" id="48" name="Picture"/>
                     <pic:cNvPicPr>
                       <a:picLocks noChangeArrowheads="1" noChangeAspect="1"/>
                     </pic:cNvPicPr>
                   </pic:nvPicPr>
                   <pic:blipFill>
-                    <a:blip r:embed="rId48"/>
+                    <a:blip r:embed="rId46"/>
                     <a:stretch>
                       <a:fillRect/>
                     </a:stretch>
@@ -10911,18 +9550,18 @@
           <wp:inline>
             <wp:extent cx="5334000" cy="2962728"/>
             <wp:effectExtent b="0" l="0" r="0" t="0"/>
-            <wp:docPr descr="" title="" id="52" name="Picture"/>
+            <wp:docPr descr="" title="" id="50" name="Picture"/>
             <a:graphic>
               <a:graphicData uri="http://schemas.openxmlformats.org/drawingml/2006/picture">
                 <pic:pic>
                   <pic:nvPicPr>
-                    <pic:cNvPr descr="figures/numbered/Fig04_native_2brad_mocks.png" id="53" name="Picture"/>
+                    <pic:cNvPr descr="figures/numbered/Fig04_native_2brad_mocks.png" id="51" name="Picture"/>
                     <pic:cNvPicPr>
                       <a:picLocks noChangeArrowheads="1" noChangeAspect="1"/>
                     </pic:cNvPicPr>
                   </pic:nvPicPr>
                   <pic:blipFill>
-                    <a:blip r:embed="rId51"/>
+                    <a:blip r:embed="rId49"/>
                     <a:stretch>
                       <a:fillRect/>
                     </a:stretch>
@@ -10981,18 +9620,18 @@
           <wp:inline>
             <wp:extent cx="5334000" cy="3113081"/>
             <wp:effectExtent b="0" l="0" r="0" t="0"/>
-            <wp:docPr descr="" title="" id="55" name="Picture"/>
+            <wp:docPr descr="" title="" id="53" name="Picture"/>
             <a:graphic>
               <a:graphicData uri="http://schemas.openxmlformats.org/drawingml/2006/picture">
                 <pic:pic>
                   <pic:nvPicPr>
-                    <pic:cNvPr descr="figures/numbered/Fig05_saliva_fig07.png" id="56" name="Picture"/>
+                    <pic:cNvPr descr="figures/numbered/Fig05_saliva_fig07.png" id="54" name="Picture"/>
                     <pic:cNvPicPr>
                       <a:picLocks noChangeArrowheads="1" noChangeAspect="1"/>
                     </pic:cNvPicPr>
                   </pic:nvPicPr>
                   <pic:blipFill>
-                    <a:blip r:embed="rId54"/>
+                    <a:blip r:embed="rId52"/>
                     <a:stretch>
                       <a:fillRect/>
                     </a:stretch>
@@ -11051,18 +9690,18 @@
           <wp:inline>
             <wp:extent cx="5334000" cy="2253289"/>
             <wp:effectExtent b="0" l="0" r="0" t="0"/>
-            <wp:docPr descr="" title="" id="58" name="Picture"/>
+            <wp:docPr descr="" title="" id="56" name="Picture"/>
             <a:graphic>
               <a:graphicData uri="http://schemas.openxmlformats.org/drawingml/2006/picture">
                 <pic:pic>
                   <pic:nvPicPr>
-                    <pic:cNvPr descr="figures/numbered/Fig06_saliva_fig08.png" id="59" name="Picture"/>
+                    <pic:cNvPr descr="figures/numbered/Fig06_saliva_fig08.png" id="57" name="Picture"/>
                     <pic:cNvPicPr>
                       <a:picLocks noChangeArrowheads="1" noChangeAspect="1"/>
                     </pic:cNvPicPr>
                   </pic:nvPicPr>
                   <pic:blipFill>
-                    <a:blip r:embed="rId57"/>
+                    <a:blip r:embed="rId55"/>
                     <a:stretch>
                       <a:fillRect/>
                     </a:stretch>
@@ -11121,18 +9760,18 @@
           <wp:inline>
             <wp:extent cx="5334000" cy="1622136"/>
             <wp:effectExtent b="0" l="0" r="0" t="0"/>
-            <wp:docPr descr="" title="" id="61" name="Picture"/>
+            <wp:docPr descr="" title="" id="59" name="Picture"/>
             <a:graphic>
               <a:graphicData uri="http://schemas.openxmlformats.org/drawingml/2006/picture">
                 <pic:pic>
                   <pic:nvPicPr>
-                    <pic:cNvPr descr="figures/numbered/Fig07_sim2025_summary.png" id="62" name="Picture"/>
+                    <pic:cNvPr descr="figures/numbered/Fig07_sim2025_summary.png" id="60" name="Picture"/>
                     <pic:cNvPicPr>
                       <a:picLocks noChangeArrowheads="1" noChangeAspect="1"/>
                     </pic:cNvPicPr>
                   </pic:nvPicPr>
                   <pic:blipFill>
-                    <a:blip r:embed="rId60"/>
+                    <a:blip r:embed="rId58"/>
                     <a:stretch>
                       <a:fillRect/>
                     </a:stretch>
@@ -11191,18 +9830,18 @@
           <wp:inline>
             <wp:extent cx="5334000" cy="3236635"/>
             <wp:effectExtent b="0" l="0" r="0" t="0"/>
-            <wp:docPr descr="" title="" id="64" name="Picture"/>
+            <wp:docPr descr="" title="" id="62" name="Picture"/>
             <a:graphic>
               <a:graphicData uri="http://schemas.openxmlformats.org/drawingml/2006/picture">
                 <pic:pic>
                   <pic:nvPicPr>
-                    <pic:cNvPr descr="figures/numbered/Fig08_sim_headtohead.png" id="65" name="Picture"/>
+                    <pic:cNvPr descr="figures/numbered/Fig08_sim_headtohead.png" id="63" name="Picture"/>
                     <pic:cNvPicPr>
                       <a:picLocks noChangeArrowheads="1" noChangeAspect="1"/>
                     </pic:cNvPicPr>
                   </pic:nvPicPr>
                   <pic:blipFill>
-                    <a:blip r:embed="rId63"/>
+                    <a:blip r:embed="rId61"/>
                     <a:stretch>
                       <a:fillRect/>
                     </a:stretch>
@@ -11261,18 +9900,18 @@
           <wp:inline>
             <wp:extent cx="3895343" cy="7125387"/>
             <wp:effectExtent b="0" l="0" r="0" t="0"/>
-            <wp:docPr descr="" title="" id="67" name="Picture"/>
+            <wp:docPr descr="" title="" id="65" name="Picture"/>
             <a:graphic>
               <a:graphicData uri="http://schemas.openxmlformats.org/drawingml/2006/picture">
                 <pic:pic>
                   <pic:nvPicPr>
-                    <pic:cNvPr descr="figures/numbered/Fig09_performance+scalability+community_throughput.png" id="68" name="Picture"/>
+                    <pic:cNvPr descr="figures/numbered/Fig09_performance+scalability+community_throughput.png" id="66" name="Picture"/>
                     <pic:cNvPicPr>
                       <a:picLocks noChangeArrowheads="1" noChangeAspect="1"/>
                     </pic:cNvPicPr>
                   </pic:nvPicPr>
                   <pic:blipFill>
-                    <a:blip r:embed="rId66"/>
+                    <a:blip r:embed="rId64"/>
                     <a:stretch>
                       <a:fillRect/>
                     </a:stretch>
@@ -11347,18 +9986,18 @@
           <wp:inline>
             <wp:extent cx="5334000" cy="5357585"/>
             <wp:effectExtent b="0" l="0" r="0" t="0"/>
-            <wp:docPr descr="" title="" id="70" name="Picture"/>
+            <wp:docPr descr="" title="" id="68" name="Picture"/>
             <a:graphic>
               <a:graphicData uri="http://schemas.openxmlformats.org/drawingml/2006/picture">
                 <pic:pic>
                   <pic:nvPicPr>
-                    <pic:cNvPr descr="figures/numbered/Fig10_wms_toolcompare.png" id="71" name="Picture"/>
+                    <pic:cNvPr descr="figures/numbered/Fig10_wms_toolcompare.png" id="69" name="Picture"/>
                     <pic:cNvPicPr>
                       <a:picLocks noChangeArrowheads="1" noChangeAspect="1"/>
                     </pic:cNvPicPr>
                   </pic:nvPicPr>
                   <pic:blipFill>
-                    <a:blip r:embed="rId69"/>
+                    <a:blip r:embed="rId67"/>
                     <a:stretch>
                       <a:fillRect/>
                     </a:stretch>
@@ -11403,8 +10042,8 @@
         <w:t xml:space="preserve">Four ATCC shotgun mocks were profiled with Strain2bScan, StrainScan and inStrain, each in its own 0.95 cluster space. In MSA-1002 at 99% host, Strain2bScan retained F1 1.0 and Bray–Curtis dissimilarity 0.302, whereas StrainScan and inStrain had F1 0.095 and 0.333. Clean-mock thresholded precision varied with input composition. ## Supplementary figures</w:t>
       </w:r>
     </w:p>
-    <w:bookmarkEnd w:id="72"/>
-    <w:bookmarkStart w:id="93" w:name="supplementary-figures"/>
+    <w:bookmarkEnd w:id="70"/>
+    <w:bookmarkStart w:id="91" w:name="supplementary-figures"/>
     <w:p>
       <w:pPr>
         <w:pStyle w:val="Heading1"/>
@@ -11427,18 +10066,18 @@
           <wp:inline>
             <wp:extent cx="5334000" cy="3407833"/>
             <wp:effectExtent b="0" l="0" r="0" t="0"/>
-            <wp:docPr descr="" title="" id="74" name="Picture"/>
+            <wp:docPr descr="" title="" id="72" name="Picture"/>
             <a:graphic>
               <a:graphicData uri="http://schemas.openxmlformats.org/drawingml/2006/picture">
                 <pic:pic>
                   <pic:nvPicPr>
-                    <pic:cNvPr descr="figures/numbered/FigS1_mock_msa1002_titration.png" id="75" name="Picture"/>
+                    <pic:cNvPr descr="figures/numbered/FigS1_mock_msa1002_titration.png" id="73" name="Picture"/>
                     <pic:cNvPicPr>
                       <a:picLocks noChangeArrowheads="1" noChangeAspect="1"/>
                     </pic:cNvPicPr>
                   </pic:nvPicPr>
                   <pic:blipFill>
-                    <a:blip r:embed="rId73"/>
+                    <a:blip r:embed="rId71"/>
                     <a:stretch>
                       <a:fillRect/>
                     </a:stretch>
@@ -11497,18 +10136,18 @@
           <wp:inline>
             <wp:extent cx="5334000" cy="2133600"/>
             <wp:effectExtent b="0" l="0" r="0" t="0"/>
-            <wp:docPr descr="" title="" id="77" name="Picture"/>
+            <wp:docPr descr="" title="" id="75" name="Picture"/>
             <a:graphic>
               <a:graphicData uri="http://schemas.openxmlformats.org/drawingml/2006/picture">
                 <pic:pic>
                   <pic:nvPicPr>
-                    <pic:cNvPr descr="figures/numbered/FigS2_gate_calibration.png" id="78" name="Picture"/>
+                    <pic:cNvPr descr="figures/numbered/FigS2_gate_calibration.png" id="76" name="Picture"/>
                     <pic:cNvPicPr>
                       <a:picLocks noChangeArrowheads="1" noChangeAspect="1"/>
                     </pic:cNvPicPr>
                   </pic:nvPicPr>
                   <pic:blipFill>
-                    <a:blip r:embed="rId76"/>
+                    <a:blip r:embed="rId74"/>
                     <a:stretch>
                       <a:fillRect/>
                     </a:stretch>
@@ -11567,18 +10206,18 @@
           <wp:inline>
             <wp:extent cx="5334000" cy="2233385"/>
             <wp:effectExtent b="0" l="0" r="0" t="0"/>
-            <wp:docPr descr="" title="" id="80" name="Picture"/>
+            <wp:docPr descr="" title="" id="78" name="Picture"/>
             <a:graphic>
               <a:graphicData uri="http://schemas.openxmlformats.org/drawingml/2006/picture">
                 <pic:pic>
                   <pic:nvPicPr>
-                    <pic:cNvPr descr="figures/numbered/FigS3_tree_expansion.png" id="81" name="Picture"/>
+                    <pic:cNvPr descr="figures/numbered/FigS3_tree_expansion.png" id="79" name="Picture"/>
                     <pic:cNvPicPr>
                       <a:picLocks noChangeArrowheads="1" noChangeAspect="1"/>
                     </pic:cNvPicPr>
                   </pic:nvPicPr>
                   <pic:blipFill>
-                    <a:blip r:embed="rId79"/>
+                    <a:blip r:embed="rId77"/>
                     <a:stretch>
                       <a:fillRect/>
                     </a:stretch>
@@ -11637,18 +10276,18 @@
           <wp:inline>
             <wp:extent cx="5334000" cy="3259666"/>
             <wp:effectExtent b="0" l="0" r="0" t="0"/>
-            <wp:docPr descr="" title="" id="83" name="Picture"/>
+            <wp:docPr descr="" title="" id="81" name="Picture"/>
             <a:graphic>
               <a:graphicData uri="http://schemas.openxmlformats.org/drawingml/2006/picture">
                 <pic:pic>
                   <pic:nvPicPr>
-                    <pic:cNvPr descr="figures/numbered/FigS4_instrain_derep.png" id="84" name="Picture"/>
+                    <pic:cNvPr descr="figures/numbered/FigS4_instrain_derep.png" id="82" name="Picture"/>
                     <pic:cNvPicPr>
                       <a:picLocks noChangeArrowheads="1" noChangeAspect="1"/>
                     </pic:cNvPicPr>
                   </pic:nvPicPr>
                   <pic:blipFill>
-                    <a:blip r:embed="rId82"/>
+                    <a:blip r:embed="rId80"/>
                     <a:stretch>
                       <a:fillRect/>
                     </a:stretch>
@@ -11707,18 +10346,18 @@
           <wp:inline>
             <wp:extent cx="5334000" cy="1715097"/>
             <wp:effectExtent b="0" l="0" r="0" t="0"/>
-            <wp:docPr descr="" title="" id="86" name="Picture"/>
+            <wp:docPr descr="" title="" id="84" name="Picture"/>
             <a:graphic>
               <a:graphicData uri="http://schemas.openxmlformats.org/drawingml/2006/picture">
                 <pic:pic>
                   <pic:nvPicPr>
-                    <pic:cNvPr descr="figures/numbered/FigS5_species_expansion_strainscan.png" id="87" name="Picture"/>
+                    <pic:cNvPr descr="figures/numbered/FigS5_species_expansion_strainscan.png" id="85" name="Picture"/>
                     <pic:cNvPicPr>
                       <a:picLocks noChangeArrowheads="1" noChangeAspect="1"/>
                     </pic:cNvPicPr>
                   </pic:nvPicPr>
                   <pic:blipFill>
-                    <a:blip r:embed="rId85"/>
+                    <a:blip r:embed="rId83"/>
                     <a:stretch>
                       <a:fillRect/>
                     </a:stretch>
@@ -11822,18 +10461,18 @@
           <wp:inline>
             <wp:extent cx="5334000" cy="4366768"/>
             <wp:effectExtent b="0" l="0" r="0" t="0"/>
-            <wp:docPr descr="" title="" id="89" name="Picture"/>
+            <wp:docPr descr="" title="" id="87" name="Picture"/>
             <a:graphic>
               <a:graphicData uri="http://schemas.openxmlformats.org/drawingml/2006/picture">
                 <pic:pic>
                   <pic:nvPicPr>
-                    <pic:cNvPr descr="figures/numbered/FigS6_reference_quality_containment.png" id="90" name="Picture"/>
+                    <pic:cNvPr descr="figures/numbered/FigS6_reference_quality_containment.png" id="88" name="Picture"/>
                     <pic:cNvPicPr>
                       <a:picLocks noChangeArrowheads="1" noChangeAspect="1"/>
                     </pic:cNvPicPr>
                   </pic:nvPicPr>
                   <pic:blipFill>
-                    <a:blip r:embed="rId88"/>
+                    <a:blip r:embed="rId86"/>
                     <a:stretch>
                       <a:fillRect/>
                     </a:stretch>
@@ -11894,7 +10533,7 @@
         <w:t xml:space="preserve">fragmentation. This is an algorithmic optimization analysis and is therefore supplementary to the primary performance benchmarks.</w:t>
       </w:r>
     </w:p>
-    <w:bookmarkStart w:id="91" w:name="tables"/>
+    <w:bookmarkStart w:id="89" w:name="tables"/>
     <w:p>
       <w:pPr>
         <w:pStyle w:val="Heading2"/>
@@ -26835,8 +25474,8 @@
         </w:tc>
       </w:tr>
     </w:tbl>
-    <w:bookmarkEnd w:id="91"/>
-    <w:bookmarkStart w:id="92" w:name="references"/>
+    <w:bookmarkEnd w:id="89"/>
+    <w:bookmarkStart w:id="90" w:name="references"/>
     <w:p>
       <w:pPr>
         <w:pStyle w:val="Heading2"/>
@@ -28313,8 +26952,8 @@
         <w:t xml:space="preserve">doi:10.1089/cmb.2012.0021.</w:t>
       </w:r>
     </w:p>
-    <w:bookmarkEnd w:id="92"/>
-    <w:bookmarkEnd w:id="93"/>
+    <w:bookmarkEnd w:id="90"/>
+    <w:bookmarkEnd w:id="91"/>
     <w:sectPr>
       <w:footnotePr>
         <w:numRestart w:val="eachSect"/>

</xml_diff>

<commit_message>
benchmark: rerun enzyme sweep with 225-sample provenance
</commit_message>
<xml_diff>
--- a/manuscript/Strain2bScan_manuscript_figures_tables_2026-10-18-restructured.docx
+++ b/manuscript/Strain2bScan_manuscript_figures_tables_2026-10-18-restructured.docx
@@ -534,7 +534,19 @@
         <w:pStyle w:val="FirstParagraph"/>
       </w:pPr>
       <w:r>
-        <w:t xml:space="preserve">Across 14 resolvable simulation-pool species, increasing the enzyme set from 1 to 14 maintained precision at 1.0 and increased median recall from 0.50 to 1.00. Marker yield increased from 976 to 12,647, but cluster count was unchanged, showing that additional enzymes increased marker density and recall rather than cluster resolution. BcgI alone enabled direct native 2bRAD-M profiling; approximately four enzymes recovered most recall.</w:t>
+        <w:t xml:space="preserve">We reran the enzyme ladder on the 225 matched simulations, giving 1,125 sample-level predictions across 15 species. Increasing enzymes from 1 to 14 increased median strain-specific markers from 816 to 12,298 while median cluster count remained 19, showing that the ladder increased marker density rather than cluster resolution. Across species, median precision/recall/F1 improved from 0.667/0.333/0.500 with BcgI alone to 1.000/1.000/1.000 with 14 enzymes; four enzymes already reached median precision 1.000 and F1 0.667 (Fig 3;</w:t>
+      </w:r>
+      <w:r>
+        <w:t xml:space="preserve"> </w:t>
+      </w:r>
+      <w:r>
+        <w:rPr>
+          <w:rStyle w:val="VerbatimChar"/>
+        </w:rPr>
+        <w:t xml:space="preserve">results/enzyme_sweep_225/</w:t>
+      </w:r>
+      <w:r>
+        <w:t xml:space="preserve">). BcgI therefore enables native 2bRAD-M operation, although single-enzyme panels are panel-dependent and less precise.</w:t>
       </w:r>
     </w:p>
     <w:bookmarkEnd w:id="12"/>
@@ -6977,6 +6989,66 @@
       </w:r>
       <w:r>
         <w:t xml:space="preserve">the systematic comparison and its figures are defined by this ART configuration.</w:t>
+      </w:r>
+    </w:p>
+    <w:p>
+      <w:pPr>
+        <w:pStyle w:val="BodyText"/>
+      </w:pPr>
+      <w:r>
+        <w:rPr>
+          <w:i/>
+          <w:iCs/>
+        </w:rPr>
+        <w:t xml:space="preserve">Enzyme-ladder rerun.</w:t>
+      </w:r>
+      <w:r>
+        <w:t xml:space="preserve"> </w:t>
+      </w:r>
+      <w:r>
+        <w:t xml:space="preserve">To add per-sample provenance to the enzyme-set analysis (Fig 3), we rebuilt each</w:t>
+      </w:r>
+      <w:r>
+        <w:t xml:space="preserve"> </w:t>
+      </w:r>
+      <w:r>
+        <w:t xml:space="preserve">of the 15 simulation-pool species databases at five cumulative enzyme counts (1, 2, 4, 8 and 14) and</w:t>
+      </w:r>
+      <w:r>
+        <w:t xml:space="preserve"> </w:t>
+      </w:r>
+      <w:r>
+        <w:t xml:space="preserve">profiled the 225 matched single-species simulations against the matching species database, for 1,125</w:t>
+      </w:r>
+      <w:r>
+        <w:t xml:space="preserve"> </w:t>
+      </w:r>
+      <w:r>
+        <w:t xml:space="preserve">sample-level predictions. Runs used current-source Strain2bScan with default depth-adaptive gates and were</w:t>
+      </w:r>
+      <w:r>
+        <w:t xml:space="preserve"> </w:t>
+      </w:r>
+      <w:r>
+        <w:t xml:space="preserve">scored against each database’s own 0.95-cluster partition. Per-sample predictions and database marker</w:t>
+      </w:r>
+      <w:r>
+        <w:t xml:space="preserve"> </w:t>
+      </w:r>
+      <w:r>
+        <w:t xml:space="preserve">counts are in</w:t>
+      </w:r>
+      <w:r>
+        <w:t xml:space="preserve"> </w:t>
+      </w:r>
+      <w:r>
+        <w:rPr>
+          <w:rStyle w:val="VerbatimChar"/>
+        </w:rPr>
+        <w:t xml:space="preserve">results/enzyme_sweep_225/</w:t>
+      </w:r>
+      <w:r>
+        <w:t xml:space="preserve">.</w:t>
       </w:r>
     </w:p>
     <w:p>
@@ -9478,7 +9550,7 @@
       <w:r>
         <w:drawing>
           <wp:inline>
-            <wp:extent cx="5334000" cy="2130337"/>
+            <wp:extent cx="5334000" cy="2011308"/>
             <wp:effectExtent b="0" l="0" r="0" t="0"/>
             <wp:docPr descr="" title="" id="47" name="Picture"/>
             <a:graphic>
@@ -9499,7 +9571,7 @@
                   <pic:spPr bwMode="auto">
                     <a:xfrm>
                       <a:off x="0" y="0"/>
-                      <a:ext cx="5334000" cy="2130337"/>
+                      <a:ext cx="5334000" cy="2011308"/>
                     </a:xfrm>
                     <a:prstGeom prst="rect">
                       <a:avLst/>
@@ -9533,7 +9605,7 @@
         <w:t xml:space="preserve"> </w:t>
       </w:r>
       <w:r>
-        <w:t xml:space="preserve">In simulated samples from 14 resolvable species of the 15-species pool, increasing the enzyme set from 1 to 14 leaves precision at 1.0 while increasing median recall from 0.50 to 1.00 and strain-specific marker yield from 976 to 12,647. Approximately four enzymes recover most recall; BcgI alone supports native 2bRAD-M libraries. The sweep is an in-silico design experiment, not a native wet-lab library benchmark.</w:t>
+        <w:t xml:space="preserve">On 225 matched simulations per enzyme level (1,125 sample-level predictions across 15 species), increasing enzymes from 1 to 14 raised median strain-specific markers from 816 to 12,298 while median cluster count stayed 19. Median precision/recall/F1 improved from 0.667/0.333/0.500 to 1.000/1.000/1.000; four enzymes reached median precision 1.000 and F1 0.667. This is an in-silico design experiment, not a native wet-lab library benchmark.</w:t>
       </w:r>
     </w:p>
     <w:p>

</xml_diff>

<commit_message>
manuscript: address Nature Methods and Microbiome pre-submission review
</commit_message>
<xml_diff>
--- a/manuscript/Strain2bScan_manuscript_figures_tables_2026-10-18-restructured.docx
+++ b/manuscript/Strain2bScan_manuscript_figures_tables_2026-10-18-restructured.docx
@@ -2,7 +2,7 @@
 <file path=word/document.xml><?xml version="1.0" encoding="utf-8"?>
 <w:document xmlns:w="http://schemas.openxmlformats.org/wordprocessingml/2006/main" xmlns:m="http://schemas.openxmlformats.org/officeDocument/2006/math" xmlns:r="http://schemas.openxmlformats.org/officeDocument/2006/relationships" xmlns:o="urn:schemas-microsoft-com:office:office" xmlns:v="urn:schemas-microsoft-com:vml" xmlns:w10="urn:schemas-microsoft-com:office:word" xmlns:a="http://schemas.openxmlformats.org/drawingml/2006/main" xmlns:pic="http://schemas.openxmlformats.org/drawingml/2006/picture" xmlns:wp="http://schemas.openxmlformats.org/drawingml/2006/wordprocessingDrawing">
   <w:body>
-    <w:bookmarkStart w:id="39" w:name="X6bb31cdc1a649331d2d99c75a335f27f43454ed"/>
+    <w:bookmarkStart w:id="42" w:name="X6bb31cdc1a649331d2d99c75a335f27f43454ed"/>
     <w:p>
       <w:pPr>
         <w:pStyle w:val="Heading1"/>
@@ -87,73 +87,79 @@
         <w:t xml:space="preserve"> </w:t>
       </w:r>
       <w:r>
-        <w:t xml:space="preserve">species rather than strains, whereas full-k-mer strain profilers incur repeated per-species search costs and</w:t>
-      </w:r>
-      <w:r>
-        <w:t xml:space="preserve"> </w:t>
-      </w:r>
-      <w:r>
-        <w:t xml:space="preserve">lose signal in host-rich samples. We present Strain2bScan, a Rust profiler that converts type-IIB 2bRAD</w:t>
-      </w:r>
-      <w:r>
-        <w:t xml:space="preserve"> </w:t>
-      </w:r>
-      <w:r>
-        <w:t xml:space="preserve">restriction markers into a strain-resolved, digest-once search framework for native BcgI 2bRAD-M libraries</w:t>
-      </w:r>
-      <w:r>
-        <w:t xml:space="preserve"> </w:t>
-      </w:r>
-      <w:r>
-        <w:t xml:space="preserve">and conventional shotgun reads. Across 15 species, 2bRAD markers preserved genome-wide strain relationships</w:t>
-      </w:r>
-      <w:r>
-        <w:t xml:space="preserve"> </w:t>
-      </w:r>
-      <w:r>
-        <w:t xml:space="preserve">that 16S markers did not (median Spearman ρ = 0.94 versus 0.36). Native BcgI profiling retained F1 = 1.0 at</w:t>
-      </w:r>
-      <w:r>
-        <w:t xml:space="preserve"> </w:t>
-      </w:r>
-      <w:r>
-        <w:t xml:space="preserve">a 10⁻⁴ abundance threshold in a 99% human-DNA mock, where Strain2bScan was the only tested tool preserving</w:t>
-      </w:r>
-      <w:r>
-        <w:t xml:space="preserve"> </w:t>
-      </w:r>
-      <w:r>
-        <w:t xml:space="preserve">both detection and abundance. In 225 matched simulations, it matched StrainScan precision and had higher</w:t>
-      </w:r>
-      <w:r>
-        <w:t xml:space="preserve"> </w:t>
-      </w:r>
-      <w:r>
-        <w:t xml:space="preserve">failure-as-absence recall (+0.127; 95% CI 0.007–0.248). Database construction used 249–614× less wall time</w:t>
-      </w:r>
-      <w:r>
-        <w:t xml:space="preserve"> </w:t>
-      </w:r>
-      <w:r>
-        <w:t xml:space="preserve">and 43–138× less memory than StrainScan. In saliva, strain features supported within-subject discrimination</w:t>
-      </w:r>
-      <w:r>
-        <w:t xml:space="preserve"> </w:t>
-      </w:r>
-      <w:r>
-        <w:t xml:space="preserve">(100% versus 78.1% leave-one-timepoint-out classification). Accuracy depended on reference completeness and</w:t>
-      </w:r>
-      <w:r>
-        <w:t xml:space="preserve"> </w:t>
-      </w:r>
-      <w:r>
-        <w:t xml:space="preserve">niche-matched panel design. Strain2bScan therefore extends reduced-representation sequencing from species</w:t>
-      </w:r>
-      <w:r>
-        <w:t xml:space="preserve"> </w:t>
-      </w:r>
-      <w:r>
-        <w:t xml:space="preserve">profiles to scalable strain resolution.</w:t>
+        <w:t xml:space="preserve">species rather than strains, whereas commonly used full-k-mer strain profilers can incur repeated per-species</w:t>
+      </w:r>
+      <w:r>
+        <w:t xml:space="preserve"> </w:t>
+      </w:r>
+      <w:r>
+        <w:t xml:space="preserve">search costs and lose signal in host-rich samples. We present Strain2bScan, a Rust profiler that converts</w:t>
+      </w:r>
+      <w:r>
+        <w:t xml:space="preserve"> </w:t>
+      </w:r>
+      <w:r>
+        <w:t xml:space="preserve">type-IIB 2bRAD restriction markers into a strain-resolved, digest-once search framework for native BcgI</w:t>
+      </w:r>
+      <w:r>
+        <w:t xml:space="preserve"> </w:t>
+      </w:r>
+      <w:r>
+        <w:t xml:space="preserve">2bRAD-M libraries and conventional shotgun reads. Across 15 species, 2bRAD markers preserved genome-wide</w:t>
+      </w:r>
+      <w:r>
+        <w:t xml:space="preserve"> </w:t>
+      </w:r>
+      <w:r>
+        <w:t xml:space="preserve">strain relationships that 16S markers did not (median Spearman ρ = 0.94 versus 0.36). Native BcgI profiling</w:t>
+      </w:r>
+      <w:r>
+        <w:t xml:space="preserve"> </w:t>
+      </w:r>
+      <w:r>
+        <w:t xml:space="preserve">retained F1 = 1.0 at a 10⁻⁴ abundance threshold in a 99% human-DNA mock, where Strain2bScan was the only</w:t>
+      </w:r>
+      <w:r>
+        <w:t xml:space="preserve"> </w:t>
+      </w:r>
+      <w:r>
+        <w:t xml:space="preserve">tested tool preserving both detection and abundance. In 225 matched simulations, it matched StrainScan</w:t>
+      </w:r>
+      <w:r>
+        <w:t xml:space="preserve"> </w:t>
+      </w:r>
+      <w:r>
+        <w:t xml:space="preserve">species-median precision and had higher failure-as-absence recall (+0.127; 95% CI 0.007–0.248). Database</w:t>
+      </w:r>
+      <w:r>
+        <w:t xml:space="preserve"> </w:t>
+      </w:r>
+      <w:r>
+        <w:t xml:space="preserve">construction used 249–614× less wall time and 43–138× less memory than StrainScan. In saliva, strain</w:t>
+      </w:r>
+      <w:r>
+        <w:t xml:space="preserve"> </w:t>
+      </w:r>
+      <w:r>
+        <w:t xml:space="preserve">features supported within-subject discrimination (100% versus 78.1% leave-one-timepoint-out</w:t>
+      </w:r>
+      <w:r>
+        <w:t xml:space="preserve"> </w:t>
+      </w:r>
+      <w:r>
+        <w:t xml:space="preserve">classification). Accuracy depended on reference completeness and niche-matched panel design.</w:t>
+      </w:r>
+      <w:r>
+        <w:t xml:space="preserve"> </w:t>
+      </w:r>
+      <w:r>
+        <w:t xml:space="preserve">Strain2bScan therefore extends reduced-representation sequencing from species profiles to scalable strain</w:t>
+      </w:r>
+      <w:r>
+        <w:t xml:space="preserve"> </w:t>
+      </w:r>
+      <w:r>
+        <w:t xml:space="preserve">resolution.</w:t>
       </w:r>
     </w:p>
     <w:p>
@@ -648,7 +654,7 @@
         <w:pStyle w:val="FirstParagraph"/>
       </w:pPr>
       <w:r>
-        <w:t xml:space="preserve">On 225 matched single-species simulations, Strain2bScan and StrainScan both achieved species-median precision 1.0 across the 204 completed StrainScan pairs. Species-median recall and F1 were 1.000 and 1.000 for Strain2bScan versus 0.667 and 0.800 for StrainScan; paired recall and F1 differences included zero (+0.063 recall; 95% CI −0.037 to 0.133; +0.005 F1; 95% CI −0.091 to 0.069). StrainScan’s depth profile was non-monotonic, whereas Strain2bScan reached full median recall from 1× onward. In a failure-as-absence sensitivity that retained all 225 intended entries, Strain2bScan had +0.127 higher recall (95% CI 0.007 to 0.248), because StrainScan lacked calls for 21 runs. Strain2bScan was also faster and lighter: database construction used 249–614× less wall time and 43–138× less memory, and per-sample profiling was 4–33× faster and 5–39× lighter. Multi-species F1 was lower for Strain2bScan at all three depths, so the scale advantage should not be interpreted as uniform accuracy superiority.</w:t>
+        <w:t xml:space="preserve">On 225 matched single-species simulations, Strain2bScan and StrainScan both achieved species-median precision 1.0 across the 204 completed StrainScan pairs. Species-median recall and F1 were 1.000 and 1.000 for Strain2bScan versus 0.667 and 0.800 for StrainScan; paired recall and F1 differences included zero (+0.063 recall; 95% CI −0.037 to 0.133; +0.005 F1; 95% CI −0.091 to 0.069). StrainScan’s depth profile was non-monotonic, whereas Strain2bScan reached full median recall from 1× onward. In a failure-as-absence sensitivity that retained all 225 intended entries, Strain2bScan had +0.127 higher recall (95% CI 0.007 to 0.248), because StrainScan lacked calls for 21 runs. Strain2bScan was also faster and lighter: database construction used 249–614× less wall time and 43–138× less memory, and per-sample profiling was 4–33× faster and 5–39× lighter. Multi-species F1 was lower for Strain2bScan at all three depths, so the scale advantage should not be interpreted as uniform accuracy advantage.</w:t>
       </w:r>
     </w:p>
     <w:p>
@@ -830,7 +836,7 @@
         <w:pStyle w:val="FirstParagraph"/>
       </w:pPr>
       <w:r>
-        <w:t xml:space="preserve">The primary executed strain-resolved comparators were StrainScan and inStrain; StrainGST was run separately because it uses StrainGE 0.90-reference databases. StrainPhlAn was not forced into the P/R/F1 framework because it infers strain phylogeny/types rather than cluster abundance calls. Accuracies were therefore compared only within prespecified, tool-specific resolution spaces.</w:t>
+        <w:t xml:space="preserve">The primary executed strain-resolved comparators were StrainScan and inStrain; StrainGST was run separately because it uses StrainGE 0.90-reference databases. StrainPhlAn was not included in this P/R/F1 benchmark because it infers strain phylogeny and types rather than cluster abundance calls. StrainPhlAn was not forced into the P/R/F1 framework because it infers strain phylogeny/types rather than cluster abundance calls. Accuracies were therefore compared only within prespecified, tool-specific resolution spaces.</w:t>
       </w:r>
     </w:p>
     <w:p>
@@ -1009,7 +1015,7 @@
         <w:t xml:space="preserve"> </w:t>
       </w:r>
       <w:r>
-        <w:t xml:space="preserve">precision superiority on every mock.</w:t>
+        <w:t xml:space="preserve">higher precision on every mock.</w:t>
       </w:r>
     </w:p>
     <w:p>
@@ -8273,6 +8279,90 @@
           <w:i/>
           <w:iCs/>
         </w:rPr>
+        <w:t xml:space="preserve">inStrain simulation rerun.</w:t>
+      </w:r>
+      <w:r>
+        <w:t xml:space="preserve"> </w:t>
+      </w:r>
+      <w:r>
+        <w:t xml:space="preserve">To extend inStrain to the matched simulation benchmark, we used inStrain</w:t>
+      </w:r>
+      <w:r>
+        <w:t xml:space="preserve"> </w:t>
+      </w:r>
+      <w:r>
+        <w:t xml:space="preserve">1.11.0 with Bowtie2 alignment against the complete species genome pool from the common simulation</w:t>
+      </w:r>
+      <w:r>
+        <w:t xml:space="preserve"> </w:t>
+      </w:r>
+      <w:r>
+        <w:t xml:space="preserve">(not a dereplicated mock-specific reference). For each of the 225 matched single-species samples,</w:t>
+      </w:r>
+      <w:r>
+        <w:t xml:space="preserve"> </w:t>
+      </w:r>
+      <w:r>
+        <w:t xml:space="preserve">sorted BAM files were processed with</w:t>
+      </w:r>
+      <w:r>
+        <w:t xml:space="preserve"> </w:t>
+      </w:r>
+      <w:r>
+        <w:rPr>
+          <w:rStyle w:val="VerbatimChar"/>
+        </w:rPr>
+        <w:t xml:space="preserve">inStrain quick_profile</w:t>
+      </w:r>
+      <w:r>
+        <w:t xml:space="preserve">, and a genome was considered detected when</w:t>
+      </w:r>
+      <w:r>
+        <w:t xml:space="preserve"> </w:t>
+      </w:r>
+      <w:r>
+        <w:t xml:space="preserve">reported coverage was ≥ 0.1 and breadth was ≥ 0.05. Detected genomes were then mapped to the truth</w:t>
+      </w:r>
+      <w:r>
+        <w:t xml:space="preserve"> </w:t>
+      </w:r>
+      <w:r>
+        <w:t xml:space="preserve">0.95-cluster partition before computing precision, recall and F1. These genome-resolved calls were not</w:t>
+      </w:r>
+      <w:r>
+        <w:t xml:space="preserve"> </w:t>
+      </w:r>
+      <w:r>
+        <w:t xml:space="preserve">pooled with Strain2bScan, StrainScan or StrainGST cluster calls, but they permit a read-level comparator</w:t>
+      </w:r>
+      <w:r>
+        <w:t xml:space="preserve"> </w:t>
+      </w:r>
+      <w:r>
+        <w:t xml:space="preserve">to be evaluated on the same simulation reads and truth genomes. Per-sample outputs are in</w:t>
+      </w:r>
+      <w:r>
+        <w:t xml:space="preserve"> </w:t>
+      </w:r>
+      <w:r>
+        <w:rPr>
+          <w:rStyle w:val="VerbatimChar"/>
+        </w:rPr>
+        <w:t xml:space="preserve">results/instrain_sim225/</w:t>
+      </w:r>
+      <w:r>
+        <w:t xml:space="preserve">.</w:t>
+      </w:r>
+    </w:p>
+    <w:p>
+      <w:pPr>
+        <w:pStyle w:val="BodyText"/>
+      </w:pPr>
+      <w:r>
+        <w:rPr>
+          <w:i/>
+          <w:iCs/>
+        </w:rPr>
         <w:t xml:space="preserve">Software and timing provenance.</w:t>
       </w:r>
       <w:r>
@@ -9302,13 +9392,13 @@
       </w:r>
     </w:p>
     <w:bookmarkEnd w:id="37"/>
-    <w:bookmarkStart w:id="38" w:name="data-and-code-availability"/>
+    <w:bookmarkStart w:id="38" w:name="acknowledgements"/>
     <w:p>
       <w:pPr>
         <w:pStyle w:val="Heading2"/>
       </w:pPr>
       <w:r>
-        <w:t xml:space="preserve">Data and code availability</w:t>
+        <w:t xml:space="preserve">Acknowledgements</w:t>
       </w:r>
     </w:p>
     <w:p>
@@ -9316,23 +9406,23 @@
         <w:pStyle w:val="FirstParagraph"/>
       </w:pPr>
       <w:r>
-        <w:t xml:space="preserve">The Strain2bScan source code is available at https://github.com/HuangShiLab/Strain2bScan. Derived tables, benchmark configurations, checksums and assembly scripts are available at https://github.com/HuangShiLab/Strain2bScan-paper (paper-2026-10-13-submission tag). Public human metagenome reads used in the exploratory analyses are from PRJNA1131785, PRJNA288562, PRJNA1517970, PRJNA1191223 and PRJNA1191225. Commercial ATCC mock standards are identified by their catalogue names in the manuscript. No new human subject data were generated for this study.</w:t>
+        <w:t xml:space="preserve">We thank the developers of the public benchmarking tools and the investigators who deposited the</w:t>
+      </w:r>
+      <w:r>
+        <w:t xml:space="preserve"> </w:t>
+      </w:r>
+      <w:r>
+        <w:t xml:space="preserve">public metagenomic datasets used here.</w:t>
       </w:r>
     </w:p>
     <w:bookmarkEnd w:id="38"/>
-    <w:bookmarkEnd w:id="39"/>
-    <w:bookmarkStart w:id="70" w:name="main-figures"/>
+    <w:bookmarkStart w:id="39" w:name="competing-interests"/>
     <w:p>
       <w:pPr>
-        <w:pStyle w:val="Heading1"/>
+        <w:pStyle w:val="Heading2"/>
       </w:pPr>
       <w:r>
-        <w:t xml:space="preserve">Main figures</w:t>
-      </w:r>
-    </w:p>
-    <w:p>
-      <w:r>
-        <w:br w:type="page"/>
+        <w:t xml:space="preserve">Competing interests</w:t>
       </w:r>
     </w:p>
     <w:p>
@@ -9340,22 +9430,88 @@
         <w:pStyle w:val="FirstParagraph"/>
       </w:pPr>
       <w:r>
+        <w:t xml:space="preserve">The authors declare no competing interests.</w:t>
+      </w:r>
+    </w:p>
+    <w:bookmarkEnd w:id="39"/>
+    <w:bookmarkStart w:id="40" w:name="ethics"/>
+    <w:p>
+      <w:pPr>
+        <w:pStyle w:val="Heading2"/>
+      </w:pPr>
+      <w:r>
+        <w:t xml:space="preserve">Ethics</w:t>
+      </w:r>
+    </w:p>
+    <w:p>
+      <w:pPr>
+        <w:pStyle w:val="FirstParagraph"/>
+      </w:pPr>
+      <w:r>
+        <w:t xml:space="preserve">This study used only publicly deposited sequencing data and ATCC commercial mock communities. No new</w:t>
+      </w:r>
+      <w:r>
+        <w:t xml:space="preserve"> </w:t>
+      </w:r>
+      <w:r>
+        <w:t xml:space="preserve">human participants were recruited, and no new human subject data were generated by this study.</w:t>
+      </w:r>
+    </w:p>
+    <w:bookmarkEnd w:id="40"/>
+    <w:bookmarkStart w:id="41" w:name="data-and-code-availability"/>
+    <w:p>
+      <w:pPr>
+        <w:pStyle w:val="Heading2"/>
+      </w:pPr>
+      <w:r>
+        <w:t xml:space="preserve">Data and code availability</w:t>
+      </w:r>
+    </w:p>
+    <w:p>
+      <w:pPr>
+        <w:pStyle w:val="FirstParagraph"/>
+      </w:pPr>
+      <w:r>
+        <w:t xml:space="preserve">The Strain2bScan source code is available at https://github.com/HuangShiLab/Strain2bScan. The simulation benchmark used commit 6ae760c2f3bd2f39efc0e6aa06c53a84366cb16e (tag benchmark-v0.1.1-6ae760c); the ATCC mock benchmark used commit f26f234b817ba7772a3f1df59ce720751e9b45b9 (tag benchmark-v0.1.0-f26f234). Derived tables, benchmark configurations, checksums and assembly scripts are available at https://github.com/HuangShiLab/Strain2bScan-paper (tag results-simplified-2026-10-19 and subsequent history). Public human metagenome reads used in the exploratory analyses are from PRJNA1131785, PRJNA288562, PRJNA1517970, PRJNA1191223 and PRJNA1191225. Commercial ATCC mock standards are identified by their catalogue names in the manuscript. No new human subject data were generated for this study.</w:t>
+      </w:r>
+    </w:p>
+    <w:bookmarkEnd w:id="41"/>
+    <w:bookmarkEnd w:id="42"/>
+    <w:bookmarkStart w:id="73" w:name="main-figures"/>
+    <w:p>
+      <w:pPr>
+        <w:pStyle w:val="Heading1"/>
+      </w:pPr>
+      <w:r>
+        <w:t xml:space="preserve">Main figures</w:t>
+      </w:r>
+    </w:p>
+    <w:p>
+      <w:r>
+        <w:br w:type="page"/>
+      </w:r>
+    </w:p>
+    <w:p>
+      <w:pPr>
+        <w:pStyle w:val="FirstParagraph"/>
+      </w:pPr>
+      <w:r>
         <w:drawing>
           <wp:inline>
             <wp:extent cx="5334000" cy="3025253"/>
             <wp:effectExtent b="0" l="0" r="0" t="0"/>
-            <wp:docPr descr="" title="" id="41" name="Picture"/>
+            <wp:docPr descr="" title="" id="44" name="Picture"/>
             <a:graphic>
               <a:graphicData uri="http://schemas.openxmlformats.org/drawingml/2006/picture">
                 <pic:pic>
                   <pic:nvPicPr>
-                    <pic:cNvPr descr="figures/numbered/Fig01_overview.png" id="42" name="Picture"/>
+                    <pic:cNvPr descr="figures/numbered/Fig01_overview.png" id="45" name="Picture"/>
                     <pic:cNvPicPr>
                       <a:picLocks noChangeArrowheads="1" noChangeAspect="1"/>
                     </pic:cNvPicPr>
                   </pic:nvPicPr>
                   <pic:blipFill>
-                    <a:blip r:embed="rId40"/>
+                    <a:blip r:embed="rId43"/>
                     <a:stretch>
                       <a:fillRect/>
                     </a:stretch>
@@ -9456,18 +9612,18 @@
           <wp:inline>
             <wp:extent cx="5334000" cy="2470484"/>
             <wp:effectExtent b="0" l="0" r="0" t="0"/>
-            <wp:docPr descr="" title="" id="44" name="Picture"/>
+            <wp:docPr descr="" title="" id="47" name="Picture"/>
             <a:graphic>
               <a:graphicData uri="http://schemas.openxmlformats.org/drawingml/2006/picture">
                 <pic:pic>
                   <pic:nvPicPr>
-                    <pic:cNvPr descr="figures/numbered/Fig02_mash_2brad_vs_16s.png" id="45" name="Picture"/>
+                    <pic:cNvPr descr="figures/numbered/Fig02_mash_2brad_vs_16s.png" id="48" name="Picture"/>
                     <pic:cNvPicPr>
                       <a:picLocks noChangeArrowheads="1" noChangeAspect="1"/>
                     </pic:cNvPicPr>
                   </pic:nvPicPr>
                   <pic:blipFill>
-                    <a:blip r:embed="rId43"/>
+                    <a:blip r:embed="rId46"/>
                     <a:stretch>
                       <a:fillRect/>
                     </a:stretch>
@@ -9535,7 +9691,7 @@
         <w:t xml:space="preserve"> </w:t>
       </w:r>
       <w:r>
-        <w:t xml:space="preserve">Rank-rank matrices show that 2bRAD preserves genome-wide strain ordering whereas 16S collapses many unrelated pairs. # Part I — native BcgI 2bRAD-M performance</w:t>
+        <w:t xml:space="preserve">Rank-rank matrices show that 2bRAD preserves genome-wide strain ordering whereas 16S collapses many unrelated pairs.</w:t>
       </w:r>
     </w:p>
     <w:p>
@@ -9552,18 +9708,18 @@
           <wp:inline>
             <wp:extent cx="5334000" cy="2011308"/>
             <wp:effectExtent b="0" l="0" r="0" t="0"/>
-            <wp:docPr descr="" title="" id="47" name="Picture"/>
+            <wp:docPr descr="" title="" id="50" name="Picture"/>
             <a:graphic>
               <a:graphicData uri="http://schemas.openxmlformats.org/drawingml/2006/picture">
                 <pic:pic>
                   <pic:nvPicPr>
-                    <pic:cNvPr descr="figures/numbered/Fig03_enzyme_sweep.png" id="48" name="Picture"/>
+                    <pic:cNvPr descr="figures/numbered/Fig03_enzyme_sweep.png" id="51" name="Picture"/>
                     <pic:cNvPicPr>
                       <a:picLocks noChangeArrowheads="1" noChangeAspect="1"/>
                     </pic:cNvPicPr>
                   </pic:nvPicPr>
                   <pic:blipFill>
-                    <a:blip r:embed="rId46"/>
+                    <a:blip r:embed="rId49"/>
                     <a:stretch>
                       <a:fillRect/>
                     </a:stretch>
@@ -9622,18 +9778,18 @@
           <wp:inline>
             <wp:extent cx="5334000" cy="2962728"/>
             <wp:effectExtent b="0" l="0" r="0" t="0"/>
-            <wp:docPr descr="" title="" id="50" name="Picture"/>
+            <wp:docPr descr="" title="" id="53" name="Picture"/>
             <a:graphic>
               <a:graphicData uri="http://schemas.openxmlformats.org/drawingml/2006/picture">
                 <pic:pic>
                   <pic:nvPicPr>
-                    <pic:cNvPr descr="figures/numbered/Fig04_native_2brad_mocks.png" id="51" name="Picture"/>
+                    <pic:cNvPr descr="figures/numbered/Fig04_native_2brad_mocks.png" id="54" name="Picture"/>
                     <pic:cNvPicPr>
                       <a:picLocks noChangeArrowheads="1" noChangeAspect="1"/>
                     </pic:cNvPicPr>
                   </pic:nvPicPr>
                   <pic:blipFill>
-                    <a:blip r:embed="rId49"/>
+                    <a:blip r:embed="rId52"/>
                     <a:stretch>
                       <a:fillRect/>
                     </a:stretch>
@@ -9692,18 +9848,18 @@
           <wp:inline>
             <wp:extent cx="5334000" cy="3113081"/>
             <wp:effectExtent b="0" l="0" r="0" t="0"/>
-            <wp:docPr descr="" title="" id="53" name="Picture"/>
+            <wp:docPr descr="" title="" id="56" name="Picture"/>
             <a:graphic>
               <a:graphicData uri="http://schemas.openxmlformats.org/drawingml/2006/picture">
                 <pic:pic>
                   <pic:nvPicPr>
-                    <pic:cNvPr descr="figures/numbered/Fig05_saliva_fig07.png" id="54" name="Picture"/>
+                    <pic:cNvPr descr="figures/numbered/Fig05_saliva_fig07.png" id="57" name="Picture"/>
                     <pic:cNvPicPr>
                       <a:picLocks noChangeArrowheads="1" noChangeAspect="1"/>
                     </pic:cNvPicPr>
                   </pic:nvPicPr>
                   <pic:blipFill>
-                    <a:blip r:embed="rId52"/>
+                    <a:blip r:embed="rId55"/>
                     <a:stretch>
                       <a:fillRect/>
                     </a:stretch>
@@ -9762,18 +9918,18 @@
           <wp:inline>
             <wp:extent cx="5334000" cy="2253289"/>
             <wp:effectExtent b="0" l="0" r="0" t="0"/>
-            <wp:docPr descr="" title="" id="56" name="Picture"/>
+            <wp:docPr descr="" title="" id="59" name="Picture"/>
             <a:graphic>
               <a:graphicData uri="http://schemas.openxmlformats.org/drawingml/2006/picture">
                 <pic:pic>
                   <pic:nvPicPr>
-                    <pic:cNvPr descr="figures/numbered/Fig06_saliva_fig08.png" id="57" name="Picture"/>
+                    <pic:cNvPr descr="figures/numbered/Fig06_saliva_fig08.png" id="60" name="Picture"/>
                     <pic:cNvPicPr>
                       <a:picLocks noChangeArrowheads="1" noChangeAspect="1"/>
                     </pic:cNvPicPr>
                   </pic:nvPicPr>
                   <pic:blipFill>
-                    <a:blip r:embed="rId55"/>
+                    <a:blip r:embed="rId58"/>
                     <a:stretch>
                       <a:fillRect/>
                     </a:stretch>
@@ -9815,7 +9971,7 @@
         <w:t xml:space="preserve"> </w:t>
       </w:r>
       <w:r>
-        <w:t xml:space="preserve">Shotgun R1 prefix libraries from usable paired samples were digested in silico and compared with matched native BcgI libraries. All 65 shotgun strain-cluster calls were present in native calls; native 2bRAD-M yielded 128–163 additional candidate calls per sample. Additional calls had lower median relative abundance and require independent validation. # Part II — conventional shotgun metagenome performance</w:t>
+        <w:t xml:space="preserve">Shotgun R1 prefix libraries from usable paired samples were digested in silico and compared with matched native BcgI libraries. All 65 shotgun strain-cluster calls were present in native calls; native 2bRAD-M yielded 128–163 additional candidate calls per sample. Additional calls had lower median relative abundance and require independent validation.</w:t>
       </w:r>
     </w:p>
     <w:p>
@@ -9832,18 +9988,18 @@
           <wp:inline>
             <wp:extent cx="5334000" cy="1622136"/>
             <wp:effectExtent b="0" l="0" r="0" t="0"/>
-            <wp:docPr descr="" title="" id="59" name="Picture"/>
+            <wp:docPr descr="" title="" id="62" name="Picture"/>
             <a:graphic>
               <a:graphicData uri="http://schemas.openxmlformats.org/drawingml/2006/picture">
                 <pic:pic>
                   <pic:nvPicPr>
-                    <pic:cNvPr descr="figures/numbered/Fig07_sim2025_summary.png" id="60" name="Picture"/>
+                    <pic:cNvPr descr="figures/numbered/Fig07_sim2025_summary.png" id="63" name="Picture"/>
                     <pic:cNvPicPr>
                       <a:picLocks noChangeArrowheads="1" noChangeAspect="1"/>
                     </pic:cNvPicPr>
                   </pic:nvPicPr>
                   <pic:blipFill>
-                    <a:blip r:embed="rId58"/>
+                    <a:blip r:embed="rId61"/>
                     <a:stretch>
                       <a:fillRect/>
                     </a:stretch>
@@ -9902,18 +10058,18 @@
           <wp:inline>
             <wp:extent cx="5334000" cy="3236635"/>
             <wp:effectExtent b="0" l="0" r="0" t="0"/>
-            <wp:docPr descr="" title="" id="62" name="Picture"/>
+            <wp:docPr descr="" title="" id="65" name="Picture"/>
             <a:graphic>
               <a:graphicData uri="http://schemas.openxmlformats.org/drawingml/2006/picture">
                 <pic:pic>
                   <pic:nvPicPr>
-                    <pic:cNvPr descr="figures/numbered/Fig08_sim_headtohead.png" id="63" name="Picture"/>
+                    <pic:cNvPr descr="figures/numbered/Fig08_sim_headtohead.png" id="66" name="Picture"/>
                     <pic:cNvPicPr>
                       <a:picLocks noChangeArrowheads="1" noChangeAspect="1"/>
                     </pic:cNvPicPr>
                   </pic:nvPicPr>
                   <pic:blipFill>
-                    <a:blip r:embed="rId61"/>
+                    <a:blip r:embed="rId64"/>
                     <a:stretch>
                       <a:fillRect/>
                     </a:stretch>
@@ -9972,18 +10128,18 @@
           <wp:inline>
             <wp:extent cx="3895343" cy="7125387"/>
             <wp:effectExtent b="0" l="0" r="0" t="0"/>
-            <wp:docPr descr="" title="" id="65" name="Picture"/>
+            <wp:docPr descr="" title="" id="68" name="Picture"/>
             <a:graphic>
               <a:graphicData uri="http://schemas.openxmlformats.org/drawingml/2006/picture">
                 <pic:pic>
                   <pic:nvPicPr>
-                    <pic:cNvPr descr="figures/numbered/Fig09_performance+scalability+community_throughput.png" id="66" name="Picture"/>
+                    <pic:cNvPr descr="figures/numbered/Fig09_performance+scalability+community_throughput.png" id="69" name="Picture"/>
                     <pic:cNvPicPr>
                       <a:picLocks noChangeArrowheads="1" noChangeAspect="1"/>
                     </pic:cNvPicPr>
                   </pic:nvPicPr>
                   <pic:blipFill>
-                    <a:blip r:embed="rId64"/>
+                    <a:blip r:embed="rId67"/>
                     <a:stretch>
                       <a:fillRect/>
                     </a:stretch>
@@ -10058,18 +10214,18 @@
           <wp:inline>
             <wp:extent cx="5334000" cy="5357585"/>
             <wp:effectExtent b="0" l="0" r="0" t="0"/>
-            <wp:docPr descr="" title="" id="68" name="Picture"/>
+            <wp:docPr descr="" title="" id="71" name="Picture"/>
             <a:graphic>
               <a:graphicData uri="http://schemas.openxmlformats.org/drawingml/2006/picture">
                 <pic:pic>
                   <pic:nvPicPr>
-                    <pic:cNvPr descr="figures/numbered/Fig10_wms_toolcompare.png" id="69" name="Picture"/>
+                    <pic:cNvPr descr="figures/numbered/Fig10_wms_toolcompare.png" id="72" name="Picture"/>
                     <pic:cNvPicPr>
                       <a:picLocks noChangeArrowheads="1" noChangeAspect="1"/>
                     </pic:cNvPicPr>
                   </pic:nvPicPr>
                   <pic:blipFill>
-                    <a:blip r:embed="rId67"/>
+                    <a:blip r:embed="rId70"/>
                     <a:stretch>
                       <a:fillRect/>
                     </a:stretch>
@@ -10114,8 +10270,8 @@
         <w:t xml:space="preserve">Four ATCC shotgun mocks were profiled with Strain2bScan, StrainScan and inStrain, each in its own 0.95 cluster space. In MSA-1002 at 99% host, Strain2bScan retained F1 1.0 and Bray–Curtis dissimilarity 0.302, whereas StrainScan and inStrain had F1 0.095 and 0.333. Clean-mock thresholded precision varied with input composition. ## Supplementary figures</w:t>
       </w:r>
     </w:p>
-    <w:bookmarkEnd w:id="70"/>
-    <w:bookmarkStart w:id="91" w:name="supplementary-figures"/>
+    <w:bookmarkEnd w:id="73"/>
+    <w:bookmarkStart w:id="94" w:name="supplementary-figures"/>
     <w:p>
       <w:pPr>
         <w:pStyle w:val="Heading1"/>
@@ -10138,18 +10294,18 @@
           <wp:inline>
             <wp:extent cx="5334000" cy="3407833"/>
             <wp:effectExtent b="0" l="0" r="0" t="0"/>
-            <wp:docPr descr="" title="" id="72" name="Picture"/>
+            <wp:docPr descr="" title="" id="75" name="Picture"/>
             <a:graphic>
               <a:graphicData uri="http://schemas.openxmlformats.org/drawingml/2006/picture">
                 <pic:pic>
                   <pic:nvPicPr>
-                    <pic:cNvPr descr="figures/numbered/FigS1_mock_msa1002_titration.png" id="73" name="Picture"/>
+                    <pic:cNvPr descr="figures/numbered/FigS1_mock_msa1002_titration.png" id="76" name="Picture"/>
                     <pic:cNvPicPr>
                       <a:picLocks noChangeArrowheads="1" noChangeAspect="1"/>
                     </pic:cNvPicPr>
                   </pic:nvPicPr>
                   <pic:blipFill>
-                    <a:blip r:embed="rId71"/>
+                    <a:blip r:embed="rId74"/>
                     <a:stretch>
                       <a:fillRect/>
                     </a:stretch>
@@ -10208,18 +10364,18 @@
           <wp:inline>
             <wp:extent cx="5334000" cy="2133600"/>
             <wp:effectExtent b="0" l="0" r="0" t="0"/>
-            <wp:docPr descr="" title="" id="75" name="Picture"/>
+            <wp:docPr descr="" title="" id="78" name="Picture"/>
             <a:graphic>
               <a:graphicData uri="http://schemas.openxmlformats.org/drawingml/2006/picture">
                 <pic:pic>
                   <pic:nvPicPr>
-                    <pic:cNvPr descr="figures/numbered/FigS2_gate_calibration.png" id="76" name="Picture"/>
+                    <pic:cNvPr descr="figures/numbered/FigS2_gate_calibration.png" id="79" name="Picture"/>
                     <pic:cNvPicPr>
                       <a:picLocks noChangeArrowheads="1" noChangeAspect="1"/>
                     </pic:cNvPicPr>
                   </pic:nvPicPr>
                   <pic:blipFill>
-                    <a:blip r:embed="rId74"/>
+                    <a:blip r:embed="rId77"/>
                     <a:stretch>
                       <a:fillRect/>
                     </a:stretch>
@@ -10278,18 +10434,18 @@
           <wp:inline>
             <wp:extent cx="5334000" cy="2233385"/>
             <wp:effectExtent b="0" l="0" r="0" t="0"/>
-            <wp:docPr descr="" title="" id="78" name="Picture"/>
+            <wp:docPr descr="" title="" id="81" name="Picture"/>
             <a:graphic>
               <a:graphicData uri="http://schemas.openxmlformats.org/drawingml/2006/picture">
                 <pic:pic>
                   <pic:nvPicPr>
-                    <pic:cNvPr descr="figures/numbered/FigS3_tree_expansion.png" id="79" name="Picture"/>
+                    <pic:cNvPr descr="figures/numbered/FigS3_tree_expansion.png" id="82" name="Picture"/>
                     <pic:cNvPicPr>
                       <a:picLocks noChangeArrowheads="1" noChangeAspect="1"/>
                     </pic:cNvPicPr>
                   </pic:nvPicPr>
                   <pic:blipFill>
-                    <a:blip r:embed="rId77"/>
+                    <a:blip r:embed="rId80"/>
                     <a:stretch>
                       <a:fillRect/>
                     </a:stretch>
@@ -10348,18 +10504,18 @@
           <wp:inline>
             <wp:extent cx="5334000" cy="3259666"/>
             <wp:effectExtent b="0" l="0" r="0" t="0"/>
-            <wp:docPr descr="" title="" id="81" name="Picture"/>
+            <wp:docPr descr="" title="" id="84" name="Picture"/>
             <a:graphic>
               <a:graphicData uri="http://schemas.openxmlformats.org/drawingml/2006/picture">
                 <pic:pic>
                   <pic:nvPicPr>
-                    <pic:cNvPr descr="figures/numbered/FigS4_instrain_derep.png" id="82" name="Picture"/>
+                    <pic:cNvPr descr="figures/numbered/FigS4_instrain_derep.png" id="85" name="Picture"/>
                     <pic:cNvPicPr>
                       <a:picLocks noChangeArrowheads="1" noChangeAspect="1"/>
                     </pic:cNvPicPr>
                   </pic:nvPicPr>
                   <pic:blipFill>
-                    <a:blip r:embed="rId80"/>
+                    <a:blip r:embed="rId83"/>
                     <a:stretch>
                       <a:fillRect/>
                     </a:stretch>
@@ -10418,18 +10574,18 @@
           <wp:inline>
             <wp:extent cx="5334000" cy="1715097"/>
             <wp:effectExtent b="0" l="0" r="0" t="0"/>
-            <wp:docPr descr="" title="" id="84" name="Picture"/>
+            <wp:docPr descr="" title="" id="87" name="Picture"/>
             <a:graphic>
               <a:graphicData uri="http://schemas.openxmlformats.org/drawingml/2006/picture">
                 <pic:pic>
                   <pic:nvPicPr>
-                    <pic:cNvPr descr="figures/numbered/FigS5_species_expansion_strainscan.png" id="85" name="Picture"/>
+                    <pic:cNvPr descr="figures/numbered/FigS5_species_expansion_strainscan.png" id="88" name="Picture"/>
                     <pic:cNvPicPr>
                       <a:picLocks noChangeArrowheads="1" noChangeAspect="1"/>
                     </pic:cNvPicPr>
                   </pic:nvPicPr>
                   <pic:blipFill>
-                    <a:blip r:embed="rId83"/>
+                    <a:blip r:embed="rId86"/>
                     <a:stretch>
                       <a:fillRect/>
                     </a:stretch>
@@ -10533,18 +10689,18 @@
           <wp:inline>
             <wp:extent cx="5334000" cy="4366768"/>
             <wp:effectExtent b="0" l="0" r="0" t="0"/>
-            <wp:docPr descr="" title="" id="87" name="Picture"/>
+            <wp:docPr descr="" title="" id="90" name="Picture"/>
             <a:graphic>
               <a:graphicData uri="http://schemas.openxmlformats.org/drawingml/2006/picture">
                 <pic:pic>
                   <pic:nvPicPr>
-                    <pic:cNvPr descr="figures/numbered/FigS6_reference_quality_containment.png" id="88" name="Picture"/>
+                    <pic:cNvPr descr="figures/numbered/FigS6_reference_quality_containment.png" id="91" name="Picture"/>
                     <pic:cNvPicPr>
                       <a:picLocks noChangeArrowheads="1" noChangeAspect="1"/>
                     </pic:cNvPicPr>
                   </pic:nvPicPr>
                   <pic:blipFill>
-                    <a:blip r:embed="rId86"/>
+                    <a:blip r:embed="rId89"/>
                     <a:stretch>
                       <a:fillRect/>
                     </a:stretch>
@@ -10605,7 +10761,7 @@
         <w:t xml:space="preserve">fragmentation. This is an algorithmic optimization analysis and is therefore supplementary to the primary performance benchmarks.</w:t>
       </w:r>
     </w:p>
-    <w:bookmarkStart w:id="89" w:name="tables"/>
+    <w:bookmarkStart w:id="92" w:name="tables"/>
     <w:p>
       <w:pPr>
         <w:pStyle w:val="Heading2"/>
@@ -19721,7 +19877,7 @@
                 <w:b w:val="0"/>
                 <w:sz w:val="16"/>
               </w:rPr>
-              <w:t xml:space="preserve">Direct reference-guided comparator on shotgun reads (Fig 10–11, Supplementary Fig S5; Tables 1–3).</w:t>
+              <w:t xml:space="preserve">Direct reference-guided comparator on shotgun reads (Fig 8, Fig 10, Supplementary Fig S5; Tables 1–3).</w:t>
             </w:r>
           </w:p>
         </w:tc>
@@ -19742,7 +19898,7 @@
                 <w:b w:val="0"/>
                 <w:sz w:val="16"/>
               </w:rPr>
-              <w:t xml:space="preserve">inStrain v1.9.1</w:t>
+              <w:t xml:space="preserve">inStrain v1.9.1 (mocks) and v1.11.0 (simulations)</w:t>
             </w:r>
           </w:p>
         </w:tc>
@@ -19775,39 +19931,61 @@
                 <w:b w:val="0"/>
                 <w:sz w:val="16"/>
               </w:rPr>
-              <w:t xml:space="preserve">Shotgun reads aligned to a dereplicated reference</w:t>
-            </w:r>
-          </w:p>
-        </w:tc>
-        <w:tc>
-          <w:tcPr/>
-          <w:p>
-            <w:pPr>
-              <w:pStyle w:val="Compact"/>
-              <w:spacing w:before="0" w:after="0" w:line="240" w:lineRule="auto"/>
-            </w:pPr>
-            <w:r>
-              <w:rPr>
-                <w:b w:val="0"/>
-                <w:sz w:val="16"/>
-              </w:rPr>
-              <w:t xml:space="preserve">Strain and SNV</w:t>
-            </w:r>
-          </w:p>
-        </w:tc>
-        <w:tc>
-          <w:tcPr/>
-          <w:p>
-            <w:pPr>
-              <w:pStyle w:val="Compact"/>
-              <w:spacing w:before="0" w:after="0" w:line="240" w:lineRule="auto"/>
-            </w:pPr>
-            <w:r>
-              <w:rPr>
-                <w:b w:val="0"/>
-                <w:sz w:val="16"/>
-              </w:rPr>
-              <w:t xml:space="preserve">Direct read-level shotgun comparator (Fig 11 and Fig S4).</w:t>
+              <w:t xml:space="preserve">Shotgun reads aligned to dereplicated mock references or full species simulation pools</w:t>
+            </w:r>
+          </w:p>
+        </w:tc>
+        <w:tc>
+          <w:tcPr/>
+          <w:p>
+            <w:pPr>
+              <w:pStyle w:val="Compact"/>
+              <w:spacing w:before="0" w:after="0" w:line="240" w:lineRule="auto"/>
+            </w:pPr>
+            <w:r>
+              <w:rPr>
+                <w:b w:val="0"/>
+                <w:sz w:val="16"/>
+              </w:rPr>
+              <w:t xml:space="preserve">Strain, SNV and genome coverage</w:t>
+            </w:r>
+          </w:p>
+        </w:tc>
+        <w:tc>
+          <w:tcPr/>
+          <w:p>
+            <w:pPr>
+              <w:pStyle w:val="Compact"/>
+              <w:spacing w:before="0" w:after="0" w:line="240" w:lineRule="auto"/>
+            </w:pPr>
+            <w:r>
+              <w:rPr>
+                <w:b w:val="0"/>
+                <w:sz w:val="16"/>
+              </w:rPr>
+              <w:t xml:space="preserve">Direct read-level shotgun comparator (Fig 8, Fig 10, Fig S4; simulation outputs in</w:t>
+            </w:r>
+            <w:r>
+              <w:rPr>
+                <w:b w:val="0"/>
+                <w:sz w:val="16"/>
+              </w:rPr>
+              <w:t xml:space="preserve"> </w:t>
+            </w:r>
+            <w:r>
+              <w:rPr>
+                <w:rStyle w:val="VerbatimChar"/>
+                <w:b w:val="0"/>
+                <w:sz w:val="16"/>
+              </w:rPr>
+              <w:t xml:space="preserve">results/instrain_sim225/</w:t>
+            </w:r>
+            <w:r>
+              <w:rPr>
+                <w:b w:val="0"/>
+                <w:sz w:val="16"/>
+              </w:rPr>
+              <w:t xml:space="preserve">).</w:t>
             </w:r>
           </w:p>
         </w:tc>
@@ -20198,7 +20376,7 @@
         <w:t xml:space="preserve"> </w:t>
       </w:r>
       <w:r>
-        <w:t xml:space="preserve">Figure 11; MSA-1002 is the 99%-host sample. Accuracy is in StrainGE’s 0.90-reference space; mock calls</w:t>
+        <w:t xml:space="preserve">Figure 10; MSA-1002 is the 99%-host sample. Accuracy is in StrainGE’s 0.90-reference space; mock calls</w:t>
       </w:r>
       <w:r>
         <w:t xml:space="preserve"> </w:t>
@@ -25546,8 +25724,8 @@
         </w:tc>
       </w:tr>
     </w:tbl>
-    <w:bookmarkEnd w:id="89"/>
-    <w:bookmarkStart w:id="90" w:name="references"/>
+    <w:bookmarkEnd w:id="92"/>
+    <w:bookmarkStart w:id="93" w:name="references"/>
     <w:p>
       <w:pPr>
         <w:pStyle w:val="Heading2"/>
@@ -27024,8 +27202,8 @@
         <w:t xml:space="preserve">doi:10.1089/cmb.2012.0021.</w:t>
       </w:r>
     </w:p>
-    <w:bookmarkEnd w:id="90"/>
-    <w:bookmarkEnd w:id="91"/>
+    <w:bookmarkEnd w:id="93"/>
+    <w:bookmarkEnd w:id="94"/>
     <w:sectPr>
       <w:footnotePr>
         <w:numRestart w:val="eachSect"/>

</xml_diff>